<commit_message>
feat: upload complete CS-2203 Computer Networks lab portfolio
</commit_message>
<xml_diff>
--- a/Lab2_2024-SE_31.docx
+++ b/Lab2_2024-SE_31.docx
@@ -6,7 +6,7 @@
       <w:pPr>
         <w:jc w:val="center"/>
         <w:rPr>
-          <w:rFonts w:cstheme="minorHAnsi"/>
+          <w:rFonts w:ascii="Arial" w:hAnsi="Arial" w:cs="Arial"/>
           <w:b/>
           <w:bCs/>
           <w:color w:val="2F5496" w:themeColor="accent1" w:themeShade="BF"/>
@@ -18,7 +18,7 @@
       <w:bookmarkEnd w:id="0"/>
       <w:r>
         <w:rPr>
-          <w:rFonts w:cstheme="minorHAnsi"/>
+          <w:rFonts w:ascii="Arial" w:hAnsi="Arial" w:cs="Arial"/>
           <w:b/>
           <w:bCs/>
           <w:color w:val="2F5496" w:themeColor="accent1" w:themeShade="BF"/>
@@ -31,12 +31,12 @@
     <w:p>
       <w:pPr>
         <w:rPr>
-          <w:rFonts w:cstheme="minorHAnsi"/>
+          <w:rFonts w:ascii="Arial" w:hAnsi="Arial" w:cs="Arial"/>
         </w:rPr>
       </w:pPr>
       <w:r>
         <w:rPr>
-          <w:rFonts w:cstheme="minorHAnsi"/>
+          <w:rFonts w:ascii="Arial" w:hAnsi="Arial" w:cs="Arial"/>
           <w:b/>
           <w:bCs/>
           <w:noProof/>
@@ -103,35 +103,35 @@
     <w:p>
       <w:pPr>
         <w:rPr>
-          <w:rFonts w:cstheme="minorHAnsi"/>
+          <w:rFonts w:ascii="Arial" w:hAnsi="Arial" w:cs="Arial"/>
         </w:rPr>
       </w:pPr>
     </w:p>
     <w:p>
       <w:pPr>
         <w:rPr>
-          <w:rFonts w:cstheme="minorHAnsi"/>
+          <w:rFonts w:ascii="Arial" w:hAnsi="Arial" w:cs="Arial"/>
         </w:rPr>
       </w:pPr>
     </w:p>
     <w:p>
       <w:pPr>
         <w:rPr>
-          <w:rFonts w:cstheme="minorHAnsi"/>
+          <w:rFonts w:ascii="Arial" w:hAnsi="Arial" w:cs="Arial"/>
         </w:rPr>
       </w:pPr>
     </w:p>
     <w:p>
       <w:pPr>
         <w:rPr>
-          <w:rFonts w:cstheme="minorHAnsi"/>
+          <w:rFonts w:ascii="Arial" w:hAnsi="Arial" w:cs="Arial"/>
         </w:rPr>
       </w:pPr>
     </w:p>
     <w:p>
       <w:pPr>
         <w:rPr>
-          <w:rFonts w:cstheme="minorHAnsi"/>
+          <w:rFonts w:ascii="Arial" w:hAnsi="Arial" w:cs="Arial"/>
         </w:rPr>
       </w:pPr>
     </w:p>
@@ -170,7 +170,7 @@
             <w:pPr>
               <w:jc w:val="center"/>
               <w:rPr>
-                <w:rFonts w:cstheme="minorHAnsi"/>
+                <w:rFonts w:ascii="Arial" w:hAnsi="Arial" w:cs="Arial"/>
                 <w:b/>
                 <w:bCs/>
                 <w:sz w:val="24"/>
@@ -179,7 +179,7 @@
             </w:pPr>
             <w:r>
               <w:rPr>
-                <w:rFonts w:cstheme="minorHAnsi"/>
+                <w:rFonts w:ascii="Arial" w:hAnsi="Arial" w:cs="Arial"/>
                 <w:b/>
                 <w:bCs/>
                 <w:sz w:val="24"/>
@@ -199,7 +199,7 @@
             <w:pPr>
               <w:jc w:val="center"/>
               <w:rPr>
-                <w:rFonts w:cstheme="minorHAnsi"/>
+                <w:rFonts w:ascii="Arial" w:hAnsi="Arial" w:cs="Arial"/>
                 <w:b/>
                 <w:bCs/>
                 <w:sz w:val="24"/>
@@ -208,7 +208,7 @@
             </w:pPr>
             <w:r>
               <w:rPr>
-                <w:rFonts w:cstheme="minorHAnsi"/>
+                <w:rFonts w:ascii="Arial" w:hAnsi="Arial" w:cs="Arial"/>
                 <w:b/>
                 <w:bCs/>
                 <w:sz w:val="24"/>
@@ -234,7 +234,7 @@
             <w:pPr>
               <w:jc w:val="center"/>
               <w:rPr>
-                <w:rFonts w:cstheme="minorHAnsi"/>
+                <w:rFonts w:ascii="Arial" w:hAnsi="Arial" w:cs="Arial"/>
                 <w:b/>
                 <w:bCs/>
                 <w:sz w:val="24"/>
@@ -243,7 +243,7 @@
             </w:pPr>
             <w:r>
               <w:rPr>
-                <w:rFonts w:cstheme="minorHAnsi"/>
+                <w:rFonts w:ascii="Arial" w:hAnsi="Arial" w:cs="Arial"/>
                 <w:b/>
                 <w:bCs/>
                 <w:sz w:val="24"/>
@@ -263,7 +263,7 @@
             <w:pPr>
               <w:jc w:val="center"/>
               <w:rPr>
-                <w:rFonts w:cstheme="minorHAnsi"/>
+                <w:rFonts w:ascii="Arial" w:hAnsi="Arial" w:cs="Arial"/>
                 <w:b/>
                 <w:bCs/>
                 <w:sz w:val="24"/>
@@ -272,7 +272,7 @@
             </w:pPr>
             <w:r>
               <w:rPr>
-                <w:rFonts w:cstheme="minorHAnsi"/>
+                <w:rFonts w:ascii="Arial" w:hAnsi="Arial" w:cs="Arial"/>
                 <w:b/>
                 <w:bCs/>
                 <w:sz w:val="24"/>
@@ -282,7 +282,7 @@
             </w:r>
             <w:r>
               <w:rPr>
-                <w:rFonts w:cstheme="minorHAnsi"/>
+                <w:rFonts w:ascii="Arial" w:hAnsi="Arial" w:cs="Arial"/>
                 <w:b/>
                 <w:bCs/>
                 <w:sz w:val="24"/>
@@ -292,7 +292,7 @@
             </w:r>
             <w:r>
               <w:rPr>
-                <w:rFonts w:cstheme="minorHAnsi"/>
+                <w:rFonts w:ascii="Arial" w:hAnsi="Arial" w:cs="Arial"/>
                 <w:b/>
                 <w:bCs/>
                 <w:sz w:val="24"/>
@@ -302,7 +302,7 @@
             </w:r>
             <w:r>
               <w:rPr>
-                <w:rFonts w:cstheme="minorHAnsi"/>
+                <w:rFonts w:ascii="Arial" w:hAnsi="Arial" w:cs="Arial"/>
                 <w:b/>
                 <w:bCs/>
                 <w:sz w:val="24"/>
@@ -312,7 +312,7 @@
             </w:r>
             <w:r>
               <w:rPr>
-                <w:rFonts w:cstheme="minorHAnsi"/>
+                <w:rFonts w:ascii="Arial" w:hAnsi="Arial" w:cs="Arial"/>
                 <w:b/>
                 <w:bCs/>
                 <w:sz w:val="24"/>
@@ -322,7 +322,7 @@
             </w:r>
             <w:r>
               <w:rPr>
-                <w:rFonts w:cstheme="minorHAnsi"/>
+                <w:rFonts w:ascii="Arial" w:hAnsi="Arial" w:cs="Arial"/>
                 <w:b/>
                 <w:bCs/>
                 <w:sz w:val="24"/>
@@ -348,7 +348,7 @@
             <w:pPr>
               <w:jc w:val="center"/>
               <w:rPr>
-                <w:rFonts w:cstheme="minorHAnsi"/>
+                <w:rFonts w:ascii="Arial" w:hAnsi="Arial" w:cs="Arial"/>
                 <w:b/>
                 <w:bCs/>
                 <w:sz w:val="24"/>
@@ -357,7 +357,7 @@
             </w:pPr>
             <w:r>
               <w:rPr>
-                <w:rFonts w:cstheme="minorHAnsi"/>
+                <w:rFonts w:ascii="Arial" w:hAnsi="Arial" w:cs="Arial"/>
                 <w:b/>
                 <w:bCs/>
                 <w:sz w:val="24"/>
@@ -377,7 +377,7 @@
             <w:pPr>
               <w:jc w:val="center"/>
               <w:rPr>
-                <w:rFonts w:cstheme="minorHAnsi"/>
+                <w:rFonts w:ascii="Arial" w:hAnsi="Arial" w:cs="Arial"/>
                 <w:b/>
                 <w:bCs/>
                 <w:sz w:val="24"/>
@@ -386,7 +386,7 @@
             </w:pPr>
             <w:r>
               <w:rPr>
-                <w:rFonts w:cstheme="minorHAnsi"/>
+                <w:rFonts w:ascii="Arial" w:hAnsi="Arial" w:cs="Arial"/>
                 <w:b/>
                 <w:bCs/>
                 <w:sz w:val="24"/>
@@ -396,7 +396,7 @@
             </w:r>
             <w:r>
               <w:rPr>
-                <w:rFonts w:cstheme="minorHAnsi"/>
+                <w:rFonts w:ascii="Arial" w:hAnsi="Arial" w:cs="Arial"/>
                 <w:b/>
                 <w:bCs/>
                 <w:sz w:val="24"/>
@@ -422,7 +422,7 @@
             <w:pPr>
               <w:jc w:val="center"/>
               <w:rPr>
-                <w:rFonts w:cstheme="minorHAnsi"/>
+                <w:rFonts w:ascii="Arial" w:hAnsi="Arial" w:cs="Arial"/>
                 <w:b/>
                 <w:bCs/>
                 <w:sz w:val="24"/>
@@ -431,7 +431,7 @@
             </w:pPr>
             <w:r>
               <w:rPr>
-                <w:rFonts w:cstheme="minorHAnsi"/>
+                <w:rFonts w:ascii="Arial" w:hAnsi="Arial" w:cs="Arial"/>
                 <w:b/>
                 <w:bCs/>
                 <w:sz w:val="24"/>
@@ -451,7 +451,7 @@
             <w:pPr>
               <w:jc w:val="center"/>
               <w:rPr>
-                <w:rFonts w:cstheme="minorHAnsi"/>
+                <w:rFonts w:ascii="Arial" w:hAnsi="Arial" w:cs="Arial"/>
                 <w:b/>
                 <w:bCs/>
                 <w:sz w:val="24"/>
@@ -460,7 +460,7 @@
             </w:pPr>
             <w:r>
               <w:rPr>
-                <w:rFonts w:cstheme="minorHAnsi"/>
+                <w:rFonts w:ascii="Arial" w:hAnsi="Arial" w:cs="Arial"/>
                 <w:b/>
                 <w:bCs/>
                 <w:sz w:val="24"/>
@@ -486,7 +486,7 @@
             <w:pPr>
               <w:jc w:val="center"/>
               <w:rPr>
-                <w:rFonts w:cstheme="minorHAnsi"/>
+                <w:rFonts w:ascii="Arial" w:hAnsi="Arial" w:cs="Arial"/>
                 <w:b/>
                 <w:bCs/>
                 <w:sz w:val="24"/>
@@ -495,7 +495,7 @@
             </w:pPr>
             <w:r>
               <w:rPr>
-                <w:rFonts w:cstheme="minorHAnsi"/>
+                <w:rFonts w:ascii="Arial" w:hAnsi="Arial" w:cs="Arial"/>
                 <w:b/>
                 <w:bCs/>
                 <w:sz w:val="24"/>
@@ -515,7 +515,7 @@
             <w:pPr>
               <w:jc w:val="center"/>
               <w:rPr>
-                <w:rFonts w:cstheme="minorHAnsi"/>
+                <w:rFonts w:ascii="Arial" w:hAnsi="Arial" w:cs="Arial"/>
                 <w:b/>
                 <w:bCs/>
                 <w:sz w:val="24"/>
@@ -524,7 +524,7 @@
             </w:pPr>
             <w:r>
               <w:rPr>
-                <w:rFonts w:cstheme="minorHAnsi"/>
+                <w:rFonts w:ascii="Arial" w:hAnsi="Arial" w:cs="Arial"/>
                 <w:b/>
                 <w:bCs/>
                 <w:sz w:val="24"/>
@@ -550,7 +550,7 @@
             <w:pPr>
               <w:jc w:val="center"/>
               <w:rPr>
-                <w:rFonts w:cstheme="minorHAnsi"/>
+                <w:rFonts w:ascii="Arial" w:hAnsi="Arial" w:cs="Arial"/>
                 <w:b/>
                 <w:bCs/>
                 <w:sz w:val="24"/>
@@ -559,7 +559,7 @@
             </w:pPr>
             <w:r>
               <w:rPr>
-                <w:rFonts w:cstheme="minorHAnsi"/>
+                <w:rFonts w:ascii="Arial" w:hAnsi="Arial" w:cs="Arial"/>
                 <w:b/>
                 <w:bCs/>
                 <w:sz w:val="24"/>
@@ -579,7 +579,7 @@
             <w:pPr>
               <w:jc w:val="center"/>
               <w:rPr>
-                <w:rFonts w:cstheme="minorHAnsi"/>
+                <w:rFonts w:ascii="Arial" w:hAnsi="Arial" w:cs="Arial"/>
                 <w:b/>
                 <w:bCs/>
                 <w:sz w:val="24"/>
@@ -588,7 +588,7 @@
             </w:pPr>
             <w:r>
               <w:rPr>
-                <w:rFonts w:cstheme="minorHAnsi"/>
+                <w:rFonts w:ascii="Arial" w:hAnsi="Arial" w:cs="Arial"/>
                 <w:b/>
                 <w:bCs/>
                 <w:sz w:val="24"/>
@@ -598,7 +598,7 @@
             </w:r>
             <w:r>
               <w:rPr>
-                <w:rFonts w:cstheme="minorHAnsi"/>
+                <w:rFonts w:ascii="Arial" w:hAnsi="Arial" w:cs="Arial"/>
                 <w:b/>
                 <w:bCs/>
                 <w:sz w:val="24"/>
@@ -608,7 +608,7 @@
             </w:r>
             <w:r>
               <w:rPr>
-                <w:rFonts w:cstheme="minorHAnsi"/>
+                <w:rFonts w:ascii="Arial" w:hAnsi="Arial" w:cs="Arial"/>
                 <w:b/>
                 <w:bCs/>
                 <w:sz w:val="24"/>
@@ -618,7 +618,7 @@
             </w:r>
             <w:r>
               <w:rPr>
-                <w:rFonts w:cstheme="minorHAnsi"/>
+                <w:rFonts w:ascii="Arial" w:hAnsi="Arial" w:cs="Arial"/>
                 <w:b/>
                 <w:bCs/>
                 <w:sz w:val="24"/>
@@ -628,7 +628,7 @@
             </w:r>
             <w:r>
               <w:rPr>
-                <w:rFonts w:cstheme="minorHAnsi"/>
+                <w:rFonts w:ascii="Arial" w:hAnsi="Arial" w:cs="Arial"/>
                 <w:b/>
                 <w:bCs/>
                 <w:sz w:val="24"/>
@@ -654,7 +654,7 @@
             <w:pPr>
               <w:jc w:val="center"/>
               <w:rPr>
-                <w:rFonts w:cstheme="minorHAnsi"/>
+                <w:rFonts w:ascii="Arial" w:hAnsi="Arial" w:cs="Arial"/>
                 <w:b/>
                 <w:bCs/>
                 <w:sz w:val="24"/>
@@ -663,7 +663,7 @@
             </w:pPr>
             <w:r>
               <w:rPr>
-                <w:rFonts w:cstheme="minorHAnsi"/>
+                <w:rFonts w:ascii="Arial" w:hAnsi="Arial" w:cs="Arial"/>
                 <w:b/>
                 <w:bCs/>
                 <w:sz w:val="24"/>
@@ -683,7 +683,7 @@
             <w:pPr>
               <w:jc w:val="center"/>
               <w:rPr>
-                <w:rFonts w:cstheme="minorHAnsi"/>
+                <w:rFonts w:ascii="Arial" w:hAnsi="Arial" w:cs="Arial"/>
                 <w:b/>
                 <w:bCs/>
                 <w:sz w:val="24"/>
@@ -692,7 +692,7 @@
             </w:pPr>
             <w:r>
               <w:rPr>
-                <w:rFonts w:cstheme="minorHAnsi"/>
+                <w:rFonts w:ascii="Arial" w:hAnsi="Arial" w:cs="Arial"/>
                 <w:b/>
                 <w:bCs/>
                 <w:sz w:val="24"/>
@@ -702,7 +702,7 @@
             </w:r>
             <w:r>
               <w:rPr>
-                <w:rFonts w:cstheme="minorHAnsi"/>
+                <w:rFonts w:ascii="Arial" w:hAnsi="Arial" w:cs="Arial"/>
                 <w:b/>
                 <w:bCs/>
                 <w:sz w:val="24"/>
@@ -712,27 +712,17 @@
             </w:r>
             <w:r>
               <w:rPr>
-                <w:rFonts w:cstheme="minorHAnsi"/>
+                <w:rFonts w:ascii="Arial" w:hAnsi="Arial" w:cs="Arial"/>
                 <w:b/>
                 <w:bCs/>
                 <w:sz w:val="24"/>
                 <w:szCs w:val="24"/>
               </w:rPr>
-              <w:t>0</w:t>
+              <w:t>5</w:t>
             </w:r>
             <w:r>
               <w:rPr>
-                <w:rFonts w:cstheme="minorHAnsi"/>
-                <w:b/>
-                <w:bCs/>
-                <w:sz w:val="24"/>
-                <w:szCs w:val="24"/>
-              </w:rPr>
-              <w:t>7</w:t>
-            </w:r>
-            <w:r>
-              <w:rPr>
-                <w:rFonts w:cstheme="minorHAnsi"/>
+                <w:rFonts w:ascii="Arial" w:hAnsi="Arial" w:cs="Arial"/>
                 <w:b/>
                 <w:bCs/>
                 <w:sz w:val="24"/>
@@ -742,7 +732,7 @@
             </w:r>
             <w:r>
               <w:rPr>
-                <w:rFonts w:cstheme="minorHAnsi"/>
+                <w:rFonts w:ascii="Arial" w:hAnsi="Arial" w:cs="Arial"/>
                 <w:b/>
                 <w:bCs/>
                 <w:sz w:val="24"/>
@@ -752,7 +742,7 @@
             </w:r>
             <w:r>
               <w:rPr>
-                <w:rFonts w:cstheme="minorHAnsi"/>
+                <w:rFonts w:ascii="Arial" w:hAnsi="Arial" w:cs="Arial"/>
                 <w:b/>
                 <w:bCs/>
                 <w:sz w:val="24"/>
@@ -767,7 +757,7 @@
     <w:p>
       <w:pPr>
         <w:rPr>
-          <w:rFonts w:cstheme="minorHAnsi"/>
+          <w:rFonts w:ascii="Arial" w:hAnsi="Arial" w:cs="Arial"/>
         </w:rPr>
       </w:pPr>
     </w:p>
@@ -775,7 +765,7 @@
       <w:pPr>
         <w:jc w:val="center"/>
         <w:rPr>
-          <w:rFonts w:cstheme="minorHAnsi"/>
+          <w:rFonts w:ascii="Arial" w:hAnsi="Arial" w:cs="Arial"/>
           <w:b/>
           <w:bCs/>
           <w:sz w:val="32"/>
@@ -787,7 +777,7 @@
       <w:pPr>
         <w:jc w:val="center"/>
         <w:rPr>
-          <w:rFonts w:cstheme="minorHAnsi"/>
+          <w:rFonts w:ascii="Arial" w:hAnsi="Arial" w:cs="Arial"/>
           <w:b/>
           <w:bCs/>
           <w:sz w:val="32"/>
@@ -799,7 +789,7 @@
       <w:pPr>
         <w:jc w:val="center"/>
         <w:rPr>
-          <w:rFonts w:cstheme="minorHAnsi"/>
+          <w:rFonts w:ascii="Arial" w:hAnsi="Arial" w:cs="Arial"/>
           <w:b/>
           <w:bCs/>
           <w:sz w:val="32"/>
@@ -811,7 +801,7 @@
       <w:pPr>
         <w:jc w:val="center"/>
         <w:rPr>
-          <w:rFonts w:cstheme="minorHAnsi"/>
+          <w:rFonts w:ascii="Arial" w:hAnsi="Arial" w:cs="Arial"/>
           <w:b/>
           <w:bCs/>
           <w:sz w:val="32"/>
@@ -823,7 +813,7 @@
       <w:pPr>
         <w:jc w:val="center"/>
         <w:rPr>
-          <w:rFonts w:cstheme="minorHAnsi"/>
+          <w:rFonts w:ascii="Arial" w:hAnsi="Arial" w:cs="Arial"/>
           <w:b/>
           <w:bCs/>
           <w:sz w:val="32"/>
@@ -835,7 +825,7 @@
       <w:pPr>
         <w:jc w:val="center"/>
         <w:rPr>
-          <w:rFonts w:cstheme="minorHAnsi"/>
+          <w:rFonts w:ascii="Arial" w:hAnsi="Arial" w:cs="Arial"/>
           <w:b/>
           <w:bCs/>
           <w:sz w:val="32"/>
@@ -847,7 +837,7 @@
       <w:pPr>
         <w:jc w:val="center"/>
         <w:rPr>
-          <w:rFonts w:cstheme="minorHAnsi"/>
+          <w:rFonts w:ascii="Arial" w:hAnsi="Arial" w:cs="Arial"/>
           <w:b/>
           <w:bCs/>
           <w:sz w:val="32"/>
@@ -859,7 +849,7 @@
       <w:pPr>
         <w:jc w:val="center"/>
         <w:rPr>
-          <w:rFonts w:cstheme="minorHAnsi"/>
+          <w:rFonts w:ascii="Arial" w:hAnsi="Arial" w:cs="Arial"/>
           <w:b/>
           <w:bCs/>
           <w:sz w:val="32"/>
@@ -870,7 +860,7 @@
     <w:p>
       <w:pPr>
         <w:rPr>
-          <w:rFonts w:cstheme="minorHAnsi"/>
+          <w:rFonts w:ascii="Arial" w:hAnsi="Arial" w:cs="Arial"/>
           <w:b/>
           <w:bCs/>
           <w:sz w:val="32"/>
@@ -881,7 +871,7 @@
     <w:p>
       <w:pPr>
         <w:rPr>
-          <w:rFonts w:cstheme="minorHAnsi"/>
+          <w:rFonts w:ascii="Arial" w:hAnsi="Arial" w:cs="Arial"/>
           <w:b/>
           <w:bCs/>
           <w:sz w:val="32"/>
@@ -892,7 +882,7 @@
     <w:p>
       <w:pPr>
         <w:rPr>
-          <w:rFonts w:cstheme="minorHAnsi"/>
+          <w:rFonts w:ascii="Arial" w:hAnsi="Arial" w:cs="Arial"/>
           <w:b/>
           <w:bCs/>
           <w:sz w:val="32"/>
@@ -903,7 +893,7 @@
     <w:p>
       <w:pPr>
         <w:rPr>
-          <w:rFonts w:cstheme="minorHAnsi"/>
+          <w:rFonts w:ascii="Arial" w:hAnsi="Arial" w:cs="Arial"/>
           <w:b/>
           <w:bCs/>
           <w:sz w:val="32"/>
@@ -914,7 +904,7 @@
     <w:p>
       <w:pPr>
         <w:rPr>
-          <w:rFonts w:cstheme="minorHAnsi"/>
+          <w:rFonts w:ascii="Arial" w:hAnsi="Arial" w:cs="Arial"/>
           <w:b/>
           <w:bCs/>
           <w:sz w:val="32"/>
@@ -925,7 +915,7 @@
     <w:p>
       <w:pPr>
         <w:rPr>
-          <w:rFonts w:cstheme="minorHAnsi"/>
+          <w:rFonts w:ascii="Arial" w:hAnsi="Arial" w:cs="Arial"/>
           <w:b/>
           <w:bCs/>
           <w:sz w:val="32"/>
@@ -936,7 +926,7 @@
     <w:p>
       <w:pPr>
         <w:rPr>
-          <w:rFonts w:cstheme="minorHAnsi"/>
+          <w:rFonts w:ascii="Arial" w:hAnsi="Arial" w:cs="Arial"/>
           <w:b/>
           <w:bCs/>
           <w:sz w:val="32"/>
@@ -947,7 +937,7 @@
     <w:p>
       <w:pPr>
         <w:rPr>
-          <w:rFonts w:cstheme="minorHAnsi"/>
+          <w:rFonts w:ascii="Arial" w:hAnsi="Arial" w:cs="Arial"/>
           <w:b/>
           <w:bCs/>
           <w:sz w:val="32"/>
@@ -958,7 +948,7 @@
     <w:p>
       <w:pPr>
         <w:rPr>
-          <w:rFonts w:cstheme="minorHAnsi"/>
+          <w:rFonts w:ascii="Arial" w:hAnsi="Arial" w:cs="Arial"/>
           <w:b/>
           <w:bCs/>
           <w:sz w:val="32"/>
@@ -969,7 +959,7 @@
     <w:p>
       <w:pPr>
         <w:rPr>
-          <w:rFonts w:cstheme="minorHAnsi"/>
+          <w:rFonts w:ascii="Arial" w:hAnsi="Arial" w:cs="Arial"/>
           <w:b/>
           <w:bCs/>
           <w:sz w:val="32"/>
@@ -980,7 +970,7 @@
     <w:p>
       <w:pPr>
         <w:rPr>
-          <w:rFonts w:cstheme="minorHAnsi"/>
+          <w:rFonts w:ascii="Arial" w:hAnsi="Arial" w:cs="Arial"/>
           <w:b/>
           <w:bCs/>
           <w:sz w:val="32"/>
@@ -992,7 +982,7 @@
       <w:pPr>
         <w:jc w:val="center"/>
         <w:rPr>
-          <w:rFonts w:cstheme="minorHAnsi"/>
+          <w:rFonts w:ascii="Arial" w:hAnsi="Arial" w:cs="Arial"/>
           <w:b/>
           <w:bCs/>
           <w:color w:val="2F5496" w:themeColor="accent1" w:themeShade="BF"/>
@@ -1000,9 +990,22 @@
           <w:szCs w:val="32"/>
         </w:rPr>
       </w:pPr>
+    </w:p>
+    <w:p>
+      <w:pPr>
+        <w:jc w:val="center"/>
+        <w:rPr>
+          <w:rFonts w:ascii="Arial" w:hAnsi="Arial" w:cs="Arial"/>
+          <w:b/>
+          <w:bCs/>
+          <w:color w:val="2F5496" w:themeColor="accent1" w:themeShade="BF"/>
+          <w:sz w:val="32"/>
+          <w:szCs w:val="32"/>
+        </w:rPr>
+      </w:pPr>
       <w:r>
         <w:rPr>
-          <w:rFonts w:cstheme="minorHAnsi"/>
+          <w:rFonts w:ascii="Arial" w:hAnsi="Arial" w:cs="Arial"/>
           <w:b/>
           <w:bCs/>
           <w:color w:val="2F5496" w:themeColor="accent1" w:themeShade="BF"/>
@@ -1013,7 +1016,7 @@
       </w:r>
       <w:r>
         <w:rPr>
-          <w:rFonts w:cstheme="minorHAnsi"/>
+          <w:rFonts w:ascii="Arial" w:hAnsi="Arial" w:cs="Arial"/>
           <w:b/>
           <w:bCs/>
           <w:color w:val="2F5496" w:themeColor="accent1" w:themeShade="BF"/>
@@ -1032,8 +1035,8 @@
           <w:b/>
           <w:bCs/>
           <w:color w:val="833C0B" w:themeColor="accent2" w:themeShade="80"/>
-          <w:sz w:val="56"/>
-          <w:szCs w:val="56"/>
+          <w:sz w:val="48"/>
+          <w:szCs w:val="48"/>
         </w:rPr>
       </w:pPr>
       <w:r>
@@ -1042,47 +1045,11 @@
           <w:b/>
           <w:bCs/>
           <w:color w:val="833C0B" w:themeColor="accent2" w:themeShade="80"/>
-          <w:sz w:val="56"/>
-          <w:szCs w:val="56"/>
+          <w:sz w:val="48"/>
+          <w:szCs w:val="48"/>
         </w:rPr>
         <w:lastRenderedPageBreak/>
         <w:t>Computer Networking</w:t>
-      </w:r>
-    </w:p>
-    <w:p>
-      <w:pPr>
-        <w:spacing w:line="480" w:lineRule="auto"/>
-        <w:jc w:val="center"/>
-        <w:rPr>
-          <w:rFonts w:ascii="Arial" w:hAnsi="Arial" w:cs="Arial"/>
-          <w:b/>
-          <w:bCs/>
-          <w:color w:val="806000" w:themeColor="accent4" w:themeShade="80"/>
-          <w:sz w:val="40"/>
-          <w:szCs w:val="40"/>
-        </w:rPr>
-      </w:pPr>
-      <w:r>
-        <w:rPr>
-          <w:rFonts w:ascii="Arial" w:hAnsi="Arial" w:cs="Arial"/>
-          <w:b/>
-          <w:bCs/>
-          <w:color w:val="806000" w:themeColor="accent4" w:themeShade="80"/>
-          <w:sz w:val="40"/>
-          <w:szCs w:val="40"/>
-        </w:rPr>
-        <w:t xml:space="preserve">Lab </w:t>
-      </w:r>
-      <w:r>
-        <w:rPr>
-          <w:rFonts w:ascii="Arial" w:hAnsi="Arial" w:cs="Arial"/>
-          <w:b/>
-          <w:bCs/>
-          <w:color w:val="806000" w:themeColor="accent4" w:themeShade="80"/>
-          <w:sz w:val="40"/>
-          <w:szCs w:val="40"/>
-        </w:rPr>
-        <w:t>2</w:t>
       </w:r>
     </w:p>
     <w:p>
@@ -1107,7 +1074,57 @@
           <w:sz w:val="32"/>
           <w:szCs w:val="32"/>
         </w:rPr>
-        <w:t>Network Topology</w:t>
+        <w:t>Lab 2 (Exploring Packet Tracer Interface)</w:t>
+      </w:r>
+    </w:p>
+    <w:p>
+      <w:pPr>
+        <w:spacing w:line="480" w:lineRule="auto"/>
+        <w:rPr>
+          <w:rFonts w:ascii="Arial" w:hAnsi="Arial" w:cs="Arial"/>
+          <w:b/>
+          <w:bCs/>
+          <w:sz w:val="24"/>
+          <w:szCs w:val="24"/>
+        </w:rPr>
+      </w:pPr>
+      <w:r>
+        <w:rPr>
+          <w:rFonts w:ascii="Arial" w:hAnsi="Arial" w:cs="Arial"/>
+          <w:b/>
+          <w:bCs/>
+          <w:sz w:val="24"/>
+          <w:szCs w:val="24"/>
+        </w:rPr>
+        <w:t>1. Objective</w:t>
+      </w:r>
+    </w:p>
+    <w:p>
+      <w:pPr>
+        <w:spacing w:line="480" w:lineRule="auto"/>
+        <w:rPr>
+          <w:rFonts w:ascii="Arial" w:hAnsi="Arial" w:cs="Arial"/>
+        </w:rPr>
+      </w:pPr>
+      <w:r>
+        <w:rPr>
+          <w:rFonts w:ascii="Arial" w:hAnsi="Arial" w:cs="Arial"/>
+        </w:rPr>
+        <w:t xml:space="preserve">The primary objective of this lab is to explore and familiarize ourselves with the Cisco Packet Tracer user interface. This includes understanding the differences between workspace views, locating the device selection library, and differentiating between Realtime and Simulation </w:t>
+      </w:r>
+      <w:proofErr w:type="spellStart"/>
+      <w:r>
+        <w:rPr>
+          <w:rFonts w:ascii="Arial" w:hAnsi="Arial" w:cs="Arial"/>
+        </w:rPr>
+        <w:t>modes</w:t>
+      </w:r>
+      <w:proofErr w:type="spellEnd"/>
+      <w:r>
+        <w:rPr>
+          <w:rFonts w:ascii="Arial" w:hAnsi="Arial" w:cs="Arial"/>
+        </w:rPr>
+        <w:t xml:space="preserve"> for network testing.</w:t>
       </w:r>
     </w:p>
     <w:p>
@@ -1130,18 +1147,18 @@
           <w:szCs w:val="24"/>
         </w:rPr>
         <w:drawing>
-          <wp:anchor distT="0" distB="0" distL="114300" distR="114300" simplePos="0" relativeHeight="251658240" behindDoc="0" locked="0" layoutInCell="1" allowOverlap="1" wp14:anchorId="465F9AFB" wp14:editId="448AF006">
+          <wp:anchor distT="0" distB="0" distL="114300" distR="114300" simplePos="0" relativeHeight="251658240" behindDoc="0" locked="0" layoutInCell="1" allowOverlap="1" wp14:anchorId="3095357C" wp14:editId="2420E0F6">
             <wp:simplePos x="0" y="0"/>
             <wp:positionH relativeFrom="margin">
-              <wp:posOffset>895350</wp:posOffset>
+              <wp:posOffset>201105</wp:posOffset>
             </wp:positionH>
             <wp:positionV relativeFrom="paragraph">
-              <wp:posOffset>245110</wp:posOffset>
+              <wp:posOffset>446603</wp:posOffset>
             </wp:positionV>
-            <wp:extent cx="4848225" cy="2552700"/>
-            <wp:effectExtent l="0" t="0" r="9525" b="0"/>
+            <wp:extent cx="6201410" cy="1390650"/>
+            <wp:effectExtent l="76200" t="76200" r="142240" b="133350"/>
             <wp:wrapSquare wrapText="bothSides"/>
-            <wp:docPr id="1027818705" name="Picture 1"/>
+            <wp:docPr id="472038709" name="Picture 1"/>
             <wp:cNvGraphicFramePr>
               <a:graphicFrameLocks xmlns:a="http://schemas.openxmlformats.org/drawingml/2006/main" noChangeAspect="1"/>
             </wp:cNvGraphicFramePr>
@@ -1149,10 +1166,10 @@
               <a:graphicData uri="http://schemas.openxmlformats.org/drawingml/2006/picture">
                 <pic:pic xmlns:pic="http://schemas.openxmlformats.org/drawingml/2006/picture">
                   <pic:nvPicPr>
-                    <pic:cNvPr id="1027818705" name=""/>
+                    <pic:cNvPr id="472038709" name=""/>
                     <pic:cNvPicPr/>
                   </pic:nvPicPr>
-                  <pic:blipFill rotWithShape="1">
+                  <pic:blipFill>
                     <a:blip r:embed="rId9">
                       <a:extLst>
                         <a:ext uri="{28A0092B-C50C-407E-A947-70E740481C1C}">
@@ -1160,34 +1177,36 @@
                         </a:ext>
                       </a:extLst>
                     </a:blip>
-                    <a:srcRect t="9232" b="8307"/>
                     <a:stretch>
                       <a:fillRect/>
                     </a:stretch>
                   </pic:blipFill>
-                  <pic:spPr bwMode="auto">
+                  <pic:spPr>
                     <a:xfrm>
                       <a:off x="0" y="0"/>
-                      <a:ext cx="4848225" cy="2552700"/>
+                      <a:ext cx="6201410" cy="1390650"/>
                     </a:xfrm>
                     <a:prstGeom prst="rect">
                       <a:avLst/>
                     </a:prstGeom>
-                    <a:ln>
-                      <a:noFill/>
+                    <a:ln w="38100" cap="sq">
+                      <a:solidFill>
+                        <a:srgbClr val="000000"/>
+                      </a:solidFill>
+                      <a:prstDash val="solid"/>
+                      <a:miter lim="800000"/>
                     </a:ln>
-                    <a:extLst>
-                      <a:ext uri="{53640926-AAD7-44D8-BBD7-CCE9431645EC}">
-                        <a14:shadowObscured xmlns:a14="http://schemas.microsoft.com/office/drawing/2010/main"/>
-                      </a:ext>
-                    </a:extLst>
+                    <a:effectLst>
+                      <a:outerShdw blurRad="50800" dist="38100" dir="2700000" algn="tl" rotWithShape="0">
+                        <a:srgbClr val="000000">
+                          <a:alpha val="43000"/>
+                        </a:srgbClr>
+                      </a:outerShdw>
+                    </a:effectLst>
                   </pic:spPr>
                 </pic:pic>
               </a:graphicData>
             </a:graphic>
-            <wp14:sizeRelV relativeFrom="margin">
-              <wp14:pctHeight>0</wp14:pctHeight>
-            </wp14:sizeRelV>
           </wp:anchor>
         </w:drawing>
       </w:r>
@@ -1199,8 +1218,28 @@
           <w:sz w:val="24"/>
           <w:szCs w:val="24"/>
         </w:rPr>
-        <w:t>Screenshot</w:t>
+        <w:t>2. Workspace Toggle (Logical vs. Physical)</w:t>
       </w:r>
+    </w:p>
+    <w:p>
+      <w:pPr>
+        <w:spacing w:line="480" w:lineRule="auto"/>
+        <w:rPr>
+          <w:rFonts w:ascii="Arial" w:hAnsi="Arial" w:cs="Arial"/>
+          <w:b/>
+          <w:bCs/>
+        </w:rPr>
+      </w:pPr>
+    </w:p>
+    <w:p>
+      <w:pPr>
+        <w:spacing w:line="480" w:lineRule="auto"/>
+        <w:rPr>
+          <w:rFonts w:ascii="Arial" w:hAnsi="Arial" w:cs="Arial"/>
+          <w:sz w:val="24"/>
+          <w:szCs w:val="24"/>
+        </w:rPr>
+      </w:pPr>
       <w:r>
         <w:rPr>
           <w:rFonts w:ascii="Arial" w:hAnsi="Arial" w:cs="Arial"/>
@@ -1209,7 +1248,51 @@
           <w:sz w:val="24"/>
           <w:szCs w:val="24"/>
         </w:rPr>
-        <w:t>:</w:t>
+        <w:t>Explanation:</w:t>
+      </w:r>
+    </w:p>
+    <w:p>
+      <w:pPr>
+        <w:spacing w:line="480" w:lineRule="auto"/>
+        <w:rPr>
+          <w:rFonts w:ascii="Arial" w:hAnsi="Arial" w:cs="Arial"/>
+          <w:b/>
+          <w:bCs/>
+        </w:rPr>
+      </w:pPr>
+      <w:r>
+        <w:rPr>
+          <w:rFonts w:ascii="Arial" w:hAnsi="Arial" w:cs="Arial"/>
+        </w:rPr>
+        <w:t xml:space="preserve">The workspace toggle allows users to switch between the Logical and Physical views in Packet Tracer. The </w:t>
+      </w:r>
+      <w:r>
+        <w:rPr>
+          <w:rFonts w:ascii="Arial" w:hAnsi="Arial" w:cs="Arial"/>
+          <w:b/>
+          <w:bCs/>
+        </w:rPr>
+        <w:t>Logical</w:t>
+      </w:r>
+      <w:r>
+        <w:rPr>
+          <w:rFonts w:ascii="Arial" w:hAnsi="Arial" w:cs="Arial"/>
+        </w:rPr>
+        <w:t xml:space="preserve"> workspace is primarily used for creating and configuring conceptual network diagrams and topologies. The </w:t>
+      </w:r>
+      <w:r>
+        <w:rPr>
+          <w:rFonts w:ascii="Arial" w:hAnsi="Arial" w:cs="Arial"/>
+          <w:b/>
+          <w:bCs/>
+        </w:rPr>
+        <w:t>Physical</w:t>
+      </w:r>
+      <w:r>
+        <w:rPr>
+          <w:rFonts w:ascii="Arial" w:hAnsi="Arial" w:cs="Arial"/>
+        </w:rPr>
+        <w:t xml:space="preserve"> workspace provides a realistic representation of the network, allowing users to visualize city layouts, building blueprints, and the actual wiring closet racks where physical equipment is installed.</w:t>
       </w:r>
     </w:p>
     <w:p>
@@ -1223,228 +1306,25 @@
           <w:szCs w:val="24"/>
         </w:rPr>
       </w:pPr>
-    </w:p>
-    <w:p>
-      <w:pPr>
-        <w:spacing w:line="480" w:lineRule="auto"/>
-        <w:rPr>
-          <w:rFonts w:ascii="Arial" w:hAnsi="Arial" w:cs="Arial"/>
-          <w:b/>
-          <w:bCs/>
-          <w:sz w:val="24"/>
-          <w:szCs w:val="24"/>
-        </w:rPr>
-      </w:pPr>
-    </w:p>
-    <w:p>
-      <w:pPr>
-        <w:spacing w:line="480" w:lineRule="auto"/>
-        <w:rPr>
-          <w:rFonts w:ascii="Arial" w:hAnsi="Arial" w:cs="Arial"/>
-          <w:b/>
-          <w:bCs/>
-          <w:sz w:val="24"/>
-          <w:szCs w:val="24"/>
-        </w:rPr>
-      </w:pPr>
-    </w:p>
-    <w:p>
-      <w:pPr>
-        <w:spacing w:line="480" w:lineRule="auto"/>
-        <w:rPr>
-          <w:rFonts w:ascii="Arial" w:hAnsi="Arial" w:cs="Arial"/>
-          <w:b/>
-          <w:bCs/>
-          <w:sz w:val="24"/>
-          <w:szCs w:val="24"/>
-        </w:rPr>
-      </w:pPr>
-    </w:p>
-    <w:p>
-      <w:pPr>
-        <w:spacing w:line="480" w:lineRule="auto"/>
-        <w:rPr>
-          <w:rFonts w:ascii="Arial" w:hAnsi="Arial" w:cs="Arial"/>
-          <w:b/>
-          <w:bCs/>
-          <w:sz w:val="24"/>
-          <w:szCs w:val="24"/>
-        </w:rPr>
-      </w:pPr>
-    </w:p>
-    <w:p>
-      <w:pPr>
-        <w:spacing w:line="480" w:lineRule="auto"/>
-        <w:rPr>
-          <w:rFonts w:ascii="Arial" w:hAnsi="Arial" w:cs="Arial"/>
-        </w:rPr>
-      </w:pPr>
       <w:r>
         <w:rPr>
           <w:rFonts w:ascii="Arial" w:hAnsi="Arial" w:cs="Arial"/>
           <w:b/>
           <w:bCs/>
-          <w:sz w:val="28"/>
-          <w:szCs w:val="28"/>
-        </w:rPr>
-        <w:t>Explanation</w:t>
-      </w:r>
-      <w:r>
-        <w:rPr>
-          <w:rFonts w:ascii="Arial" w:hAnsi="Arial" w:cs="Arial"/>
-          <w:b/>
-          <w:bCs/>
-          <w:sz w:val="24"/>
-          <w:szCs w:val="24"/>
-        </w:rPr>
-        <w:t>:</w:t>
-      </w:r>
-      <w:r>
-        <w:rPr>
-          <w:rFonts w:ascii="Arial" w:hAnsi="Arial" w:cs="Arial"/>
-        </w:rPr>
-        <w:t xml:space="preserve"> In this step, </w:t>
-      </w:r>
-      <w:r>
-        <w:rPr>
-          <w:rFonts w:ascii="Arial" w:hAnsi="Arial" w:cs="Arial"/>
-        </w:rPr>
-        <w:t>I created a</w:t>
-      </w:r>
-      <w:r>
-        <w:rPr>
-          <w:rFonts w:ascii="Arial" w:hAnsi="Arial" w:cs="Arial"/>
-        </w:rPr>
-        <w:t xml:space="preserve"> simple Local Area Network (LAN) topology</w:t>
-      </w:r>
-      <w:r>
-        <w:rPr>
-          <w:rFonts w:ascii="Arial" w:hAnsi="Arial" w:cs="Arial"/>
-        </w:rPr>
-        <w:t xml:space="preserve"> </w:t>
-      </w:r>
-      <w:r>
-        <w:rPr>
-          <w:rFonts w:ascii="Arial" w:hAnsi="Arial" w:cs="Arial"/>
-        </w:rPr>
-        <w:t>using Cisco Packet Tracer.</w:t>
-      </w:r>
-      <w:r>
-        <w:rPr>
-          <w:rFonts w:ascii="Arial" w:hAnsi="Arial" w:cs="Arial"/>
-        </w:rPr>
-        <w:t xml:space="preserve"> I added</w:t>
-      </w:r>
-      <w:r>
-        <w:rPr>
-          <w:rFonts w:ascii="Arial" w:hAnsi="Arial" w:cs="Arial"/>
-        </w:rPr>
-        <w:t xml:space="preserve"> </w:t>
-      </w:r>
-      <w:r>
-        <w:rPr>
-          <w:rFonts w:ascii="Arial" w:hAnsi="Arial" w:cs="Arial"/>
-        </w:rPr>
-        <w:t>t</w:t>
-      </w:r>
-      <w:r>
-        <w:rPr>
-          <w:rFonts w:ascii="Arial" w:hAnsi="Arial" w:cs="Arial"/>
-        </w:rPr>
-        <w:t xml:space="preserve">wo end devices (PCs) to the workspace and connected </w:t>
-      </w:r>
-      <w:r>
-        <w:rPr>
-          <w:rFonts w:ascii="Arial" w:hAnsi="Arial" w:cs="Arial"/>
-        </w:rPr>
-        <w:t xml:space="preserve">them </w:t>
-      </w:r>
-      <w:r>
-        <w:rPr>
-          <w:rFonts w:ascii="Arial" w:hAnsi="Arial" w:cs="Arial"/>
-        </w:rPr>
-        <w:t>to a central node, a switch, using copper straight-through cables. The green link lights indicate that the physical connections are active and the devices are ready to communicate within the same network.</w:t>
-      </w:r>
-    </w:p>
-    <w:p>
-      <w:pPr>
-        <w:spacing w:line="480" w:lineRule="auto"/>
-        <w:jc w:val="center"/>
-        <w:rPr>
-          <w:rFonts w:ascii="Arial" w:hAnsi="Arial" w:cs="Arial"/>
-          <w:b/>
-          <w:bCs/>
-          <w:color w:val="1F3864" w:themeColor="accent1" w:themeShade="80"/>
-          <w:sz w:val="32"/>
-          <w:szCs w:val="32"/>
-        </w:rPr>
-      </w:pPr>
-      <w:r>
-        <w:rPr>
-          <w:rFonts w:ascii="Arial" w:hAnsi="Arial" w:cs="Arial"/>
-          <w:b/>
-          <w:bCs/>
-          <w:color w:val="1F3864" w:themeColor="accent1" w:themeShade="80"/>
-          <w:sz w:val="32"/>
-          <w:szCs w:val="32"/>
-        </w:rPr>
-        <w:t>IP Configuration</w:t>
-      </w:r>
-    </w:p>
-    <w:p>
-      <w:pPr>
-        <w:spacing w:line="480" w:lineRule="auto"/>
-        <w:rPr>
-          <w:rFonts w:ascii="Arial" w:hAnsi="Arial" w:cs="Arial"/>
-          <w:b/>
-          <w:bCs/>
-          <w:sz w:val="24"/>
-          <w:szCs w:val="24"/>
-        </w:rPr>
-      </w:pPr>
-      <w:r>
-        <w:rPr>
-          <w:rFonts w:ascii="Arial" w:hAnsi="Arial" w:cs="Arial"/>
-          <w:b/>
-          <w:bCs/>
-          <w:sz w:val="24"/>
-          <w:szCs w:val="24"/>
-        </w:rPr>
-        <w:t>Screenshot:</w:t>
-      </w:r>
-    </w:p>
-    <w:p>
-      <w:pPr>
-        <w:spacing w:line="480" w:lineRule="auto"/>
-        <w:rPr>
-          <w:rFonts w:ascii="Arial" w:hAnsi="Arial" w:cs="Arial"/>
-          <w:b/>
-          <w:bCs/>
-          <w:sz w:val="24"/>
-          <w:szCs w:val="24"/>
-        </w:rPr>
-      </w:pPr>
-      <w:r>
-        <w:rPr>
-          <w:rFonts w:ascii="Arial" w:hAnsi="Arial" w:cs="Arial"/>
-          <w:b/>
-          <w:bCs/>
-          <w:sz w:val="24"/>
-          <w:szCs w:val="24"/>
         </w:rPr>
         <w:drawing>
-          <wp:anchor distT="0" distB="0" distL="114300" distR="114300" simplePos="0" relativeHeight="251659264" behindDoc="0" locked="0" layoutInCell="1" allowOverlap="1" wp14:anchorId="4230A0D8" wp14:editId="23ADFA77">
+          <wp:anchor distT="0" distB="0" distL="114300" distR="114300" simplePos="0" relativeHeight="251659264" behindDoc="0" locked="0" layoutInCell="1" allowOverlap="1" wp14:anchorId="5516B0E3" wp14:editId="67A5141A">
             <wp:simplePos x="0" y="0"/>
             <wp:positionH relativeFrom="margin">
-              <wp:posOffset>746125</wp:posOffset>
+              <wp:align>center</wp:align>
             </wp:positionH>
             <wp:positionV relativeFrom="paragraph">
-              <wp:posOffset>123190</wp:posOffset>
+              <wp:posOffset>462651</wp:posOffset>
             </wp:positionV>
-            <wp:extent cx="5153744" cy="2105319"/>
-            <wp:effectExtent l="0" t="0" r="0" b="9525"/>
+            <wp:extent cx="6192114" cy="1343212"/>
+            <wp:effectExtent l="76200" t="76200" r="132715" b="142875"/>
             <wp:wrapSquare wrapText="bothSides"/>
-            <wp:docPr id="1278091569" name="Picture 1"/>
+            <wp:docPr id="1887199969" name="Picture 1"/>
             <wp:cNvGraphicFramePr>
               <a:graphicFrameLocks xmlns:a="http://schemas.openxmlformats.org/drawingml/2006/main" noChangeAspect="1"/>
             </wp:cNvGraphicFramePr>
@@ -1452,7 +1332,7 @@
               <a:graphicData uri="http://schemas.openxmlformats.org/drawingml/2006/picture">
                 <pic:pic xmlns:pic="http://schemas.openxmlformats.org/drawingml/2006/picture">
                   <pic:nvPicPr>
-                    <pic:cNvPr id="1278091569" name=""/>
+                    <pic:cNvPr id="1887199969" name=""/>
                     <pic:cNvPicPr/>
                   </pic:nvPicPr>
                   <pic:blipFill>
@@ -1470,610 +1350,25 @@
                   <pic:spPr>
                     <a:xfrm>
                       <a:off x="0" y="0"/>
-                      <a:ext cx="5153744" cy="2105319"/>
+                      <a:ext cx="6192114" cy="1343212"/>
                     </a:xfrm>
                     <a:prstGeom prst="rect">
                       <a:avLst/>
                     </a:prstGeom>
-                  </pic:spPr>
-                </pic:pic>
-              </a:graphicData>
-            </a:graphic>
-          </wp:anchor>
-        </w:drawing>
-      </w:r>
-    </w:p>
-    <w:p>
-      <w:pPr>
-        <w:spacing w:line="480" w:lineRule="auto"/>
-        <w:rPr>
-          <w:rFonts w:ascii="Arial" w:hAnsi="Arial" w:cs="Arial"/>
-          <w:b/>
-          <w:bCs/>
-          <w:sz w:val="24"/>
-          <w:szCs w:val="24"/>
-        </w:rPr>
-      </w:pPr>
-    </w:p>
-    <w:p>
-      <w:pPr>
-        <w:spacing w:line="480" w:lineRule="auto"/>
-        <w:rPr>
-          <w:rFonts w:ascii="Arial" w:hAnsi="Arial" w:cs="Arial"/>
-          <w:b/>
-          <w:bCs/>
-        </w:rPr>
-      </w:pPr>
-    </w:p>
-    <w:p>
-      <w:pPr>
-        <w:spacing w:line="480" w:lineRule="auto"/>
-        <w:rPr>
-          <w:rFonts w:ascii="Arial" w:hAnsi="Arial" w:cs="Arial"/>
-          <w:b/>
-          <w:bCs/>
-        </w:rPr>
-      </w:pPr>
-    </w:p>
-    <w:p>
-      <w:pPr>
-        <w:spacing w:line="480" w:lineRule="auto"/>
-        <w:rPr>
-          <w:rFonts w:ascii="Arial" w:hAnsi="Arial" w:cs="Arial"/>
-          <w:b/>
-          <w:bCs/>
-        </w:rPr>
-      </w:pPr>
-    </w:p>
-    <w:p>
-      <w:pPr>
-        <w:spacing w:line="480" w:lineRule="auto"/>
-        <w:rPr>
-          <w:rFonts w:ascii="Arial" w:hAnsi="Arial" w:cs="Arial"/>
-        </w:rPr>
-      </w:pPr>
-      <w:r>
-        <w:rPr>
-          <w:rFonts w:ascii="Arial" w:hAnsi="Arial" w:cs="Arial"/>
-          <w:b/>
-          <w:bCs/>
-          <w:sz w:val="28"/>
-          <w:szCs w:val="28"/>
-        </w:rPr>
-        <w:lastRenderedPageBreak/>
-        <w:t>Explanation:</w:t>
-      </w:r>
-      <w:r>
-        <w:rPr>
-          <w:rFonts w:ascii="Arial" w:hAnsi="Arial" w:cs="Arial"/>
-        </w:rPr>
-        <w:t xml:space="preserve"> To enable communication, a unique logical IP address was manually assigned to each PC. PC</w:t>
-      </w:r>
-      <w:r>
-        <w:rPr>
-          <w:rFonts w:ascii="Arial" w:hAnsi="Arial" w:cs="Arial"/>
-        </w:rPr>
-        <w:t>3</w:t>
-      </w:r>
-      <w:r>
-        <w:rPr>
-          <w:rFonts w:ascii="Arial" w:hAnsi="Arial" w:cs="Arial"/>
-        </w:rPr>
-        <w:t xml:space="preserve"> was configured with the static IP 192.168.1.1 and PC</w:t>
-      </w:r>
-      <w:r>
-        <w:rPr>
-          <w:rFonts w:ascii="Arial" w:hAnsi="Arial" w:cs="Arial"/>
-        </w:rPr>
-        <w:t>4</w:t>
-      </w:r>
-      <w:r>
-        <w:rPr>
-          <w:rFonts w:ascii="Arial" w:hAnsi="Arial" w:cs="Arial"/>
-        </w:rPr>
-        <w:t xml:space="preserve"> with 192.168.1.2 on the 192.168.1.0 network using a 255.255.255.0 subnet mask. A default gateway was not required because the devices are on the same local network</w:t>
-      </w:r>
-      <w:r>
-        <w:rPr>
-          <w:rFonts w:ascii="Arial" w:hAnsi="Arial" w:cs="Arial"/>
-        </w:rPr>
-        <w:t>,</w:t>
-      </w:r>
-      <w:r>
-        <w:rPr>
-          <w:rFonts w:ascii="Arial" w:hAnsi="Arial" w:cs="Arial"/>
-        </w:rPr>
-        <w:t xml:space="preserve"> and no router is used to route traffic externally.</w:t>
-      </w:r>
-    </w:p>
-    <w:p>
-      <w:pPr>
-        <w:spacing w:line="480" w:lineRule="auto"/>
-        <w:jc w:val="center"/>
-        <w:rPr>
-          <w:rFonts w:ascii="Arial" w:hAnsi="Arial" w:cs="Arial"/>
-          <w:b/>
-          <w:bCs/>
-          <w:color w:val="1F3864" w:themeColor="accent1" w:themeShade="80"/>
-          <w:sz w:val="32"/>
-          <w:szCs w:val="32"/>
-        </w:rPr>
-      </w:pPr>
-      <w:r>
-        <w:rPr>
-          <w:rFonts w:ascii="Arial" w:hAnsi="Arial" w:cs="Arial"/>
-          <w:b/>
-          <w:bCs/>
-          <w:color w:val="1F3864" w:themeColor="accent1" w:themeShade="80"/>
-          <w:sz w:val="32"/>
-          <w:szCs w:val="32"/>
-        </w:rPr>
-        <w:t>CLI Testing</w:t>
-      </w:r>
-      <w:r>
-        <w:rPr>
-          <w:rFonts w:ascii="Arial" w:hAnsi="Arial" w:cs="Arial"/>
-          <w:b/>
-          <w:bCs/>
-          <w:color w:val="1F3864" w:themeColor="accent1" w:themeShade="80"/>
-          <w:sz w:val="32"/>
-          <w:szCs w:val="32"/>
-        </w:rPr>
-        <w:t xml:space="preserve"> – PC 3 </w:t>
-      </w:r>
-    </w:p>
-    <w:p>
-      <w:pPr>
-        <w:pStyle w:val="ListParagraph"/>
-        <w:numPr>
-          <w:ilvl w:val="0"/>
-          <w:numId w:val="36"/>
-        </w:numPr>
-        <w:spacing w:line="480" w:lineRule="auto"/>
-        <w:rPr>
-          <w:rFonts w:ascii="Arial" w:hAnsi="Arial" w:cs="Arial"/>
-          <w:b/>
-          <w:bCs/>
-          <w:sz w:val="28"/>
-          <w:szCs w:val="28"/>
-        </w:rPr>
-      </w:pPr>
-      <w:r>
-        <w:rPr>
-          <w:rFonts w:ascii="Arial" w:hAnsi="Arial" w:cs="Arial"/>
-          <w:b/>
-          <w:bCs/>
-          <w:sz w:val="28"/>
-          <w:szCs w:val="28"/>
-        </w:rPr>
-        <w:t xml:space="preserve">Command: </w:t>
-      </w:r>
-      <w:r>
-        <w:rPr>
-          <w:rFonts w:ascii="Arial" w:hAnsi="Arial" w:cs="Arial"/>
-          <w:b/>
-          <w:bCs/>
-          <w:sz w:val="28"/>
-          <w:szCs w:val="28"/>
-        </w:rPr>
-        <w:t>ipconfig</w:t>
-      </w:r>
-    </w:p>
-    <w:p>
-      <w:pPr>
-        <w:spacing w:line="480" w:lineRule="auto"/>
-        <w:rPr>
-          <w:rFonts w:ascii="Arial" w:hAnsi="Arial" w:cs="Arial"/>
-          <w:b/>
-          <w:bCs/>
-          <w:color w:val="1F3864" w:themeColor="accent1" w:themeShade="80"/>
-          <w:sz w:val="32"/>
-          <w:szCs w:val="32"/>
-        </w:rPr>
-      </w:pPr>
-      <w:r>
-        <w:rPr>
-          <w:rFonts w:ascii="Arial" w:hAnsi="Arial" w:cs="Arial"/>
-          <w:b/>
-          <w:bCs/>
-          <w:noProof/>
-          <w:color w:val="4472C4" w:themeColor="accent1"/>
-          <w:sz w:val="32"/>
-          <w:szCs w:val="32"/>
-        </w:rPr>
-        <w:drawing>
-          <wp:anchor distT="0" distB="0" distL="114300" distR="114300" simplePos="0" relativeHeight="251660288" behindDoc="0" locked="0" layoutInCell="1" allowOverlap="1" wp14:anchorId="5BBAC908" wp14:editId="4B4EC3FF">
-            <wp:simplePos x="0" y="0"/>
-            <wp:positionH relativeFrom="margin">
-              <wp:align>center</wp:align>
-            </wp:positionH>
-            <wp:positionV relativeFrom="paragraph">
-              <wp:posOffset>35494</wp:posOffset>
-            </wp:positionV>
-            <wp:extent cx="4352925" cy="2476500"/>
-            <wp:effectExtent l="0" t="0" r="9525" b="0"/>
-            <wp:wrapSquare wrapText="bothSides"/>
-            <wp:docPr id="1215578717" name="Picture 1"/>
-            <wp:cNvGraphicFramePr>
-              <a:graphicFrameLocks xmlns:a="http://schemas.openxmlformats.org/drawingml/2006/main" noChangeAspect="1"/>
-            </wp:cNvGraphicFramePr>
-            <a:graphic xmlns:a="http://schemas.openxmlformats.org/drawingml/2006/main">
-              <a:graphicData uri="http://schemas.openxmlformats.org/drawingml/2006/picture">
-                <pic:pic xmlns:pic="http://schemas.openxmlformats.org/drawingml/2006/picture">
-                  <pic:nvPicPr>
-                    <pic:cNvPr id="1215578717" name="Picture 1215578717"/>
-                    <pic:cNvPicPr/>
-                  </pic:nvPicPr>
-                  <pic:blipFill>
-                    <a:blip r:embed="rId11">
-                      <a:extLst>
-                        <a:ext uri="{28A0092B-C50C-407E-A947-70E740481C1C}">
-                          <a14:useLocalDpi xmlns:a14="http://schemas.microsoft.com/office/drawing/2010/main" val="0"/>
-                        </a:ext>
-                      </a:extLst>
-                    </a:blip>
-                    <a:stretch>
-                      <a:fillRect/>
-                    </a:stretch>
-                  </pic:blipFill>
-                  <pic:spPr>
-                    <a:xfrm>
-                      <a:off x="0" y="0"/>
-                      <a:ext cx="4352925" cy="2476500"/>
-                    </a:xfrm>
-                    <a:prstGeom prst="rect">
-                      <a:avLst/>
-                    </a:prstGeom>
-                  </pic:spPr>
-                </pic:pic>
-              </a:graphicData>
-            </a:graphic>
-          </wp:anchor>
-        </w:drawing>
-      </w:r>
-    </w:p>
-    <w:p>
-      <w:pPr>
-        <w:spacing w:line="480" w:lineRule="auto"/>
-        <w:rPr>
-          <w:rFonts w:ascii="Arial" w:hAnsi="Arial" w:cs="Arial"/>
-          <w:b/>
-          <w:bCs/>
-        </w:rPr>
-      </w:pPr>
-    </w:p>
-    <w:p>
-      <w:pPr>
-        <w:spacing w:line="480" w:lineRule="auto"/>
-        <w:rPr>
-          <w:rFonts w:ascii="Arial" w:hAnsi="Arial" w:cs="Arial"/>
-          <w:b/>
-          <w:bCs/>
-        </w:rPr>
-      </w:pPr>
-    </w:p>
-    <w:p>
-      <w:pPr>
-        <w:spacing w:line="480" w:lineRule="auto"/>
-        <w:rPr>
-          <w:rFonts w:ascii="Arial" w:hAnsi="Arial" w:cs="Arial"/>
-          <w:b/>
-          <w:bCs/>
-        </w:rPr>
-      </w:pPr>
-    </w:p>
-    <w:p>
-      <w:pPr>
-        <w:spacing w:line="480" w:lineRule="auto"/>
-        <w:rPr>
-          <w:rFonts w:ascii="Arial" w:hAnsi="Arial" w:cs="Arial"/>
-          <w:b/>
-          <w:bCs/>
-        </w:rPr>
-      </w:pPr>
-    </w:p>
-    <w:p>
-      <w:pPr>
-        <w:spacing w:line="480" w:lineRule="auto"/>
-        <w:rPr>
-          <w:rFonts w:ascii="Arial" w:hAnsi="Arial" w:cs="Arial"/>
-          <w:b/>
-          <w:bCs/>
-        </w:rPr>
-      </w:pPr>
-    </w:p>
-    <w:p>
-      <w:pPr>
-        <w:spacing w:line="480" w:lineRule="auto"/>
-        <w:rPr>
-          <w:rFonts w:ascii="Arial" w:hAnsi="Arial" w:cs="Arial"/>
-          <w:b/>
-          <w:bCs/>
-        </w:rPr>
-      </w:pPr>
-    </w:p>
-    <w:p>
-      <w:pPr>
-        <w:spacing w:line="480" w:lineRule="auto"/>
-        <w:rPr>
-          <w:rFonts w:ascii="Arial" w:hAnsi="Arial" w:cs="Arial"/>
-        </w:rPr>
-      </w:pPr>
-      <w:r>
-        <w:rPr>
-          <w:rFonts w:ascii="Arial" w:hAnsi="Arial" w:cs="Arial"/>
-          <w:b/>
-          <w:bCs/>
-          <w:sz w:val="28"/>
-          <w:szCs w:val="28"/>
-        </w:rPr>
-        <w:t>Explanation:</w:t>
-      </w:r>
-      <w:r>
-        <w:rPr>
-          <w:rFonts w:ascii="Arial" w:hAnsi="Arial" w:cs="Arial"/>
-          <w:sz w:val="28"/>
-          <w:szCs w:val="28"/>
-        </w:rPr>
-        <w:t xml:space="preserve"> </w:t>
-      </w:r>
-      <w:r>
-        <w:rPr>
-          <w:rFonts w:ascii="Arial" w:hAnsi="Arial" w:cs="Arial"/>
-        </w:rPr>
-        <w:t>The ipconfig command was executed in the Command Line Interface (CLI) to view the current IP configuration of the device. The output successfully verified that the static IP address and subnet mask entered in the graphical interface were properly applied to the PC's network adapter.</w:t>
-      </w:r>
-    </w:p>
-    <w:p>
-      <w:pPr>
-        <w:pStyle w:val="ListParagraph"/>
-        <w:numPr>
-          <w:ilvl w:val="0"/>
-          <w:numId w:val="36"/>
-        </w:numPr>
-        <w:spacing w:line="480" w:lineRule="auto"/>
-        <w:rPr>
-          <w:rFonts w:ascii="Arial" w:hAnsi="Arial" w:cs="Arial"/>
-          <w:b/>
-          <w:bCs/>
-          <w:sz w:val="28"/>
-          <w:szCs w:val="28"/>
-        </w:rPr>
-      </w:pPr>
-      <w:r>
-        <w:rPr>
-          <w:rFonts w:ascii="Arial" w:hAnsi="Arial" w:cs="Arial"/>
-          <w:b/>
-          <w:bCs/>
-          <w:sz w:val="28"/>
-          <w:szCs w:val="28"/>
-        </w:rPr>
-        <w:t>Command: ping</w:t>
-      </w:r>
-    </w:p>
-    <w:p>
-      <w:pPr>
-        <w:spacing w:line="480" w:lineRule="auto"/>
-        <w:rPr>
-          <w:rFonts w:ascii="Arial" w:hAnsi="Arial" w:cs="Arial"/>
-        </w:rPr>
-      </w:pPr>
-      <w:r>
-        <w:rPr>
-          <w:rFonts w:ascii="Arial" w:hAnsi="Arial" w:cs="Arial"/>
-          <w:noProof/>
-        </w:rPr>
-        <w:drawing>
-          <wp:anchor distT="0" distB="0" distL="114300" distR="114300" simplePos="0" relativeHeight="251662336" behindDoc="0" locked="0" layoutInCell="1" allowOverlap="1" wp14:anchorId="50230215" wp14:editId="5A585D52">
-            <wp:simplePos x="0" y="0"/>
-            <wp:positionH relativeFrom="margin">
-              <wp:align>center</wp:align>
-            </wp:positionH>
-            <wp:positionV relativeFrom="paragraph">
-              <wp:posOffset>248920</wp:posOffset>
-            </wp:positionV>
-            <wp:extent cx="4124325" cy="1914525"/>
-            <wp:effectExtent l="0" t="0" r="9525" b="9525"/>
-            <wp:wrapSquare wrapText="bothSides"/>
-            <wp:docPr id="985180782" name="Picture 2"/>
-            <wp:cNvGraphicFramePr>
-              <a:graphicFrameLocks xmlns:a="http://schemas.openxmlformats.org/drawingml/2006/main" noChangeAspect="1"/>
-            </wp:cNvGraphicFramePr>
-            <a:graphic xmlns:a="http://schemas.openxmlformats.org/drawingml/2006/main">
-              <a:graphicData uri="http://schemas.openxmlformats.org/drawingml/2006/picture">
-                <pic:pic xmlns:pic="http://schemas.openxmlformats.org/drawingml/2006/picture">
-                  <pic:nvPicPr>
-                    <pic:cNvPr id="985180782" name="Picture 985180782"/>
-                    <pic:cNvPicPr/>
-                  </pic:nvPicPr>
-                  <pic:blipFill>
-                    <a:blip r:embed="rId12">
-                      <a:extLst>
-                        <a:ext uri="{28A0092B-C50C-407E-A947-70E740481C1C}">
-                          <a14:useLocalDpi xmlns:a14="http://schemas.microsoft.com/office/drawing/2010/main" val="0"/>
-                        </a:ext>
-                      </a:extLst>
-                    </a:blip>
-                    <a:stretch>
-                      <a:fillRect/>
-                    </a:stretch>
-                  </pic:blipFill>
-                  <pic:spPr>
-                    <a:xfrm>
-                      <a:off x="0" y="0"/>
-                      <a:ext cx="4124325" cy="1914525"/>
-                    </a:xfrm>
-                    <a:prstGeom prst="rect">
-                      <a:avLst/>
-                    </a:prstGeom>
-                  </pic:spPr>
-                </pic:pic>
-              </a:graphicData>
-            </a:graphic>
-          </wp:anchor>
-        </w:drawing>
-      </w:r>
-    </w:p>
-    <w:p>
-      <w:pPr>
-        <w:spacing w:line="480" w:lineRule="auto"/>
-        <w:rPr>
-          <w:rFonts w:ascii="Arial" w:hAnsi="Arial" w:cs="Arial"/>
-        </w:rPr>
-      </w:pPr>
-    </w:p>
-    <w:p>
-      <w:pPr>
-        <w:spacing w:line="480" w:lineRule="auto"/>
-        <w:rPr>
-          <w:rFonts w:ascii="Arial" w:hAnsi="Arial" w:cs="Arial"/>
-          <w:b/>
-          <w:bCs/>
-        </w:rPr>
-      </w:pPr>
-    </w:p>
-    <w:p>
-      <w:pPr>
-        <w:spacing w:line="480" w:lineRule="auto"/>
-        <w:rPr>
-          <w:rFonts w:ascii="Arial" w:hAnsi="Arial" w:cs="Arial"/>
-          <w:b/>
-          <w:bCs/>
-        </w:rPr>
-      </w:pPr>
-    </w:p>
-    <w:p>
-      <w:pPr>
-        <w:spacing w:line="480" w:lineRule="auto"/>
-        <w:rPr>
-          <w:rFonts w:ascii="Arial" w:hAnsi="Arial" w:cs="Arial"/>
-          <w:b/>
-          <w:bCs/>
-        </w:rPr>
-      </w:pPr>
-    </w:p>
-    <w:p>
-      <w:pPr>
-        <w:spacing w:line="480" w:lineRule="auto"/>
-        <w:rPr>
-          <w:rFonts w:ascii="Arial" w:hAnsi="Arial" w:cs="Arial"/>
-          <w:b/>
-          <w:bCs/>
-        </w:rPr>
-      </w:pPr>
-    </w:p>
-    <w:p>
-      <w:pPr>
-        <w:spacing w:line="480" w:lineRule="auto"/>
-        <w:rPr>
-          <w:rFonts w:ascii="Arial" w:hAnsi="Arial" w:cs="Arial"/>
-        </w:rPr>
-      </w:pPr>
-      <w:r>
-        <w:rPr>
-          <w:rFonts w:ascii="Arial" w:hAnsi="Arial" w:cs="Arial"/>
-          <w:b/>
-          <w:bCs/>
-          <w:sz w:val="28"/>
-          <w:szCs w:val="28"/>
-        </w:rPr>
-        <w:lastRenderedPageBreak/>
-        <w:t>Explanation:</w:t>
-      </w:r>
-      <w:r>
-        <w:rPr>
-          <w:rFonts w:ascii="Arial" w:hAnsi="Arial" w:cs="Arial"/>
-        </w:rPr>
-        <w:t xml:space="preserve"> The ping command was used to test network connectivity between PC</w:t>
-      </w:r>
-      <w:r>
-        <w:rPr>
-          <w:rFonts w:ascii="Arial" w:hAnsi="Arial" w:cs="Arial"/>
-        </w:rPr>
-        <w:t>3</w:t>
-      </w:r>
-      <w:r>
-        <w:rPr>
-          <w:rFonts w:ascii="Arial" w:hAnsi="Arial" w:cs="Arial"/>
-        </w:rPr>
-        <w:t xml:space="preserve"> and PC</w:t>
-      </w:r>
-      <w:r>
-        <w:rPr>
-          <w:rFonts w:ascii="Arial" w:hAnsi="Arial" w:cs="Arial"/>
-        </w:rPr>
-        <w:t>4</w:t>
-      </w:r>
-      <w:r>
-        <w:rPr>
-          <w:rFonts w:ascii="Arial" w:hAnsi="Arial" w:cs="Arial"/>
-        </w:rPr>
-        <w:t>. Receiving four consecutive "Reply from..." messages confirms that data packets are successfully being exchanged between the two nodes across the switch without any packet loss.</w:t>
-      </w:r>
-    </w:p>
-    <w:p>
-      <w:pPr>
-        <w:pStyle w:val="ListParagraph"/>
-        <w:numPr>
-          <w:ilvl w:val="0"/>
-          <w:numId w:val="36"/>
-        </w:numPr>
-        <w:spacing w:line="480" w:lineRule="auto"/>
-        <w:rPr>
-          <w:rFonts w:ascii="Arial" w:hAnsi="Arial" w:cs="Arial"/>
-          <w:b/>
-          <w:bCs/>
-          <w:sz w:val="28"/>
-          <w:szCs w:val="28"/>
-        </w:rPr>
-      </w:pPr>
-      <w:r>
-        <w:rPr>
-          <w:noProof/>
-        </w:rPr>
-        <w:drawing>
-          <wp:anchor distT="0" distB="0" distL="114300" distR="114300" simplePos="0" relativeHeight="251663360" behindDoc="0" locked="0" layoutInCell="1" allowOverlap="1" wp14:anchorId="20900224" wp14:editId="1579B642">
-            <wp:simplePos x="0" y="0"/>
-            <wp:positionH relativeFrom="margin">
-              <wp:align>center</wp:align>
-            </wp:positionH>
-            <wp:positionV relativeFrom="paragraph">
-              <wp:posOffset>414847</wp:posOffset>
-            </wp:positionV>
-            <wp:extent cx="3895725" cy="990600"/>
-            <wp:effectExtent l="0" t="0" r="9525" b="0"/>
-            <wp:wrapSquare wrapText="bothSides"/>
-            <wp:docPr id="152517063" name="Picture 3"/>
-            <wp:cNvGraphicFramePr>
-              <a:graphicFrameLocks xmlns:a="http://schemas.openxmlformats.org/drawingml/2006/main" noChangeAspect="1"/>
-            </wp:cNvGraphicFramePr>
-            <a:graphic xmlns:a="http://schemas.openxmlformats.org/drawingml/2006/main">
-              <a:graphicData uri="http://schemas.openxmlformats.org/drawingml/2006/picture">
-                <pic:pic xmlns:pic="http://schemas.openxmlformats.org/drawingml/2006/picture">
-                  <pic:nvPicPr>
-                    <pic:cNvPr id="152517063" name="Picture 152517063"/>
-                    <pic:cNvPicPr/>
-                  </pic:nvPicPr>
-                  <pic:blipFill>
-                    <a:blip r:embed="rId13">
-                      <a:extLst>
-                        <a:ext uri="{28A0092B-C50C-407E-A947-70E740481C1C}">
-                          <a14:useLocalDpi xmlns:a14="http://schemas.microsoft.com/office/drawing/2010/main" val="0"/>
-                        </a:ext>
-                      </a:extLst>
-                    </a:blip>
-                    <a:stretch>
-                      <a:fillRect/>
-                    </a:stretch>
-                  </pic:blipFill>
-                  <pic:spPr>
-                    <a:xfrm>
-                      <a:off x="0" y="0"/>
-                      <a:ext cx="3895725" cy="990600"/>
-                    </a:xfrm>
-                    <a:prstGeom prst="rect">
-                      <a:avLst/>
-                    </a:prstGeom>
+                    <a:ln w="38100" cap="sq">
+                      <a:solidFill>
+                        <a:srgbClr val="000000"/>
+                      </a:solidFill>
+                      <a:prstDash val="solid"/>
+                      <a:miter lim="800000"/>
+                    </a:ln>
+                    <a:effectLst>
+                      <a:outerShdw blurRad="50800" dist="38100" dir="2700000" algn="tl" rotWithShape="0">
+                        <a:srgbClr val="000000">
+                          <a:alpha val="43000"/>
+                        </a:srgbClr>
+                      </a:outerShdw>
+                    </a:effectLst>
                   </pic:spPr>
                 </pic:pic>
               </a:graphicData>
@@ -2086,10 +1381,10 @@
           <w:rFonts w:ascii="Arial" w:hAnsi="Arial" w:cs="Arial"/>
           <w:b/>
           <w:bCs/>
-          <w:sz w:val="28"/>
-          <w:szCs w:val="28"/>
+          <w:sz w:val="24"/>
+          <w:szCs w:val="24"/>
         </w:rPr>
-        <w:t>Command: tracert</w:t>
+        <w:t>3. Device-Type Selection Box</w:t>
       </w:r>
     </w:p>
     <w:p>
@@ -2097,6 +1392,8 @@
         <w:spacing w:line="480" w:lineRule="auto"/>
         <w:rPr>
           <w:rFonts w:ascii="Arial" w:hAnsi="Arial" w:cs="Arial"/>
+          <w:b/>
+          <w:bCs/>
         </w:rPr>
       </w:pPr>
     </w:p>
@@ -2105,22 +1402,8 @@
         <w:spacing w:line="480" w:lineRule="auto"/>
         <w:rPr>
           <w:rFonts w:ascii="Arial" w:hAnsi="Arial" w:cs="Arial"/>
-        </w:rPr>
-      </w:pPr>
-    </w:p>
-    <w:p>
-      <w:pPr>
-        <w:spacing w:line="480" w:lineRule="auto"/>
-        <w:rPr>
-          <w:rFonts w:ascii="Arial" w:hAnsi="Arial" w:cs="Arial"/>
-        </w:rPr>
-      </w:pPr>
-    </w:p>
-    <w:p>
-      <w:pPr>
-        <w:spacing w:line="480" w:lineRule="auto"/>
-        <w:rPr>
-          <w:rFonts w:ascii="Arial" w:hAnsi="Arial" w:cs="Arial"/>
+          <w:b/>
+          <w:bCs/>
         </w:rPr>
       </w:pPr>
       <w:r>
@@ -2128,20 +1411,182 @@
           <w:rFonts w:ascii="Arial" w:hAnsi="Arial" w:cs="Arial"/>
           <w:b/>
           <w:bCs/>
-          <w:sz w:val="28"/>
-          <w:szCs w:val="28"/>
         </w:rPr>
-        <w:t>Explanation</w:t>
+        <w:lastRenderedPageBreak/>
+        <w:t>Explanation:</w:t>
       </w:r>
+    </w:p>
+    <w:p>
+      <w:pPr>
+        <w:spacing w:line="480" w:lineRule="auto"/>
+        <w:rPr>
+          <w:rFonts w:ascii="Arial" w:hAnsi="Arial" w:cs="Arial"/>
+        </w:rPr>
+      </w:pPr>
+      <w:r>
+        <w:rPr>
+          <w:rFonts w:ascii="Arial" w:hAnsi="Arial" w:cs="Arial"/>
+        </w:rPr>
+        <w:t>Located in the bottom-left corner, the Device-Type Selection Box is the component library used to build networks. The top row categorizes hardware into broad groups such as Network Devices (Routers, Switches, Hubs), End Devices (PCs, Laptops, Servers), and Connections (represented by the orange lightning bolt). Clicking a top-category reveals specific hardware models and cable types in the sub-menu below, which can be dragged and dropped directly onto the workspace.</w:t>
+      </w:r>
+    </w:p>
+    <w:p>
+      <w:pPr>
+        <w:spacing w:line="480" w:lineRule="auto"/>
+        <w:rPr>
+          <w:rFonts w:ascii="Arial" w:hAnsi="Arial" w:cs="Arial"/>
+          <w:b/>
+          <w:bCs/>
+        </w:rPr>
+      </w:pPr>
       <w:r>
         <w:rPr>
           <w:rFonts w:ascii="Arial" w:hAnsi="Arial" w:cs="Arial"/>
           <w:b/>
           <w:bCs/>
-          <w:sz w:val="28"/>
-          <w:szCs w:val="28"/>
         </w:rPr>
-        <w:t>:</w:t>
+        <w:t>4. Realtime vs. Simulation Modes</w:t>
+      </w:r>
+    </w:p>
+    <w:p>
+      <w:pPr>
+        <w:spacing w:line="480" w:lineRule="auto"/>
+        <w:rPr>
+          <w:rFonts w:ascii="Arial" w:hAnsi="Arial" w:cs="Arial"/>
+          <w:b/>
+          <w:bCs/>
+        </w:rPr>
+      </w:pPr>
+      <w:r>
+        <w:rPr>
+          <w:rFonts w:ascii="Arial" w:hAnsi="Arial" w:cs="Arial"/>
+          <w:b/>
+          <w:bCs/>
+        </w:rPr>
+        <w:drawing>
+          <wp:anchor distT="0" distB="0" distL="114300" distR="114300" simplePos="0" relativeHeight="251660288" behindDoc="0" locked="0" layoutInCell="1" allowOverlap="1" wp14:anchorId="3F73255B" wp14:editId="1A7FBDF9">
+            <wp:simplePos x="0" y="0"/>
+            <wp:positionH relativeFrom="margin">
+              <wp:align>center</wp:align>
+            </wp:positionH>
+            <wp:positionV relativeFrom="paragraph">
+              <wp:posOffset>87638</wp:posOffset>
+            </wp:positionV>
+            <wp:extent cx="5324475" cy="1080135"/>
+            <wp:effectExtent l="76200" t="76200" r="142875" b="139065"/>
+            <wp:wrapSquare wrapText="bothSides"/>
+            <wp:docPr id="249474212" name="Picture 1"/>
+            <wp:cNvGraphicFramePr>
+              <a:graphicFrameLocks xmlns:a="http://schemas.openxmlformats.org/drawingml/2006/main" noChangeAspect="1"/>
+            </wp:cNvGraphicFramePr>
+            <a:graphic xmlns:a="http://schemas.openxmlformats.org/drawingml/2006/main">
+              <a:graphicData uri="http://schemas.openxmlformats.org/drawingml/2006/picture">
+                <pic:pic xmlns:pic="http://schemas.openxmlformats.org/drawingml/2006/picture">
+                  <pic:nvPicPr>
+                    <pic:cNvPr id="249474212" name=""/>
+                    <pic:cNvPicPr/>
+                  </pic:nvPicPr>
+                  <pic:blipFill rotWithShape="1">
+                    <a:blip r:embed="rId11">
+                      <a:extLst>
+                        <a:ext uri="{28A0092B-C50C-407E-A947-70E740481C1C}">
+                          <a14:useLocalDpi xmlns:a14="http://schemas.microsoft.com/office/drawing/2010/main" val="0"/>
+                        </a:ext>
+                      </a:extLst>
+                    </a:blip>
+                    <a:srcRect b="15332"/>
+                    <a:stretch>
+                      <a:fillRect/>
+                    </a:stretch>
+                  </pic:blipFill>
+                  <pic:spPr bwMode="auto">
+                    <a:xfrm>
+                      <a:off x="0" y="0"/>
+                      <a:ext cx="5324475" cy="1080135"/>
+                    </a:xfrm>
+                    <a:prstGeom prst="rect">
+                      <a:avLst/>
+                    </a:prstGeom>
+                    <a:ln w="38100" cap="sq">
+                      <a:solidFill>
+                        <a:srgbClr val="000000"/>
+                      </a:solidFill>
+                      <a:prstDash val="solid"/>
+                      <a:miter lim="800000"/>
+                    </a:ln>
+                    <a:effectLst>
+                      <a:outerShdw blurRad="50800" dist="38100" dir="2700000" algn="tl" rotWithShape="0">
+                        <a:srgbClr val="000000">
+                          <a:alpha val="43000"/>
+                        </a:srgbClr>
+                      </a:outerShdw>
+                    </a:effectLst>
+                    <a:extLst>
+                      <a:ext uri="{53640926-AAD7-44D8-BBD7-CCE9431645EC}">
+                        <a14:shadowObscured xmlns:a14="http://schemas.microsoft.com/office/drawing/2010/main"/>
+                      </a:ext>
+                    </a:extLst>
+                  </pic:spPr>
+                </pic:pic>
+              </a:graphicData>
+            </a:graphic>
+            <wp14:sizeRelV relativeFrom="margin">
+              <wp14:pctHeight>0</wp14:pctHeight>
+            </wp14:sizeRelV>
+          </wp:anchor>
+        </w:drawing>
+      </w:r>
+    </w:p>
+    <w:p>
+      <w:pPr>
+        <w:spacing w:line="480" w:lineRule="auto"/>
+        <w:rPr>
+          <w:rFonts w:ascii="Arial" w:hAnsi="Arial" w:cs="Arial"/>
+          <w:b/>
+          <w:bCs/>
+        </w:rPr>
+      </w:pPr>
+    </w:p>
+    <w:p>
+      <w:pPr>
+        <w:spacing w:line="480" w:lineRule="auto"/>
+        <w:rPr>
+          <w:rFonts w:ascii="Arial" w:hAnsi="Arial" w:cs="Arial"/>
+          <w:b/>
+          <w:bCs/>
+        </w:rPr>
+      </w:pPr>
+    </w:p>
+    <w:p>
+      <w:pPr>
+        <w:spacing w:line="480" w:lineRule="auto"/>
+        <w:rPr>
+          <w:rFonts w:ascii="Arial" w:hAnsi="Arial" w:cs="Arial"/>
+          <w:b/>
+          <w:bCs/>
+        </w:rPr>
+      </w:pPr>
+    </w:p>
+    <w:p>
+      <w:pPr>
+        <w:spacing w:line="480" w:lineRule="auto"/>
+        <w:rPr>
+          <w:rFonts w:ascii="Arial" w:hAnsi="Arial" w:cs="Arial"/>
+        </w:rPr>
+      </w:pPr>
+      <w:r>
+        <w:rPr>
+          <w:rFonts w:ascii="Arial" w:hAnsi="Arial" w:cs="Arial"/>
+          <w:b/>
+          <w:bCs/>
+        </w:rPr>
+        <w:t>Explanation:</w:t>
+      </w:r>
+      <w:r>
+        <w:rPr>
+          <w:rFonts w:ascii="Arial" w:hAnsi="Arial" w:cs="Arial"/>
+        </w:rPr>
+        <w:t xml:space="preserve"> Packet Tracer operates in two distinct time modes to aid in network configuration and troubleshooting. </w:t>
       </w:r>
       <w:r>
         <w:rPr>
@@ -2149,224 +1594,13 @@
           <w:b/>
           <w:bCs/>
         </w:rPr>
-        <w:t xml:space="preserve"> </w:t>
+        <w:t>Realtime mode</w:t>
       </w:r>
       <w:r>
         <w:rPr>
           <w:rFonts w:ascii="Arial" w:hAnsi="Arial" w:cs="Arial"/>
         </w:rPr>
-        <w:t>The tracert command was run to display the specific path the packets took to reach the destination IP address. The output displays only a single hop because both PCs are directly connected to the same local switch, meaning the data does not need to traverse multiple routers to reach its target.</w:t>
-      </w:r>
-    </w:p>
-    <w:p>
-      <w:pPr>
-        <w:pStyle w:val="ListParagraph"/>
-        <w:numPr>
-          <w:ilvl w:val="0"/>
-          <w:numId w:val="36"/>
-        </w:numPr>
-        <w:spacing w:line="480" w:lineRule="auto"/>
-        <w:rPr>
-          <w:rFonts w:ascii="Arial" w:hAnsi="Arial" w:cs="Arial"/>
-          <w:b/>
-          <w:bCs/>
-          <w:sz w:val="28"/>
-          <w:szCs w:val="28"/>
-        </w:rPr>
-      </w:pPr>
-      <w:r>
-        <w:rPr>
-          <w:rFonts w:ascii="Arial" w:hAnsi="Arial" w:cs="Arial"/>
-          <w:noProof/>
-        </w:rPr>
-        <w:drawing>
-          <wp:anchor distT="0" distB="0" distL="114300" distR="114300" simplePos="0" relativeHeight="251664384" behindDoc="0" locked="0" layoutInCell="1" allowOverlap="1" wp14:anchorId="65982116" wp14:editId="5DE0144E">
-            <wp:simplePos x="0" y="0"/>
-            <wp:positionH relativeFrom="margin">
-              <wp:align>center</wp:align>
-            </wp:positionH>
-            <wp:positionV relativeFrom="paragraph">
-              <wp:posOffset>509270</wp:posOffset>
-            </wp:positionV>
-            <wp:extent cx="4095750" cy="457200"/>
-            <wp:effectExtent l="0" t="0" r="0" b="0"/>
-            <wp:wrapSquare wrapText="bothSides"/>
-            <wp:docPr id="582536506" name="Picture 4"/>
-            <wp:cNvGraphicFramePr>
-              <a:graphicFrameLocks xmlns:a="http://schemas.openxmlformats.org/drawingml/2006/main" noChangeAspect="1"/>
-            </wp:cNvGraphicFramePr>
-            <a:graphic xmlns:a="http://schemas.openxmlformats.org/drawingml/2006/main">
-              <a:graphicData uri="http://schemas.openxmlformats.org/drawingml/2006/picture">
-                <pic:pic xmlns:pic="http://schemas.openxmlformats.org/drawingml/2006/picture">
-                  <pic:nvPicPr>
-                    <pic:cNvPr id="582536506" name="Picture 582536506"/>
-                    <pic:cNvPicPr/>
-                  </pic:nvPicPr>
-                  <pic:blipFill>
-                    <a:blip r:embed="rId14">
-                      <a:extLst>
-                        <a:ext uri="{28A0092B-C50C-407E-A947-70E740481C1C}">
-                          <a14:useLocalDpi xmlns:a14="http://schemas.microsoft.com/office/drawing/2010/main" val="0"/>
-                        </a:ext>
-                      </a:extLst>
-                    </a:blip>
-                    <a:stretch>
-                      <a:fillRect/>
-                    </a:stretch>
-                  </pic:blipFill>
-                  <pic:spPr>
-                    <a:xfrm>
-                      <a:off x="0" y="0"/>
-                      <a:ext cx="4095750" cy="457200"/>
-                    </a:xfrm>
-                    <a:prstGeom prst="rect">
-                      <a:avLst/>
-                    </a:prstGeom>
-                  </pic:spPr>
-                </pic:pic>
-              </a:graphicData>
-            </a:graphic>
-          </wp:anchor>
-        </w:drawing>
-      </w:r>
-      <w:r>
-        <w:rPr>
-          <w:rFonts w:ascii="Arial" w:hAnsi="Arial" w:cs="Arial"/>
-          <w:b/>
-          <w:bCs/>
-          <w:sz w:val="28"/>
-          <w:szCs w:val="28"/>
-        </w:rPr>
-        <w:t>Command: arp -a, netstat</w:t>
-      </w:r>
-    </w:p>
-    <w:p>
-      <w:pPr>
-        <w:spacing w:line="480" w:lineRule="auto"/>
-        <w:rPr>
-          <w:rFonts w:ascii="Arial" w:hAnsi="Arial" w:cs="Arial"/>
-        </w:rPr>
-      </w:pPr>
-    </w:p>
-    <w:p>
-      <w:pPr>
-        <w:spacing w:line="480" w:lineRule="auto"/>
-        <w:rPr>
-          <w:rFonts w:ascii="Arial" w:hAnsi="Arial" w:cs="Arial"/>
-        </w:rPr>
-      </w:pPr>
-      <w:r>
-        <w:rPr>
-          <w:rFonts w:ascii="Arial" w:hAnsi="Arial" w:cs="Arial"/>
-          <w:noProof/>
-        </w:rPr>
-        <w:drawing>
-          <wp:anchor distT="0" distB="0" distL="114300" distR="114300" simplePos="0" relativeHeight="251665408" behindDoc="0" locked="0" layoutInCell="1" allowOverlap="1" wp14:anchorId="17E55ACA" wp14:editId="236B082F">
-            <wp:simplePos x="0" y="0"/>
-            <wp:positionH relativeFrom="margin">
-              <wp:align>center</wp:align>
-            </wp:positionH>
-            <wp:positionV relativeFrom="paragraph">
-              <wp:posOffset>237643</wp:posOffset>
-            </wp:positionV>
-            <wp:extent cx="4457700" cy="819150"/>
-            <wp:effectExtent l="0" t="0" r="0" b="0"/>
-            <wp:wrapSquare wrapText="bothSides"/>
-            <wp:docPr id="2060988646" name="Picture 5"/>
-            <wp:cNvGraphicFramePr>
-              <a:graphicFrameLocks xmlns:a="http://schemas.openxmlformats.org/drawingml/2006/main" noChangeAspect="1"/>
-            </wp:cNvGraphicFramePr>
-            <a:graphic xmlns:a="http://schemas.openxmlformats.org/drawingml/2006/main">
-              <a:graphicData uri="http://schemas.openxmlformats.org/drawingml/2006/picture">
-                <pic:pic xmlns:pic="http://schemas.openxmlformats.org/drawingml/2006/picture">
-                  <pic:nvPicPr>
-                    <pic:cNvPr id="2060988646" name="Picture 2060988646"/>
-                    <pic:cNvPicPr/>
-                  </pic:nvPicPr>
-                  <pic:blipFill>
-                    <a:blip r:embed="rId15">
-                      <a:extLst>
-                        <a:ext uri="{28A0092B-C50C-407E-A947-70E740481C1C}">
-                          <a14:useLocalDpi xmlns:a14="http://schemas.microsoft.com/office/drawing/2010/main" val="0"/>
-                        </a:ext>
-                      </a:extLst>
-                    </a:blip>
-                    <a:stretch>
-                      <a:fillRect/>
-                    </a:stretch>
-                  </pic:blipFill>
-                  <pic:spPr>
-                    <a:xfrm>
-                      <a:off x="0" y="0"/>
-                      <a:ext cx="4457700" cy="819150"/>
-                    </a:xfrm>
-                    <a:prstGeom prst="rect">
-                      <a:avLst/>
-                    </a:prstGeom>
-                  </pic:spPr>
-                </pic:pic>
-              </a:graphicData>
-            </a:graphic>
-          </wp:anchor>
-        </w:drawing>
-      </w:r>
-    </w:p>
-    <w:p>
-      <w:pPr>
-        <w:spacing w:line="480" w:lineRule="auto"/>
-        <w:rPr>
-          <w:rFonts w:ascii="Arial" w:hAnsi="Arial" w:cs="Arial"/>
-          <w:b/>
-          <w:bCs/>
-        </w:rPr>
-      </w:pPr>
-    </w:p>
-    <w:p>
-      <w:pPr>
-        <w:spacing w:line="480" w:lineRule="auto"/>
-        <w:rPr>
-          <w:rFonts w:ascii="Arial" w:hAnsi="Arial" w:cs="Arial"/>
-          <w:b/>
-          <w:bCs/>
-        </w:rPr>
-      </w:pPr>
-    </w:p>
-    <w:p>
-      <w:pPr>
-        <w:spacing w:line="480" w:lineRule="auto"/>
-        <w:rPr>
-          <w:rFonts w:ascii="Arial" w:hAnsi="Arial" w:cs="Arial"/>
-          <w:b/>
-          <w:bCs/>
-        </w:rPr>
-      </w:pPr>
-    </w:p>
-    <w:p>
-      <w:pPr>
-        <w:spacing w:line="480" w:lineRule="auto"/>
-        <w:rPr>
-          <w:rFonts w:ascii="Arial" w:hAnsi="Arial" w:cs="Arial"/>
-        </w:rPr>
-      </w:pPr>
-      <w:r>
-        <w:rPr>
-          <w:rFonts w:ascii="Arial" w:hAnsi="Arial" w:cs="Arial"/>
-          <w:b/>
-          <w:bCs/>
-          <w:sz w:val="28"/>
-          <w:szCs w:val="28"/>
-        </w:rPr>
-        <w:t>Explanation</w:t>
-      </w:r>
-      <w:r>
-        <w:rPr>
-          <w:rFonts w:ascii="Arial" w:hAnsi="Arial" w:cs="Arial"/>
-          <w:b/>
-          <w:bCs/>
-          <w:sz w:val="28"/>
-          <w:szCs w:val="28"/>
-        </w:rPr>
-        <w:t>:</w:t>
+        <w:t xml:space="preserve"> is for observing immediate network behavior, running continuously like a live network. </w:t>
       </w:r>
       <w:r>
         <w:rPr>
@@ -2374,802 +1608,14 @@
           <w:b/>
           <w:bCs/>
         </w:rPr>
-        <w:t xml:space="preserve"> </w:t>
+        <w:t>Simulation mode</w:t>
       </w:r>
       <w:r>
         <w:rPr>
           <w:rFonts w:ascii="Arial" w:hAnsi="Arial" w:cs="Arial"/>
         </w:rPr>
-        <w:t>The arp -a command successfully displayed the device's Address Resolution Protocol (ARP) table, which maps the known logical IP addresses to their corresponding physical MAC addresses. Additionally, the netstat command was executed to display active network connections and statistics for the system.</w:t>
+        <w:t xml:space="preserve"> is used for step-by-step packet inspection to troubleshoot how data moves through the network, allowing users to pause time and view the exact path and details of individual data packets.</w:t>
       </w:r>
-    </w:p>
-    <w:p>
-      <w:pPr>
-        <w:spacing w:line="480" w:lineRule="auto"/>
-        <w:jc w:val="center"/>
-        <w:rPr>
-          <w:rFonts w:ascii="Arial" w:hAnsi="Arial" w:cs="Arial"/>
-          <w:b/>
-          <w:bCs/>
-          <w:color w:val="1F3864" w:themeColor="accent1" w:themeShade="80"/>
-          <w:sz w:val="32"/>
-          <w:szCs w:val="32"/>
-        </w:rPr>
-      </w:pPr>
-      <w:r>
-        <w:rPr>
-          <w:rFonts w:ascii="Arial" w:hAnsi="Arial" w:cs="Arial"/>
-          <w:b/>
-          <w:bCs/>
-          <w:color w:val="1F3864" w:themeColor="accent1" w:themeShade="80"/>
-          <w:sz w:val="32"/>
-          <w:szCs w:val="32"/>
-        </w:rPr>
-        <w:t>CLI Testing</w:t>
-      </w:r>
-      <w:r>
-        <w:rPr>
-          <w:rFonts w:ascii="Arial" w:hAnsi="Arial" w:cs="Arial"/>
-          <w:b/>
-          <w:bCs/>
-          <w:color w:val="1F3864" w:themeColor="accent1" w:themeShade="80"/>
-          <w:sz w:val="32"/>
-          <w:szCs w:val="32"/>
-        </w:rPr>
-        <w:t xml:space="preserve"> – PC </w:t>
-      </w:r>
-      <w:r>
-        <w:rPr>
-          <w:rFonts w:ascii="Arial" w:hAnsi="Arial" w:cs="Arial"/>
-          <w:b/>
-          <w:bCs/>
-          <w:color w:val="1F3864" w:themeColor="accent1" w:themeShade="80"/>
-          <w:sz w:val="32"/>
-          <w:szCs w:val="32"/>
-        </w:rPr>
-        <w:t>4</w:t>
-      </w:r>
-    </w:p>
-    <w:p>
-      <w:pPr>
-        <w:pStyle w:val="ListParagraph"/>
-        <w:numPr>
-          <w:ilvl w:val="0"/>
-          <w:numId w:val="36"/>
-        </w:numPr>
-        <w:spacing w:line="480" w:lineRule="auto"/>
-        <w:rPr>
-          <w:rFonts w:ascii="Arial" w:hAnsi="Arial" w:cs="Arial"/>
-          <w:b/>
-          <w:bCs/>
-          <w:sz w:val="28"/>
-          <w:szCs w:val="28"/>
-        </w:rPr>
-      </w:pPr>
-      <w:r>
-        <w:rPr>
-          <w:rFonts w:ascii="Arial" w:hAnsi="Arial" w:cs="Arial"/>
-          <w:b/>
-          <w:bCs/>
-          <w:sz w:val="28"/>
-          <w:szCs w:val="28"/>
-        </w:rPr>
-        <w:t>Command: ipconfig</w:t>
-      </w:r>
-    </w:p>
-    <w:p>
-      <w:pPr>
-        <w:spacing w:line="480" w:lineRule="auto"/>
-        <w:rPr>
-          <w:rFonts w:ascii="Arial" w:hAnsi="Arial" w:cs="Arial"/>
-          <w:b/>
-          <w:bCs/>
-          <w:color w:val="1F3864" w:themeColor="accent1" w:themeShade="80"/>
-          <w:sz w:val="32"/>
-          <w:szCs w:val="32"/>
-        </w:rPr>
-      </w:pPr>
-      <w:r>
-        <w:rPr>
-          <w:rFonts w:ascii="Arial" w:hAnsi="Arial" w:cs="Arial"/>
-          <w:b/>
-          <w:bCs/>
-          <w:noProof/>
-          <w:color w:val="4472C4" w:themeColor="accent1"/>
-          <w:sz w:val="32"/>
-          <w:szCs w:val="32"/>
-        </w:rPr>
-        <w:lastRenderedPageBreak/>
-        <w:drawing>
-          <wp:anchor distT="0" distB="0" distL="114300" distR="114300" simplePos="0" relativeHeight="251661312" behindDoc="0" locked="0" layoutInCell="1" allowOverlap="1" wp14:anchorId="3BB977F4" wp14:editId="62B0963D">
-            <wp:simplePos x="0" y="0"/>
-            <wp:positionH relativeFrom="margin">
-              <wp:posOffset>1266869</wp:posOffset>
-            </wp:positionH>
-            <wp:positionV relativeFrom="paragraph">
-              <wp:posOffset>18415</wp:posOffset>
-            </wp:positionV>
-            <wp:extent cx="4648200" cy="2800350"/>
-            <wp:effectExtent l="0" t="0" r="0" b="0"/>
-            <wp:wrapSquare wrapText="bothSides"/>
-            <wp:docPr id="506607482" name="Picture 6"/>
-            <wp:cNvGraphicFramePr>
-              <a:graphicFrameLocks xmlns:a="http://schemas.openxmlformats.org/drawingml/2006/main" noChangeAspect="1"/>
-            </wp:cNvGraphicFramePr>
-            <a:graphic xmlns:a="http://schemas.openxmlformats.org/drawingml/2006/main">
-              <a:graphicData uri="http://schemas.openxmlformats.org/drawingml/2006/picture">
-                <pic:pic xmlns:pic="http://schemas.openxmlformats.org/drawingml/2006/picture">
-                  <pic:nvPicPr>
-                    <pic:cNvPr id="506607482" name="Picture 506607482"/>
-                    <pic:cNvPicPr/>
-                  </pic:nvPicPr>
-                  <pic:blipFill>
-                    <a:blip r:embed="rId16">
-                      <a:extLst>
-                        <a:ext uri="{28A0092B-C50C-407E-A947-70E740481C1C}">
-                          <a14:useLocalDpi xmlns:a14="http://schemas.microsoft.com/office/drawing/2010/main" val="0"/>
-                        </a:ext>
-                      </a:extLst>
-                    </a:blip>
-                    <a:stretch>
-                      <a:fillRect/>
-                    </a:stretch>
-                  </pic:blipFill>
-                  <pic:spPr>
-                    <a:xfrm>
-                      <a:off x="0" y="0"/>
-                      <a:ext cx="4648200" cy="2800350"/>
-                    </a:xfrm>
-                    <a:prstGeom prst="rect">
-                      <a:avLst/>
-                    </a:prstGeom>
-                  </pic:spPr>
-                </pic:pic>
-              </a:graphicData>
-            </a:graphic>
-          </wp:anchor>
-        </w:drawing>
-      </w:r>
-    </w:p>
-    <w:p>
-      <w:pPr>
-        <w:spacing w:line="480" w:lineRule="auto"/>
-        <w:rPr>
-          <w:rFonts w:ascii="Arial" w:hAnsi="Arial" w:cs="Arial"/>
-          <w:b/>
-          <w:bCs/>
-        </w:rPr>
-      </w:pPr>
-    </w:p>
-    <w:p>
-      <w:pPr>
-        <w:spacing w:line="480" w:lineRule="auto"/>
-        <w:rPr>
-          <w:rFonts w:ascii="Arial" w:hAnsi="Arial" w:cs="Arial"/>
-          <w:b/>
-          <w:bCs/>
-        </w:rPr>
-      </w:pPr>
-    </w:p>
-    <w:p>
-      <w:pPr>
-        <w:spacing w:line="480" w:lineRule="auto"/>
-        <w:rPr>
-          <w:rFonts w:ascii="Arial" w:hAnsi="Arial" w:cs="Arial"/>
-          <w:b/>
-          <w:bCs/>
-        </w:rPr>
-      </w:pPr>
-    </w:p>
-    <w:p>
-      <w:pPr>
-        <w:spacing w:line="480" w:lineRule="auto"/>
-        <w:rPr>
-          <w:rFonts w:ascii="Arial" w:hAnsi="Arial" w:cs="Arial"/>
-          <w:b/>
-          <w:bCs/>
-        </w:rPr>
-      </w:pPr>
-    </w:p>
-    <w:p>
-      <w:pPr>
-        <w:spacing w:line="480" w:lineRule="auto"/>
-        <w:rPr>
-          <w:rFonts w:ascii="Arial" w:hAnsi="Arial" w:cs="Arial"/>
-          <w:b/>
-          <w:bCs/>
-        </w:rPr>
-      </w:pPr>
-    </w:p>
-    <w:p>
-      <w:pPr>
-        <w:spacing w:line="480" w:lineRule="auto"/>
-        <w:rPr>
-          <w:rFonts w:ascii="Arial" w:hAnsi="Arial" w:cs="Arial"/>
-          <w:b/>
-          <w:bCs/>
-        </w:rPr>
-      </w:pPr>
-    </w:p>
-    <w:p>
-      <w:pPr>
-        <w:spacing w:line="480" w:lineRule="auto"/>
-        <w:rPr>
-          <w:rFonts w:ascii="Arial" w:hAnsi="Arial" w:cs="Arial"/>
-          <w:b/>
-          <w:bCs/>
-        </w:rPr>
-      </w:pPr>
-    </w:p>
-    <w:p>
-      <w:pPr>
-        <w:spacing w:line="480" w:lineRule="auto"/>
-        <w:rPr>
-          <w:rFonts w:ascii="Arial" w:hAnsi="Arial" w:cs="Arial"/>
-        </w:rPr>
-      </w:pPr>
-      <w:r>
-        <w:rPr>
-          <w:rFonts w:ascii="Arial" w:hAnsi="Arial" w:cs="Arial"/>
-          <w:b/>
-          <w:bCs/>
-          <w:sz w:val="28"/>
-          <w:szCs w:val="28"/>
-        </w:rPr>
-        <w:t>Explanation:</w:t>
-      </w:r>
-      <w:r>
-        <w:rPr>
-          <w:rFonts w:ascii="Arial" w:hAnsi="Arial" w:cs="Arial"/>
-        </w:rPr>
-        <w:t xml:space="preserve"> The ipconfig command was executed in the Command Line Interface (CLI) to view the current IP configuration of the device. The output successfully verified that the static IP address and subnet mask entered in the graphical interface were properly applied to the PC's network adapter.</w:t>
-      </w:r>
-    </w:p>
-    <w:p>
-      <w:pPr>
-        <w:pStyle w:val="ListParagraph"/>
-        <w:numPr>
-          <w:ilvl w:val="0"/>
-          <w:numId w:val="36"/>
-        </w:numPr>
-        <w:spacing w:line="480" w:lineRule="auto"/>
-        <w:rPr>
-          <w:rFonts w:ascii="Arial" w:hAnsi="Arial" w:cs="Arial"/>
-          <w:b/>
-          <w:bCs/>
-          <w:sz w:val="28"/>
-          <w:szCs w:val="28"/>
-        </w:rPr>
-      </w:pPr>
-      <w:r>
-        <w:rPr>
-          <w:rFonts w:ascii="Arial" w:hAnsi="Arial" w:cs="Arial"/>
-          <w:noProof/>
-        </w:rPr>
-        <w:drawing>
-          <wp:anchor distT="0" distB="0" distL="114300" distR="114300" simplePos="0" relativeHeight="251666432" behindDoc="0" locked="0" layoutInCell="1" allowOverlap="1" wp14:anchorId="4518F01E" wp14:editId="5B97C1B4">
-            <wp:simplePos x="0" y="0"/>
-            <wp:positionH relativeFrom="margin">
-              <wp:align>center</wp:align>
-            </wp:positionH>
-            <wp:positionV relativeFrom="paragraph">
-              <wp:posOffset>442301</wp:posOffset>
-            </wp:positionV>
-            <wp:extent cx="4352925" cy="1743075"/>
-            <wp:effectExtent l="0" t="0" r="9525" b="9525"/>
-            <wp:wrapSquare wrapText="bothSides"/>
-            <wp:docPr id="1289580845" name="Picture 7"/>
-            <wp:cNvGraphicFramePr>
-              <a:graphicFrameLocks xmlns:a="http://schemas.openxmlformats.org/drawingml/2006/main" noChangeAspect="1"/>
-            </wp:cNvGraphicFramePr>
-            <a:graphic xmlns:a="http://schemas.openxmlformats.org/drawingml/2006/main">
-              <a:graphicData uri="http://schemas.openxmlformats.org/drawingml/2006/picture">
-                <pic:pic xmlns:pic="http://schemas.openxmlformats.org/drawingml/2006/picture">
-                  <pic:nvPicPr>
-                    <pic:cNvPr id="1289580845" name="Picture 1289580845"/>
-                    <pic:cNvPicPr/>
-                  </pic:nvPicPr>
-                  <pic:blipFill>
-                    <a:blip r:embed="rId17">
-                      <a:extLst>
-                        <a:ext uri="{28A0092B-C50C-407E-A947-70E740481C1C}">
-                          <a14:useLocalDpi xmlns:a14="http://schemas.microsoft.com/office/drawing/2010/main" val="0"/>
-                        </a:ext>
-                      </a:extLst>
-                    </a:blip>
-                    <a:stretch>
-                      <a:fillRect/>
-                    </a:stretch>
-                  </pic:blipFill>
-                  <pic:spPr>
-                    <a:xfrm>
-                      <a:off x="0" y="0"/>
-                      <a:ext cx="4352925" cy="1743075"/>
-                    </a:xfrm>
-                    <a:prstGeom prst="rect">
-                      <a:avLst/>
-                    </a:prstGeom>
-                  </pic:spPr>
-                </pic:pic>
-              </a:graphicData>
-            </a:graphic>
-          </wp:anchor>
-        </w:drawing>
-      </w:r>
-      <w:r>
-        <w:rPr>
-          <w:rFonts w:ascii="Arial" w:hAnsi="Arial" w:cs="Arial"/>
-          <w:b/>
-          <w:bCs/>
-          <w:sz w:val="28"/>
-          <w:szCs w:val="28"/>
-        </w:rPr>
-        <w:t>Command: ping</w:t>
-      </w:r>
-    </w:p>
-    <w:p>
-      <w:pPr>
-        <w:spacing w:line="480" w:lineRule="auto"/>
-        <w:rPr>
-          <w:rFonts w:ascii="Arial" w:hAnsi="Arial" w:cs="Arial"/>
-        </w:rPr>
-      </w:pPr>
-    </w:p>
-    <w:p>
-      <w:pPr>
-        <w:spacing w:line="480" w:lineRule="auto"/>
-        <w:rPr>
-          <w:rFonts w:ascii="Arial" w:hAnsi="Arial" w:cs="Arial"/>
-        </w:rPr>
-      </w:pPr>
-    </w:p>
-    <w:p>
-      <w:pPr>
-        <w:spacing w:line="480" w:lineRule="auto"/>
-        <w:rPr>
-          <w:rFonts w:ascii="Arial" w:hAnsi="Arial" w:cs="Arial"/>
-        </w:rPr>
-      </w:pPr>
-    </w:p>
-    <w:p>
-      <w:pPr>
-        <w:spacing w:line="480" w:lineRule="auto"/>
-        <w:rPr>
-          <w:rFonts w:ascii="Arial" w:hAnsi="Arial" w:cs="Arial"/>
-        </w:rPr>
-      </w:pPr>
-    </w:p>
-    <w:p>
-      <w:pPr>
-        <w:spacing w:line="480" w:lineRule="auto"/>
-        <w:rPr>
-          <w:rFonts w:ascii="Arial" w:hAnsi="Arial" w:cs="Arial"/>
-        </w:rPr>
-      </w:pPr>
-    </w:p>
-    <w:p>
-      <w:pPr>
-        <w:spacing w:line="480" w:lineRule="auto"/>
-        <w:rPr>
-          <w:rFonts w:ascii="Arial" w:hAnsi="Arial" w:cs="Arial"/>
-        </w:rPr>
-      </w:pPr>
-      <w:r>
-        <w:rPr>
-          <w:rFonts w:ascii="Arial" w:hAnsi="Arial" w:cs="Arial"/>
-          <w:b/>
-          <w:bCs/>
-          <w:sz w:val="28"/>
-          <w:szCs w:val="28"/>
-        </w:rPr>
-        <w:t>Explanation</w:t>
-      </w:r>
-      <w:r>
-        <w:rPr>
-          <w:rFonts w:ascii="Arial" w:hAnsi="Arial" w:cs="Arial"/>
-          <w:b/>
-          <w:bCs/>
-        </w:rPr>
-        <w:t xml:space="preserve">: </w:t>
-      </w:r>
-      <w:r>
-        <w:rPr>
-          <w:rFonts w:ascii="Arial" w:hAnsi="Arial" w:cs="Arial"/>
-        </w:rPr>
-        <w:t>The ping command was used to test network connectivity between PC</w:t>
-      </w:r>
-      <w:r>
-        <w:rPr>
-          <w:rFonts w:ascii="Arial" w:hAnsi="Arial" w:cs="Arial"/>
-        </w:rPr>
-        <w:t>3</w:t>
-      </w:r>
-      <w:r>
-        <w:rPr>
-          <w:rFonts w:ascii="Arial" w:hAnsi="Arial" w:cs="Arial"/>
-        </w:rPr>
-        <w:t xml:space="preserve"> and PC</w:t>
-      </w:r>
-      <w:r>
-        <w:rPr>
-          <w:rFonts w:ascii="Arial" w:hAnsi="Arial" w:cs="Arial"/>
-        </w:rPr>
-        <w:t>4</w:t>
-      </w:r>
-      <w:r>
-        <w:rPr>
-          <w:rFonts w:ascii="Arial" w:hAnsi="Arial" w:cs="Arial"/>
-        </w:rPr>
-        <w:t>. Receiving four consecutive "Reply from..." messages confirms that data packets are successfully being exchanged between the two nodes across the switch without any packet loss.</w:t>
-      </w:r>
-    </w:p>
-    <w:p>
-      <w:pPr>
-        <w:pStyle w:val="ListParagraph"/>
-        <w:numPr>
-          <w:ilvl w:val="0"/>
-          <w:numId w:val="36"/>
-        </w:numPr>
-        <w:spacing w:line="480" w:lineRule="auto"/>
-        <w:rPr>
-          <w:rFonts w:ascii="Arial" w:hAnsi="Arial" w:cs="Arial"/>
-          <w:b/>
-          <w:bCs/>
-          <w:sz w:val="28"/>
-          <w:szCs w:val="28"/>
-        </w:rPr>
-      </w:pPr>
-      <w:r>
-        <w:rPr>
-          <w:rFonts w:ascii="Arial" w:hAnsi="Arial" w:cs="Arial"/>
-          <w:b/>
-          <w:bCs/>
-          <w:sz w:val="28"/>
-          <w:szCs w:val="28"/>
-        </w:rPr>
-        <w:t>Command: tracert</w:t>
-      </w:r>
-    </w:p>
-    <w:p>
-      <w:pPr>
-        <w:spacing w:line="480" w:lineRule="auto"/>
-        <w:rPr>
-          <w:rFonts w:ascii="Arial" w:hAnsi="Arial" w:cs="Arial"/>
-        </w:rPr>
-      </w:pPr>
-      <w:r>
-        <w:rPr>
-          <w:rFonts w:ascii="Arial" w:hAnsi="Arial" w:cs="Arial"/>
-          <w:noProof/>
-        </w:rPr>
-        <w:drawing>
-          <wp:anchor distT="0" distB="0" distL="114300" distR="114300" simplePos="0" relativeHeight="251667456" behindDoc="0" locked="0" layoutInCell="1" allowOverlap="1" wp14:anchorId="189251A7" wp14:editId="78204994">
-            <wp:simplePos x="0" y="0"/>
-            <wp:positionH relativeFrom="margin">
-              <wp:align>center</wp:align>
-            </wp:positionH>
-            <wp:positionV relativeFrom="paragraph">
-              <wp:posOffset>-224222</wp:posOffset>
-            </wp:positionV>
-            <wp:extent cx="4191000" cy="1019175"/>
-            <wp:effectExtent l="0" t="0" r="0" b="9525"/>
-            <wp:wrapSquare wrapText="bothSides"/>
-            <wp:docPr id="404029424" name="Picture 8"/>
-            <wp:cNvGraphicFramePr>
-              <a:graphicFrameLocks xmlns:a="http://schemas.openxmlformats.org/drawingml/2006/main" noChangeAspect="1"/>
-            </wp:cNvGraphicFramePr>
-            <a:graphic xmlns:a="http://schemas.openxmlformats.org/drawingml/2006/main">
-              <a:graphicData uri="http://schemas.openxmlformats.org/drawingml/2006/picture">
-                <pic:pic xmlns:pic="http://schemas.openxmlformats.org/drawingml/2006/picture">
-                  <pic:nvPicPr>
-                    <pic:cNvPr id="404029424" name="Picture 404029424"/>
-                    <pic:cNvPicPr/>
-                  </pic:nvPicPr>
-                  <pic:blipFill>
-                    <a:blip r:embed="rId18">
-                      <a:extLst>
-                        <a:ext uri="{28A0092B-C50C-407E-A947-70E740481C1C}">
-                          <a14:useLocalDpi xmlns:a14="http://schemas.microsoft.com/office/drawing/2010/main" val="0"/>
-                        </a:ext>
-                      </a:extLst>
-                    </a:blip>
-                    <a:stretch>
-                      <a:fillRect/>
-                    </a:stretch>
-                  </pic:blipFill>
-                  <pic:spPr>
-                    <a:xfrm>
-                      <a:off x="0" y="0"/>
-                      <a:ext cx="4191000" cy="1019175"/>
-                    </a:xfrm>
-                    <a:prstGeom prst="rect">
-                      <a:avLst/>
-                    </a:prstGeom>
-                  </pic:spPr>
-                </pic:pic>
-              </a:graphicData>
-            </a:graphic>
-          </wp:anchor>
-        </w:drawing>
-      </w:r>
-    </w:p>
-    <w:p>
-      <w:pPr>
-        <w:spacing w:line="480" w:lineRule="auto"/>
-        <w:rPr>
-          <w:rFonts w:ascii="Arial" w:hAnsi="Arial" w:cs="Arial"/>
-        </w:rPr>
-      </w:pPr>
-      <w:r>
-        <w:rPr>
-          <w:rFonts w:ascii="Arial" w:hAnsi="Arial" w:cs="Arial"/>
-          <w:b/>
-          <w:bCs/>
-          <w:sz w:val="28"/>
-          <w:szCs w:val="28"/>
-        </w:rPr>
-        <w:lastRenderedPageBreak/>
-        <w:t>Explanation</w:t>
-      </w:r>
-      <w:r>
-        <w:rPr>
-          <w:rFonts w:ascii="Arial" w:hAnsi="Arial" w:cs="Arial"/>
-          <w:b/>
-          <w:bCs/>
-          <w:sz w:val="28"/>
-          <w:szCs w:val="28"/>
-        </w:rPr>
-        <w:t>:</w:t>
-      </w:r>
-      <w:r>
-        <w:rPr>
-          <w:rFonts w:ascii="Arial" w:hAnsi="Arial" w:cs="Arial"/>
-          <w:b/>
-          <w:bCs/>
-        </w:rPr>
-        <w:t xml:space="preserve"> </w:t>
-      </w:r>
-      <w:r>
-        <w:rPr>
-          <w:rFonts w:ascii="Arial" w:hAnsi="Arial" w:cs="Arial"/>
-        </w:rPr>
-        <w:t>The tracert command was run to display the specific path the packets took to reach the destination IP address. The output displays only a single hop because both PCs are directly connected to the same local switch, meaning the data does not need to traverse multiple routers to reach its target.</w:t>
-      </w:r>
-    </w:p>
-    <w:p>
-      <w:pPr>
-        <w:pStyle w:val="ListParagraph"/>
-        <w:numPr>
-          <w:ilvl w:val="0"/>
-          <w:numId w:val="36"/>
-        </w:numPr>
-        <w:spacing w:line="480" w:lineRule="auto"/>
-        <w:rPr>
-          <w:rFonts w:ascii="Arial" w:hAnsi="Arial" w:cs="Arial"/>
-          <w:b/>
-          <w:bCs/>
-          <w:sz w:val="28"/>
-          <w:szCs w:val="28"/>
-        </w:rPr>
-      </w:pPr>
-      <w:r>
-        <w:rPr>
-          <w:rFonts w:ascii="Arial" w:hAnsi="Arial" w:cs="Arial"/>
-          <w:b/>
-          <w:bCs/>
-          <w:sz w:val="28"/>
-          <w:szCs w:val="28"/>
-        </w:rPr>
-        <w:t>Command: arp -a, netstat</w:t>
-      </w:r>
-    </w:p>
-    <w:p>
-      <w:pPr>
-        <w:spacing w:line="480" w:lineRule="auto"/>
-        <w:rPr>
-          <w:rFonts w:ascii="Arial" w:hAnsi="Arial" w:cs="Arial"/>
-        </w:rPr>
-      </w:pPr>
-      <w:r>
-        <w:rPr>
-          <w:rFonts w:ascii="Arial" w:hAnsi="Arial" w:cs="Arial"/>
-          <w:noProof/>
-        </w:rPr>
-        <w:drawing>
-          <wp:anchor distT="0" distB="0" distL="114300" distR="114300" simplePos="0" relativeHeight="251668480" behindDoc="0" locked="0" layoutInCell="1" allowOverlap="1" wp14:anchorId="64F8DA22" wp14:editId="68F716F8">
-            <wp:simplePos x="0" y="0"/>
-            <wp:positionH relativeFrom="margin">
-              <wp:align>center</wp:align>
-            </wp:positionH>
-            <wp:positionV relativeFrom="paragraph">
-              <wp:posOffset>12700</wp:posOffset>
-            </wp:positionV>
-            <wp:extent cx="4457700" cy="514350"/>
-            <wp:effectExtent l="0" t="0" r="0" b="0"/>
-            <wp:wrapSquare wrapText="bothSides"/>
-            <wp:docPr id="1601549125" name="Picture 9"/>
-            <wp:cNvGraphicFramePr>
-              <a:graphicFrameLocks xmlns:a="http://schemas.openxmlformats.org/drawingml/2006/main" noChangeAspect="1"/>
-            </wp:cNvGraphicFramePr>
-            <a:graphic xmlns:a="http://schemas.openxmlformats.org/drawingml/2006/main">
-              <a:graphicData uri="http://schemas.openxmlformats.org/drawingml/2006/picture">
-                <pic:pic xmlns:pic="http://schemas.openxmlformats.org/drawingml/2006/picture">
-                  <pic:nvPicPr>
-                    <pic:cNvPr id="1601549125" name="Picture 1601549125"/>
-                    <pic:cNvPicPr/>
-                  </pic:nvPicPr>
-                  <pic:blipFill>
-                    <a:blip r:embed="rId19">
-                      <a:extLst>
-                        <a:ext uri="{28A0092B-C50C-407E-A947-70E740481C1C}">
-                          <a14:useLocalDpi xmlns:a14="http://schemas.microsoft.com/office/drawing/2010/main" val="0"/>
-                        </a:ext>
-                      </a:extLst>
-                    </a:blip>
-                    <a:stretch>
-                      <a:fillRect/>
-                    </a:stretch>
-                  </pic:blipFill>
-                  <pic:spPr>
-                    <a:xfrm>
-                      <a:off x="0" y="0"/>
-                      <a:ext cx="4457700" cy="514350"/>
-                    </a:xfrm>
-                    <a:prstGeom prst="rect">
-                      <a:avLst/>
-                    </a:prstGeom>
-                  </pic:spPr>
-                </pic:pic>
-              </a:graphicData>
-            </a:graphic>
-          </wp:anchor>
-        </w:drawing>
-      </w:r>
-    </w:p>
-    <w:p>
-      <w:pPr>
-        <w:spacing w:line="480" w:lineRule="auto"/>
-        <w:rPr>
-          <w:rFonts w:ascii="Arial" w:hAnsi="Arial" w:cs="Arial"/>
-        </w:rPr>
-      </w:pPr>
-      <w:r>
-        <w:rPr>
-          <w:rFonts w:ascii="Arial" w:hAnsi="Arial" w:cs="Arial"/>
-          <w:noProof/>
-        </w:rPr>
-        <w:drawing>
-          <wp:anchor distT="0" distB="0" distL="114300" distR="114300" simplePos="0" relativeHeight="251669504" behindDoc="0" locked="0" layoutInCell="1" allowOverlap="1" wp14:anchorId="230AA4B2" wp14:editId="23047C75">
-            <wp:simplePos x="0" y="0"/>
-            <wp:positionH relativeFrom="margin">
-              <wp:align>center</wp:align>
-            </wp:positionH>
-            <wp:positionV relativeFrom="paragraph">
-              <wp:posOffset>351790</wp:posOffset>
-            </wp:positionV>
-            <wp:extent cx="5019675" cy="828675"/>
-            <wp:effectExtent l="0" t="0" r="9525" b="9525"/>
-            <wp:wrapSquare wrapText="bothSides"/>
-            <wp:docPr id="105504844" name="Picture 10"/>
-            <wp:cNvGraphicFramePr>
-              <a:graphicFrameLocks xmlns:a="http://schemas.openxmlformats.org/drawingml/2006/main" noChangeAspect="1"/>
-            </wp:cNvGraphicFramePr>
-            <a:graphic xmlns:a="http://schemas.openxmlformats.org/drawingml/2006/main">
-              <a:graphicData uri="http://schemas.openxmlformats.org/drawingml/2006/picture">
-                <pic:pic xmlns:pic="http://schemas.openxmlformats.org/drawingml/2006/picture">
-                  <pic:nvPicPr>
-                    <pic:cNvPr id="105504844" name="Picture 105504844"/>
-                    <pic:cNvPicPr/>
-                  </pic:nvPicPr>
-                  <pic:blipFill>
-                    <a:blip r:embed="rId20">
-                      <a:extLst>
-                        <a:ext uri="{28A0092B-C50C-407E-A947-70E740481C1C}">
-                          <a14:useLocalDpi xmlns:a14="http://schemas.microsoft.com/office/drawing/2010/main" val="0"/>
-                        </a:ext>
-                      </a:extLst>
-                    </a:blip>
-                    <a:stretch>
-                      <a:fillRect/>
-                    </a:stretch>
-                  </pic:blipFill>
-                  <pic:spPr>
-                    <a:xfrm>
-                      <a:off x="0" y="0"/>
-                      <a:ext cx="5019675" cy="828675"/>
-                    </a:xfrm>
-                    <a:prstGeom prst="rect">
-                      <a:avLst/>
-                    </a:prstGeom>
-                  </pic:spPr>
-                </pic:pic>
-              </a:graphicData>
-            </a:graphic>
-          </wp:anchor>
-        </w:drawing>
-      </w:r>
-    </w:p>
-    <w:p>
-      <w:pPr>
-        <w:spacing w:line="480" w:lineRule="auto"/>
-        <w:rPr>
-          <w:rFonts w:ascii="Arial" w:hAnsi="Arial" w:cs="Arial"/>
-          <w:b/>
-          <w:bCs/>
-          <w:sz w:val="28"/>
-          <w:szCs w:val="28"/>
-        </w:rPr>
-      </w:pPr>
-    </w:p>
-    <w:p>
-      <w:pPr>
-        <w:spacing w:line="480" w:lineRule="auto"/>
-        <w:rPr>
-          <w:rFonts w:ascii="Arial" w:hAnsi="Arial" w:cs="Arial"/>
-          <w:b/>
-          <w:bCs/>
-          <w:sz w:val="28"/>
-          <w:szCs w:val="28"/>
-        </w:rPr>
-      </w:pPr>
-    </w:p>
-    <w:p>
-      <w:pPr>
-        <w:spacing w:line="480" w:lineRule="auto"/>
-        <w:rPr>
-          <w:rFonts w:ascii="Arial" w:hAnsi="Arial" w:cs="Arial"/>
-        </w:rPr>
-      </w:pPr>
-      <w:r>
-        <w:rPr>
-          <w:rFonts w:ascii="Arial" w:hAnsi="Arial" w:cs="Arial"/>
-          <w:b/>
-          <w:bCs/>
-          <w:sz w:val="28"/>
-          <w:szCs w:val="28"/>
-        </w:rPr>
-        <w:t>Explanation</w:t>
-      </w:r>
-      <w:r>
-        <w:rPr>
-          <w:rFonts w:ascii="Arial" w:hAnsi="Arial" w:cs="Arial"/>
-          <w:b/>
-          <w:bCs/>
-          <w:sz w:val="28"/>
-          <w:szCs w:val="28"/>
-        </w:rPr>
-        <w:t>:</w:t>
-      </w:r>
-      <w:r>
-        <w:rPr>
-          <w:rFonts w:ascii="Arial" w:hAnsi="Arial" w:cs="Arial"/>
-          <w:b/>
-          <w:bCs/>
-        </w:rPr>
-        <w:t xml:space="preserve"> </w:t>
-      </w:r>
-      <w:r>
-        <w:rPr>
-          <w:rFonts w:ascii="Arial" w:hAnsi="Arial" w:cs="Arial"/>
-        </w:rPr>
-        <w:t>The arp -a command successfully displayed the device's Address Resolution Protocol (ARP) table, which maps the known logical IP addresses to their corresponding physical MAC addresses. Additionally, the netstat command was executed to display active network connections and statistics for the system.</w:t>
-      </w:r>
-    </w:p>
-    <w:p>
-      <w:pPr>
-        <w:spacing w:line="480" w:lineRule="auto"/>
-        <w:rPr>
-          <w:rFonts w:ascii="Arial" w:hAnsi="Arial" w:cs="Arial"/>
-        </w:rPr>
-      </w:pPr>
-    </w:p>
-    <w:p>
-      <w:pPr>
-        <w:spacing w:line="480" w:lineRule="auto"/>
-        <w:rPr>
-          <w:rFonts w:ascii="Arial" w:hAnsi="Arial" w:cs="Arial"/>
-        </w:rPr>
-      </w:pPr>
     </w:p>
     <w:sectPr>
       <w:pgSz w:w="11906" w:h="16838" w:code="9"/>
@@ -3347,6 +1793,155 @@
     </w:lvl>
   </w:abstractNum>
   <w:abstractNum w:abstractNumId="1" w15:restartNumberingAfterBreak="0">
+    <w:nsid w:val="06104D51"/>
+    <w:multiLevelType w:val="multilevel"/>
+    <w:tmpl w:val="AA54E830"/>
+    <w:lvl w:ilvl="0">
+      <w:start w:val="1"/>
+      <w:numFmt w:val="bullet"/>
+      <w:lvlText w:val=""/>
+      <w:lvlJc w:val="left"/>
+      <w:pPr>
+        <w:tabs>
+          <w:tab w:val="num" w:pos="720"/>
+        </w:tabs>
+        <w:ind w:left="720" w:hanging="360"/>
+      </w:pPr>
+      <w:rPr>
+        <w:rFonts w:ascii="Symbol" w:hAnsi="Symbol" w:hint="default"/>
+        <w:sz w:val="20"/>
+      </w:rPr>
+    </w:lvl>
+    <w:lvl w:ilvl="1" w:tentative="1">
+      <w:start w:val="1"/>
+      <w:numFmt w:val="bullet"/>
+      <w:lvlText w:val="o"/>
+      <w:lvlJc w:val="left"/>
+      <w:pPr>
+        <w:tabs>
+          <w:tab w:val="num" w:pos="1440"/>
+        </w:tabs>
+        <w:ind w:left="1440" w:hanging="360"/>
+      </w:pPr>
+      <w:rPr>
+        <w:rFonts w:ascii="Courier New" w:hAnsi="Courier New" w:hint="default"/>
+        <w:sz w:val="20"/>
+      </w:rPr>
+    </w:lvl>
+    <w:lvl w:ilvl="2" w:tentative="1">
+      <w:start w:val="1"/>
+      <w:numFmt w:val="bullet"/>
+      <w:lvlText w:val=""/>
+      <w:lvlJc w:val="left"/>
+      <w:pPr>
+        <w:tabs>
+          <w:tab w:val="num" w:pos="2160"/>
+        </w:tabs>
+        <w:ind w:left="2160" w:hanging="360"/>
+      </w:pPr>
+      <w:rPr>
+        <w:rFonts w:ascii="Wingdings" w:hAnsi="Wingdings" w:hint="default"/>
+        <w:sz w:val="20"/>
+      </w:rPr>
+    </w:lvl>
+    <w:lvl w:ilvl="3" w:tentative="1">
+      <w:start w:val="1"/>
+      <w:numFmt w:val="bullet"/>
+      <w:lvlText w:val=""/>
+      <w:lvlJc w:val="left"/>
+      <w:pPr>
+        <w:tabs>
+          <w:tab w:val="num" w:pos="2880"/>
+        </w:tabs>
+        <w:ind w:left="2880" w:hanging="360"/>
+      </w:pPr>
+      <w:rPr>
+        <w:rFonts w:ascii="Wingdings" w:hAnsi="Wingdings" w:hint="default"/>
+        <w:sz w:val="20"/>
+      </w:rPr>
+    </w:lvl>
+    <w:lvl w:ilvl="4" w:tentative="1">
+      <w:start w:val="1"/>
+      <w:numFmt w:val="bullet"/>
+      <w:lvlText w:val=""/>
+      <w:lvlJc w:val="left"/>
+      <w:pPr>
+        <w:tabs>
+          <w:tab w:val="num" w:pos="3600"/>
+        </w:tabs>
+        <w:ind w:left="3600" w:hanging="360"/>
+      </w:pPr>
+      <w:rPr>
+        <w:rFonts w:ascii="Wingdings" w:hAnsi="Wingdings" w:hint="default"/>
+        <w:sz w:val="20"/>
+      </w:rPr>
+    </w:lvl>
+    <w:lvl w:ilvl="5" w:tentative="1">
+      <w:start w:val="1"/>
+      <w:numFmt w:val="bullet"/>
+      <w:lvlText w:val=""/>
+      <w:lvlJc w:val="left"/>
+      <w:pPr>
+        <w:tabs>
+          <w:tab w:val="num" w:pos="4320"/>
+        </w:tabs>
+        <w:ind w:left="4320" w:hanging="360"/>
+      </w:pPr>
+      <w:rPr>
+        <w:rFonts w:ascii="Wingdings" w:hAnsi="Wingdings" w:hint="default"/>
+        <w:sz w:val="20"/>
+      </w:rPr>
+    </w:lvl>
+    <w:lvl w:ilvl="6" w:tentative="1">
+      <w:start w:val="1"/>
+      <w:numFmt w:val="bullet"/>
+      <w:lvlText w:val=""/>
+      <w:lvlJc w:val="left"/>
+      <w:pPr>
+        <w:tabs>
+          <w:tab w:val="num" w:pos="5040"/>
+        </w:tabs>
+        <w:ind w:left="5040" w:hanging="360"/>
+      </w:pPr>
+      <w:rPr>
+        <w:rFonts w:ascii="Wingdings" w:hAnsi="Wingdings" w:hint="default"/>
+        <w:sz w:val="20"/>
+      </w:rPr>
+    </w:lvl>
+    <w:lvl w:ilvl="7" w:tentative="1">
+      <w:start w:val="1"/>
+      <w:numFmt w:val="bullet"/>
+      <w:lvlText w:val=""/>
+      <w:lvlJc w:val="left"/>
+      <w:pPr>
+        <w:tabs>
+          <w:tab w:val="num" w:pos="5760"/>
+        </w:tabs>
+        <w:ind w:left="5760" w:hanging="360"/>
+      </w:pPr>
+      <w:rPr>
+        <w:rFonts w:ascii="Wingdings" w:hAnsi="Wingdings" w:hint="default"/>
+        <w:sz w:val="20"/>
+      </w:rPr>
+    </w:lvl>
+    <w:lvl w:ilvl="8" w:tentative="1">
+      <w:start w:val="1"/>
+      <w:numFmt w:val="bullet"/>
+      <w:lvlText w:val=""/>
+      <w:lvlJc w:val="left"/>
+      <w:pPr>
+        <w:tabs>
+          <w:tab w:val="num" w:pos="6480"/>
+        </w:tabs>
+        <w:ind w:left="6480" w:hanging="360"/>
+      </w:pPr>
+      <w:rPr>
+        <w:rFonts w:ascii="Wingdings" w:hAnsi="Wingdings" w:hint="default"/>
+        <w:sz w:val="20"/>
+      </w:rPr>
+    </w:lvl>
+  </w:abstractNum>
+  <w:abstractNum w:abstractNumId="2" w15:restartNumberingAfterBreak="0">
     <w:nsid w:val="0B474862"/>
     <w:multiLevelType w:val="hybridMultilevel"/>
     <w:tmpl w:val="46E2B9A6"/>
@@ -3459,7 +2054,7 @@
       </w:rPr>
     </w:lvl>
   </w:abstractNum>
-  <w:abstractNum w:abstractNumId="2" w15:restartNumberingAfterBreak="0">
+  <w:abstractNum w:abstractNumId="3" w15:restartNumberingAfterBreak="0">
     <w:nsid w:val="0C170986"/>
     <w:multiLevelType w:val="hybridMultilevel"/>
     <w:tmpl w:val="0B68D1D6"/>
@@ -3572,7 +2167,7 @@
       </w:rPr>
     </w:lvl>
   </w:abstractNum>
-  <w:abstractNum w:abstractNumId="3" w15:restartNumberingAfterBreak="0">
+  <w:abstractNum w:abstractNumId="4" w15:restartNumberingAfterBreak="0">
     <w:nsid w:val="0CD217D4"/>
     <w:multiLevelType w:val="hybridMultilevel"/>
     <w:tmpl w:val="EB5A838C"/>
@@ -3685,7 +2280,7 @@
       </w:rPr>
     </w:lvl>
   </w:abstractNum>
-  <w:abstractNum w:abstractNumId="4" w15:restartNumberingAfterBreak="0">
+  <w:abstractNum w:abstractNumId="5" w15:restartNumberingAfterBreak="0">
     <w:nsid w:val="0FD931AB"/>
     <w:multiLevelType w:val="hybridMultilevel"/>
     <w:tmpl w:val="3C6EA868"/>
@@ -3798,7 +2393,7 @@
       </w:rPr>
     </w:lvl>
   </w:abstractNum>
-  <w:abstractNum w:abstractNumId="5" w15:restartNumberingAfterBreak="0">
+  <w:abstractNum w:abstractNumId="6" w15:restartNumberingAfterBreak="0">
     <w:nsid w:val="178C1E3F"/>
     <w:multiLevelType w:val="hybridMultilevel"/>
     <w:tmpl w:val="2F9E3098"/>
@@ -3911,7 +2506,7 @@
       </w:rPr>
     </w:lvl>
   </w:abstractNum>
-  <w:abstractNum w:abstractNumId="6" w15:restartNumberingAfterBreak="0">
+  <w:abstractNum w:abstractNumId="7" w15:restartNumberingAfterBreak="0">
     <w:nsid w:val="1C011979"/>
     <w:multiLevelType w:val="hybridMultilevel"/>
     <w:tmpl w:val="B43AB892"/>
@@ -4024,7 +2619,7 @@
       </w:rPr>
     </w:lvl>
   </w:abstractNum>
-  <w:abstractNum w:abstractNumId="7" w15:restartNumberingAfterBreak="0">
+  <w:abstractNum w:abstractNumId="8" w15:restartNumberingAfterBreak="0">
     <w:nsid w:val="1CC606CF"/>
     <w:multiLevelType w:val="multilevel"/>
     <w:tmpl w:val="A1B053C6"/>
@@ -4173,7 +2768,7 @@
       </w:rPr>
     </w:lvl>
   </w:abstractNum>
-  <w:abstractNum w:abstractNumId="8" w15:restartNumberingAfterBreak="0">
+  <w:abstractNum w:abstractNumId="9" w15:restartNumberingAfterBreak="0">
     <w:nsid w:val="24AC229B"/>
     <w:multiLevelType w:val="hybridMultilevel"/>
     <w:tmpl w:val="7C14AE2C"/>
@@ -4286,7 +2881,7 @@
       </w:rPr>
     </w:lvl>
   </w:abstractNum>
-  <w:abstractNum w:abstractNumId="9" w15:restartNumberingAfterBreak="0">
+  <w:abstractNum w:abstractNumId="10" w15:restartNumberingAfterBreak="0">
     <w:nsid w:val="2580475B"/>
     <w:multiLevelType w:val="multilevel"/>
     <w:tmpl w:val="619861CC"/>
@@ -4435,7 +3030,7 @@
       </w:rPr>
     </w:lvl>
   </w:abstractNum>
-  <w:abstractNum w:abstractNumId="10" w15:restartNumberingAfterBreak="0">
+  <w:abstractNum w:abstractNumId="11" w15:restartNumberingAfterBreak="0">
     <w:nsid w:val="260248AB"/>
     <w:multiLevelType w:val="hybridMultilevel"/>
     <w:tmpl w:val="F148F898"/>
@@ -4548,7 +3143,7 @@
       </w:rPr>
     </w:lvl>
   </w:abstractNum>
-  <w:abstractNum w:abstractNumId="11" w15:restartNumberingAfterBreak="0">
+  <w:abstractNum w:abstractNumId="12" w15:restartNumberingAfterBreak="0">
     <w:nsid w:val="29FF61EC"/>
     <w:multiLevelType w:val="hybridMultilevel"/>
     <w:tmpl w:val="D1ECCD1A"/>
@@ -4661,7 +3256,156 @@
       </w:rPr>
     </w:lvl>
   </w:abstractNum>
-  <w:abstractNum w:abstractNumId="12" w15:restartNumberingAfterBreak="0">
+  <w:abstractNum w:abstractNumId="13" w15:restartNumberingAfterBreak="0">
+    <w:nsid w:val="2C9166A2"/>
+    <w:multiLevelType w:val="multilevel"/>
+    <w:tmpl w:val="2E6AF08E"/>
+    <w:lvl w:ilvl="0">
+      <w:start w:val="1"/>
+      <w:numFmt w:val="bullet"/>
+      <w:lvlText w:val=""/>
+      <w:lvlJc w:val="left"/>
+      <w:pPr>
+        <w:tabs>
+          <w:tab w:val="num" w:pos="720"/>
+        </w:tabs>
+        <w:ind w:left="720" w:hanging="360"/>
+      </w:pPr>
+      <w:rPr>
+        <w:rFonts w:ascii="Symbol" w:hAnsi="Symbol" w:hint="default"/>
+        <w:sz w:val="20"/>
+      </w:rPr>
+    </w:lvl>
+    <w:lvl w:ilvl="1" w:tentative="1">
+      <w:start w:val="1"/>
+      <w:numFmt w:val="bullet"/>
+      <w:lvlText w:val="o"/>
+      <w:lvlJc w:val="left"/>
+      <w:pPr>
+        <w:tabs>
+          <w:tab w:val="num" w:pos="1440"/>
+        </w:tabs>
+        <w:ind w:left="1440" w:hanging="360"/>
+      </w:pPr>
+      <w:rPr>
+        <w:rFonts w:ascii="Courier New" w:hAnsi="Courier New" w:hint="default"/>
+        <w:sz w:val="20"/>
+      </w:rPr>
+    </w:lvl>
+    <w:lvl w:ilvl="2" w:tentative="1">
+      <w:start w:val="1"/>
+      <w:numFmt w:val="bullet"/>
+      <w:lvlText w:val=""/>
+      <w:lvlJc w:val="left"/>
+      <w:pPr>
+        <w:tabs>
+          <w:tab w:val="num" w:pos="2160"/>
+        </w:tabs>
+        <w:ind w:left="2160" w:hanging="360"/>
+      </w:pPr>
+      <w:rPr>
+        <w:rFonts w:ascii="Wingdings" w:hAnsi="Wingdings" w:hint="default"/>
+        <w:sz w:val="20"/>
+      </w:rPr>
+    </w:lvl>
+    <w:lvl w:ilvl="3" w:tentative="1">
+      <w:start w:val="1"/>
+      <w:numFmt w:val="bullet"/>
+      <w:lvlText w:val=""/>
+      <w:lvlJc w:val="left"/>
+      <w:pPr>
+        <w:tabs>
+          <w:tab w:val="num" w:pos="2880"/>
+        </w:tabs>
+        <w:ind w:left="2880" w:hanging="360"/>
+      </w:pPr>
+      <w:rPr>
+        <w:rFonts w:ascii="Wingdings" w:hAnsi="Wingdings" w:hint="default"/>
+        <w:sz w:val="20"/>
+      </w:rPr>
+    </w:lvl>
+    <w:lvl w:ilvl="4" w:tentative="1">
+      <w:start w:val="1"/>
+      <w:numFmt w:val="bullet"/>
+      <w:lvlText w:val=""/>
+      <w:lvlJc w:val="left"/>
+      <w:pPr>
+        <w:tabs>
+          <w:tab w:val="num" w:pos="3600"/>
+        </w:tabs>
+        <w:ind w:left="3600" w:hanging="360"/>
+      </w:pPr>
+      <w:rPr>
+        <w:rFonts w:ascii="Wingdings" w:hAnsi="Wingdings" w:hint="default"/>
+        <w:sz w:val="20"/>
+      </w:rPr>
+    </w:lvl>
+    <w:lvl w:ilvl="5" w:tentative="1">
+      <w:start w:val="1"/>
+      <w:numFmt w:val="bullet"/>
+      <w:lvlText w:val=""/>
+      <w:lvlJc w:val="left"/>
+      <w:pPr>
+        <w:tabs>
+          <w:tab w:val="num" w:pos="4320"/>
+        </w:tabs>
+        <w:ind w:left="4320" w:hanging="360"/>
+      </w:pPr>
+      <w:rPr>
+        <w:rFonts w:ascii="Wingdings" w:hAnsi="Wingdings" w:hint="default"/>
+        <w:sz w:val="20"/>
+      </w:rPr>
+    </w:lvl>
+    <w:lvl w:ilvl="6" w:tentative="1">
+      <w:start w:val="1"/>
+      <w:numFmt w:val="bullet"/>
+      <w:lvlText w:val=""/>
+      <w:lvlJc w:val="left"/>
+      <w:pPr>
+        <w:tabs>
+          <w:tab w:val="num" w:pos="5040"/>
+        </w:tabs>
+        <w:ind w:left="5040" w:hanging="360"/>
+      </w:pPr>
+      <w:rPr>
+        <w:rFonts w:ascii="Wingdings" w:hAnsi="Wingdings" w:hint="default"/>
+        <w:sz w:val="20"/>
+      </w:rPr>
+    </w:lvl>
+    <w:lvl w:ilvl="7" w:tentative="1">
+      <w:start w:val="1"/>
+      <w:numFmt w:val="bullet"/>
+      <w:lvlText w:val=""/>
+      <w:lvlJc w:val="left"/>
+      <w:pPr>
+        <w:tabs>
+          <w:tab w:val="num" w:pos="5760"/>
+        </w:tabs>
+        <w:ind w:left="5760" w:hanging="360"/>
+      </w:pPr>
+      <w:rPr>
+        <w:rFonts w:ascii="Wingdings" w:hAnsi="Wingdings" w:hint="default"/>
+        <w:sz w:val="20"/>
+      </w:rPr>
+    </w:lvl>
+    <w:lvl w:ilvl="8" w:tentative="1">
+      <w:start w:val="1"/>
+      <w:numFmt w:val="bullet"/>
+      <w:lvlText w:val=""/>
+      <w:lvlJc w:val="left"/>
+      <w:pPr>
+        <w:tabs>
+          <w:tab w:val="num" w:pos="6480"/>
+        </w:tabs>
+        <w:ind w:left="6480" w:hanging="360"/>
+      </w:pPr>
+      <w:rPr>
+        <w:rFonts w:ascii="Wingdings" w:hAnsi="Wingdings" w:hint="default"/>
+        <w:sz w:val="20"/>
+      </w:rPr>
+    </w:lvl>
+  </w:abstractNum>
+  <w:abstractNum w:abstractNumId="14" w15:restartNumberingAfterBreak="0">
     <w:nsid w:val="2E024152"/>
     <w:multiLevelType w:val="hybridMultilevel"/>
     <w:tmpl w:val="44B664E8"/>
@@ -4774,7 +3518,7 @@
       </w:rPr>
     </w:lvl>
   </w:abstractNum>
-  <w:abstractNum w:abstractNumId="13" w15:restartNumberingAfterBreak="0">
+  <w:abstractNum w:abstractNumId="15" w15:restartNumberingAfterBreak="0">
     <w:nsid w:val="345F4E1A"/>
     <w:multiLevelType w:val="multilevel"/>
     <w:tmpl w:val="F536C4D0"/>
@@ -4923,7 +3667,7 @@
       </w:rPr>
     </w:lvl>
   </w:abstractNum>
-  <w:abstractNum w:abstractNumId="14" w15:restartNumberingAfterBreak="0">
+  <w:abstractNum w:abstractNumId="16" w15:restartNumberingAfterBreak="0">
     <w:nsid w:val="35332503"/>
     <w:multiLevelType w:val="hybridMultilevel"/>
     <w:tmpl w:val="5C102FCC"/>
@@ -5036,7 +3780,7 @@
       </w:rPr>
     </w:lvl>
   </w:abstractNum>
-  <w:abstractNum w:abstractNumId="15" w15:restartNumberingAfterBreak="0">
+  <w:abstractNum w:abstractNumId="17" w15:restartNumberingAfterBreak="0">
     <w:nsid w:val="3A40578B"/>
     <w:multiLevelType w:val="multilevel"/>
     <w:tmpl w:val="6944B92C"/>
@@ -5185,7 +3929,7 @@
       </w:rPr>
     </w:lvl>
   </w:abstractNum>
-  <w:abstractNum w:abstractNumId="16" w15:restartNumberingAfterBreak="0">
+  <w:abstractNum w:abstractNumId="18" w15:restartNumberingAfterBreak="0">
     <w:nsid w:val="407C098D"/>
     <w:multiLevelType w:val="hybridMultilevel"/>
     <w:tmpl w:val="3C0260D6"/>
@@ -5298,7 +4042,120 @@
       </w:rPr>
     </w:lvl>
   </w:abstractNum>
-  <w:abstractNum w:abstractNumId="17" w15:restartNumberingAfterBreak="0">
+  <w:abstractNum w:abstractNumId="19" w15:restartNumberingAfterBreak="0">
+    <w:nsid w:val="43CE7851"/>
+    <w:multiLevelType w:val="multilevel"/>
+    <w:tmpl w:val="38FC82D2"/>
+    <w:lvl w:ilvl="0">
+      <w:start w:val="1"/>
+      <w:numFmt w:val="decimal"/>
+      <w:lvlText w:val="%1."/>
+      <w:lvlJc w:val="left"/>
+      <w:pPr>
+        <w:tabs>
+          <w:tab w:val="num" w:pos="720"/>
+        </w:tabs>
+        <w:ind w:left="720" w:hanging="360"/>
+      </w:pPr>
+    </w:lvl>
+    <w:lvl w:ilvl="1" w:tentative="1">
+      <w:start w:val="1"/>
+      <w:numFmt w:val="decimal"/>
+      <w:lvlText w:val="%2."/>
+      <w:lvlJc w:val="left"/>
+      <w:pPr>
+        <w:tabs>
+          <w:tab w:val="num" w:pos="1440"/>
+        </w:tabs>
+        <w:ind w:left="1440" w:hanging="360"/>
+      </w:pPr>
+    </w:lvl>
+    <w:lvl w:ilvl="2" w:tentative="1">
+      <w:start w:val="1"/>
+      <w:numFmt w:val="decimal"/>
+      <w:lvlText w:val="%3."/>
+      <w:lvlJc w:val="left"/>
+      <w:pPr>
+        <w:tabs>
+          <w:tab w:val="num" w:pos="2160"/>
+        </w:tabs>
+        <w:ind w:left="2160" w:hanging="360"/>
+      </w:pPr>
+    </w:lvl>
+    <w:lvl w:ilvl="3" w:tentative="1">
+      <w:start w:val="1"/>
+      <w:numFmt w:val="decimal"/>
+      <w:lvlText w:val="%4."/>
+      <w:lvlJc w:val="left"/>
+      <w:pPr>
+        <w:tabs>
+          <w:tab w:val="num" w:pos="2880"/>
+        </w:tabs>
+        <w:ind w:left="2880" w:hanging="360"/>
+      </w:pPr>
+    </w:lvl>
+    <w:lvl w:ilvl="4" w:tentative="1">
+      <w:start w:val="1"/>
+      <w:numFmt w:val="decimal"/>
+      <w:lvlText w:val="%5."/>
+      <w:lvlJc w:val="left"/>
+      <w:pPr>
+        <w:tabs>
+          <w:tab w:val="num" w:pos="3600"/>
+        </w:tabs>
+        <w:ind w:left="3600" w:hanging="360"/>
+      </w:pPr>
+    </w:lvl>
+    <w:lvl w:ilvl="5" w:tentative="1">
+      <w:start w:val="1"/>
+      <w:numFmt w:val="decimal"/>
+      <w:lvlText w:val="%6."/>
+      <w:lvlJc w:val="left"/>
+      <w:pPr>
+        <w:tabs>
+          <w:tab w:val="num" w:pos="4320"/>
+        </w:tabs>
+        <w:ind w:left="4320" w:hanging="360"/>
+      </w:pPr>
+    </w:lvl>
+    <w:lvl w:ilvl="6" w:tentative="1">
+      <w:start w:val="1"/>
+      <w:numFmt w:val="decimal"/>
+      <w:lvlText w:val="%7."/>
+      <w:lvlJc w:val="left"/>
+      <w:pPr>
+        <w:tabs>
+          <w:tab w:val="num" w:pos="5040"/>
+        </w:tabs>
+        <w:ind w:left="5040" w:hanging="360"/>
+      </w:pPr>
+    </w:lvl>
+    <w:lvl w:ilvl="7" w:tentative="1">
+      <w:start w:val="1"/>
+      <w:numFmt w:val="decimal"/>
+      <w:lvlText w:val="%8."/>
+      <w:lvlJc w:val="left"/>
+      <w:pPr>
+        <w:tabs>
+          <w:tab w:val="num" w:pos="5760"/>
+        </w:tabs>
+        <w:ind w:left="5760" w:hanging="360"/>
+      </w:pPr>
+    </w:lvl>
+    <w:lvl w:ilvl="8" w:tentative="1">
+      <w:start w:val="1"/>
+      <w:numFmt w:val="decimal"/>
+      <w:lvlText w:val="%9."/>
+      <w:lvlJc w:val="left"/>
+      <w:pPr>
+        <w:tabs>
+          <w:tab w:val="num" w:pos="6480"/>
+        </w:tabs>
+        <w:ind w:left="6480" w:hanging="360"/>
+      </w:pPr>
+    </w:lvl>
+  </w:abstractNum>
+  <w:abstractNum w:abstractNumId="20" w15:restartNumberingAfterBreak="0">
     <w:nsid w:val="47827DF8"/>
     <w:multiLevelType w:val="hybridMultilevel"/>
     <w:tmpl w:val="DD1E6020"/>
@@ -5411,7 +4268,7 @@
       </w:rPr>
     </w:lvl>
   </w:abstractNum>
-  <w:abstractNum w:abstractNumId="18" w15:restartNumberingAfterBreak="0">
+  <w:abstractNum w:abstractNumId="21" w15:restartNumberingAfterBreak="0">
     <w:nsid w:val="49655F4A"/>
     <w:multiLevelType w:val="hybridMultilevel"/>
     <w:tmpl w:val="56AA35BA"/>
@@ -5524,7 +4381,156 @@
       </w:rPr>
     </w:lvl>
   </w:abstractNum>
-  <w:abstractNum w:abstractNumId="19" w15:restartNumberingAfterBreak="0">
+  <w:abstractNum w:abstractNumId="22" w15:restartNumberingAfterBreak="0">
+    <w:nsid w:val="49A205D4"/>
+    <w:multiLevelType w:val="multilevel"/>
+    <w:tmpl w:val="81B8D1DA"/>
+    <w:lvl w:ilvl="0">
+      <w:start w:val="1"/>
+      <w:numFmt w:val="bullet"/>
+      <w:lvlText w:val=""/>
+      <w:lvlJc w:val="left"/>
+      <w:pPr>
+        <w:tabs>
+          <w:tab w:val="num" w:pos="720"/>
+        </w:tabs>
+        <w:ind w:left="720" w:hanging="360"/>
+      </w:pPr>
+      <w:rPr>
+        <w:rFonts w:ascii="Symbol" w:hAnsi="Symbol" w:hint="default"/>
+        <w:sz w:val="20"/>
+      </w:rPr>
+    </w:lvl>
+    <w:lvl w:ilvl="1" w:tentative="1">
+      <w:start w:val="1"/>
+      <w:numFmt w:val="bullet"/>
+      <w:lvlText w:val="o"/>
+      <w:lvlJc w:val="left"/>
+      <w:pPr>
+        <w:tabs>
+          <w:tab w:val="num" w:pos="1440"/>
+        </w:tabs>
+        <w:ind w:left="1440" w:hanging="360"/>
+      </w:pPr>
+      <w:rPr>
+        <w:rFonts w:ascii="Courier New" w:hAnsi="Courier New" w:hint="default"/>
+        <w:sz w:val="20"/>
+      </w:rPr>
+    </w:lvl>
+    <w:lvl w:ilvl="2" w:tentative="1">
+      <w:start w:val="1"/>
+      <w:numFmt w:val="bullet"/>
+      <w:lvlText w:val=""/>
+      <w:lvlJc w:val="left"/>
+      <w:pPr>
+        <w:tabs>
+          <w:tab w:val="num" w:pos="2160"/>
+        </w:tabs>
+        <w:ind w:left="2160" w:hanging="360"/>
+      </w:pPr>
+      <w:rPr>
+        <w:rFonts w:ascii="Wingdings" w:hAnsi="Wingdings" w:hint="default"/>
+        <w:sz w:val="20"/>
+      </w:rPr>
+    </w:lvl>
+    <w:lvl w:ilvl="3" w:tentative="1">
+      <w:start w:val="1"/>
+      <w:numFmt w:val="bullet"/>
+      <w:lvlText w:val=""/>
+      <w:lvlJc w:val="left"/>
+      <w:pPr>
+        <w:tabs>
+          <w:tab w:val="num" w:pos="2880"/>
+        </w:tabs>
+        <w:ind w:left="2880" w:hanging="360"/>
+      </w:pPr>
+      <w:rPr>
+        <w:rFonts w:ascii="Wingdings" w:hAnsi="Wingdings" w:hint="default"/>
+        <w:sz w:val="20"/>
+      </w:rPr>
+    </w:lvl>
+    <w:lvl w:ilvl="4" w:tentative="1">
+      <w:start w:val="1"/>
+      <w:numFmt w:val="bullet"/>
+      <w:lvlText w:val=""/>
+      <w:lvlJc w:val="left"/>
+      <w:pPr>
+        <w:tabs>
+          <w:tab w:val="num" w:pos="3600"/>
+        </w:tabs>
+        <w:ind w:left="3600" w:hanging="360"/>
+      </w:pPr>
+      <w:rPr>
+        <w:rFonts w:ascii="Wingdings" w:hAnsi="Wingdings" w:hint="default"/>
+        <w:sz w:val="20"/>
+      </w:rPr>
+    </w:lvl>
+    <w:lvl w:ilvl="5" w:tentative="1">
+      <w:start w:val="1"/>
+      <w:numFmt w:val="bullet"/>
+      <w:lvlText w:val=""/>
+      <w:lvlJc w:val="left"/>
+      <w:pPr>
+        <w:tabs>
+          <w:tab w:val="num" w:pos="4320"/>
+        </w:tabs>
+        <w:ind w:left="4320" w:hanging="360"/>
+      </w:pPr>
+      <w:rPr>
+        <w:rFonts w:ascii="Wingdings" w:hAnsi="Wingdings" w:hint="default"/>
+        <w:sz w:val="20"/>
+      </w:rPr>
+    </w:lvl>
+    <w:lvl w:ilvl="6" w:tentative="1">
+      <w:start w:val="1"/>
+      <w:numFmt w:val="bullet"/>
+      <w:lvlText w:val=""/>
+      <w:lvlJc w:val="left"/>
+      <w:pPr>
+        <w:tabs>
+          <w:tab w:val="num" w:pos="5040"/>
+        </w:tabs>
+        <w:ind w:left="5040" w:hanging="360"/>
+      </w:pPr>
+      <w:rPr>
+        <w:rFonts w:ascii="Wingdings" w:hAnsi="Wingdings" w:hint="default"/>
+        <w:sz w:val="20"/>
+      </w:rPr>
+    </w:lvl>
+    <w:lvl w:ilvl="7" w:tentative="1">
+      <w:start w:val="1"/>
+      <w:numFmt w:val="bullet"/>
+      <w:lvlText w:val=""/>
+      <w:lvlJc w:val="left"/>
+      <w:pPr>
+        <w:tabs>
+          <w:tab w:val="num" w:pos="5760"/>
+        </w:tabs>
+        <w:ind w:left="5760" w:hanging="360"/>
+      </w:pPr>
+      <w:rPr>
+        <w:rFonts w:ascii="Wingdings" w:hAnsi="Wingdings" w:hint="default"/>
+        <w:sz w:val="20"/>
+      </w:rPr>
+    </w:lvl>
+    <w:lvl w:ilvl="8" w:tentative="1">
+      <w:start w:val="1"/>
+      <w:numFmt w:val="bullet"/>
+      <w:lvlText w:val=""/>
+      <w:lvlJc w:val="left"/>
+      <w:pPr>
+        <w:tabs>
+          <w:tab w:val="num" w:pos="6480"/>
+        </w:tabs>
+        <w:ind w:left="6480" w:hanging="360"/>
+      </w:pPr>
+      <w:rPr>
+        <w:rFonts w:ascii="Wingdings" w:hAnsi="Wingdings" w:hint="default"/>
+        <w:sz w:val="20"/>
+      </w:rPr>
+    </w:lvl>
+  </w:abstractNum>
+  <w:abstractNum w:abstractNumId="23" w15:restartNumberingAfterBreak="0">
     <w:nsid w:val="4EFF4CB7"/>
     <w:multiLevelType w:val="hybridMultilevel"/>
     <w:tmpl w:val="C848F528"/>
@@ -5637,7 +4643,7 @@
       </w:rPr>
     </w:lvl>
   </w:abstractNum>
-  <w:abstractNum w:abstractNumId="20" w15:restartNumberingAfterBreak="0">
+  <w:abstractNum w:abstractNumId="24" w15:restartNumberingAfterBreak="0">
     <w:nsid w:val="50190573"/>
     <w:multiLevelType w:val="hybridMultilevel"/>
     <w:tmpl w:val="6E6CBDF2"/>
@@ -5750,7 +4756,7 @@
       </w:rPr>
     </w:lvl>
   </w:abstractNum>
-  <w:abstractNum w:abstractNumId="21" w15:restartNumberingAfterBreak="0">
+  <w:abstractNum w:abstractNumId="25" w15:restartNumberingAfterBreak="0">
     <w:nsid w:val="534B3C77"/>
     <w:multiLevelType w:val="hybridMultilevel"/>
     <w:tmpl w:val="A5BCA278"/>
@@ -5863,7 +4869,7 @@
       </w:rPr>
     </w:lvl>
   </w:abstractNum>
-  <w:abstractNum w:abstractNumId="22" w15:restartNumberingAfterBreak="0">
+  <w:abstractNum w:abstractNumId="26" w15:restartNumberingAfterBreak="0">
     <w:nsid w:val="55223492"/>
     <w:multiLevelType w:val="multilevel"/>
     <w:tmpl w:val="FFC283F2"/>
@@ -6012,7 +5018,7 @@
       </w:rPr>
     </w:lvl>
   </w:abstractNum>
-  <w:abstractNum w:abstractNumId="23" w15:restartNumberingAfterBreak="0">
+  <w:abstractNum w:abstractNumId="27" w15:restartNumberingAfterBreak="0">
     <w:nsid w:val="57E36CBC"/>
     <w:multiLevelType w:val="hybridMultilevel"/>
     <w:tmpl w:val="C48A6EC6"/>
@@ -6125,7 +5131,7 @@
       </w:rPr>
     </w:lvl>
   </w:abstractNum>
-  <w:abstractNum w:abstractNumId="24" w15:restartNumberingAfterBreak="0">
+  <w:abstractNum w:abstractNumId="28" w15:restartNumberingAfterBreak="0">
     <w:nsid w:val="623A0A82"/>
     <w:multiLevelType w:val="hybridMultilevel"/>
     <w:tmpl w:val="424CD672"/>
@@ -6238,7 +5244,120 @@
       </w:rPr>
     </w:lvl>
   </w:abstractNum>
-  <w:abstractNum w:abstractNumId="25" w15:restartNumberingAfterBreak="0">
+  <w:abstractNum w:abstractNumId="29" w15:restartNumberingAfterBreak="0">
+    <w:nsid w:val="6370164D"/>
+    <w:multiLevelType w:val="hybridMultilevel"/>
+    <w:tmpl w:val="4800962E"/>
+    <w:lvl w:ilvl="0" w:tplc="04090005">
+      <w:start w:val="1"/>
+      <w:numFmt w:val="bullet"/>
+      <w:lvlText w:val=""/>
+      <w:lvlJc w:val="left"/>
+      <w:pPr>
+        <w:ind w:left="720" w:hanging="360"/>
+      </w:pPr>
+      <w:rPr>
+        <w:rFonts w:ascii="Wingdings" w:hAnsi="Wingdings" w:hint="default"/>
+      </w:rPr>
+    </w:lvl>
+    <w:lvl w:ilvl="1" w:tplc="04090001">
+      <w:start w:val="1"/>
+      <w:numFmt w:val="bullet"/>
+      <w:lvlText w:val=""/>
+      <w:lvlJc w:val="left"/>
+      <w:pPr>
+        <w:ind w:left="1440" w:hanging="360"/>
+      </w:pPr>
+      <w:rPr>
+        <w:rFonts w:ascii="Symbol" w:hAnsi="Symbol" w:hint="default"/>
+      </w:rPr>
+    </w:lvl>
+    <w:lvl w:ilvl="2" w:tplc="04090005" w:tentative="1">
+      <w:start w:val="1"/>
+      <w:numFmt w:val="bullet"/>
+      <w:lvlText w:val=""/>
+      <w:lvlJc w:val="left"/>
+      <w:pPr>
+        <w:ind w:left="2160" w:hanging="360"/>
+      </w:pPr>
+      <w:rPr>
+        <w:rFonts w:ascii="Wingdings" w:hAnsi="Wingdings" w:hint="default"/>
+      </w:rPr>
+    </w:lvl>
+    <w:lvl w:ilvl="3" w:tplc="04090001" w:tentative="1">
+      <w:start w:val="1"/>
+      <w:numFmt w:val="bullet"/>
+      <w:lvlText w:val=""/>
+      <w:lvlJc w:val="left"/>
+      <w:pPr>
+        <w:ind w:left="2880" w:hanging="360"/>
+      </w:pPr>
+      <w:rPr>
+        <w:rFonts w:ascii="Symbol" w:hAnsi="Symbol" w:hint="default"/>
+      </w:rPr>
+    </w:lvl>
+    <w:lvl w:ilvl="4" w:tplc="04090003" w:tentative="1">
+      <w:start w:val="1"/>
+      <w:numFmt w:val="bullet"/>
+      <w:lvlText w:val="o"/>
+      <w:lvlJc w:val="left"/>
+      <w:pPr>
+        <w:ind w:left="3600" w:hanging="360"/>
+      </w:pPr>
+      <w:rPr>
+        <w:rFonts w:ascii="Courier New" w:hAnsi="Courier New" w:cs="Courier New" w:hint="default"/>
+      </w:rPr>
+    </w:lvl>
+    <w:lvl w:ilvl="5" w:tplc="04090005" w:tentative="1">
+      <w:start w:val="1"/>
+      <w:numFmt w:val="bullet"/>
+      <w:lvlText w:val=""/>
+      <w:lvlJc w:val="left"/>
+      <w:pPr>
+        <w:ind w:left="4320" w:hanging="360"/>
+      </w:pPr>
+      <w:rPr>
+        <w:rFonts w:ascii="Wingdings" w:hAnsi="Wingdings" w:hint="default"/>
+      </w:rPr>
+    </w:lvl>
+    <w:lvl w:ilvl="6" w:tplc="04090001" w:tentative="1">
+      <w:start w:val="1"/>
+      <w:numFmt w:val="bullet"/>
+      <w:lvlText w:val=""/>
+      <w:lvlJc w:val="left"/>
+      <w:pPr>
+        <w:ind w:left="5040" w:hanging="360"/>
+      </w:pPr>
+      <w:rPr>
+        <w:rFonts w:ascii="Symbol" w:hAnsi="Symbol" w:hint="default"/>
+      </w:rPr>
+    </w:lvl>
+    <w:lvl w:ilvl="7" w:tplc="04090003" w:tentative="1">
+      <w:start w:val="1"/>
+      <w:numFmt w:val="bullet"/>
+      <w:lvlText w:val="o"/>
+      <w:lvlJc w:val="left"/>
+      <w:pPr>
+        <w:ind w:left="5760" w:hanging="360"/>
+      </w:pPr>
+      <w:rPr>
+        <w:rFonts w:ascii="Courier New" w:hAnsi="Courier New" w:cs="Courier New" w:hint="default"/>
+      </w:rPr>
+    </w:lvl>
+    <w:lvl w:ilvl="8" w:tplc="04090005" w:tentative="1">
+      <w:start w:val="1"/>
+      <w:numFmt w:val="bullet"/>
+      <w:lvlText w:val=""/>
+      <w:lvlJc w:val="left"/>
+      <w:pPr>
+        <w:ind w:left="6480" w:hanging="360"/>
+      </w:pPr>
+      <w:rPr>
+        <w:rFonts w:ascii="Wingdings" w:hAnsi="Wingdings" w:hint="default"/>
+      </w:rPr>
+    </w:lvl>
+  </w:abstractNum>
+  <w:abstractNum w:abstractNumId="30" w15:restartNumberingAfterBreak="0">
     <w:nsid w:val="646A1460"/>
     <w:multiLevelType w:val="hybridMultilevel"/>
     <w:tmpl w:val="7FC061D8"/>
@@ -6351,7 +5470,7 @@
       </w:rPr>
     </w:lvl>
   </w:abstractNum>
-  <w:abstractNum w:abstractNumId="26" w15:restartNumberingAfterBreak="0">
+  <w:abstractNum w:abstractNumId="31" w15:restartNumberingAfterBreak="0">
     <w:nsid w:val="65A8304B"/>
     <w:multiLevelType w:val="multilevel"/>
     <w:tmpl w:val="C712AA20"/>
@@ -6500,7 +5619,120 @@
       </w:rPr>
     </w:lvl>
   </w:abstractNum>
-  <w:abstractNum w:abstractNumId="27" w15:restartNumberingAfterBreak="0">
+  <w:abstractNum w:abstractNumId="32" w15:restartNumberingAfterBreak="0">
+    <w:nsid w:val="65AB1BB9"/>
+    <w:multiLevelType w:val="hybridMultilevel"/>
+    <w:tmpl w:val="7DC6A122"/>
+    <w:lvl w:ilvl="0" w:tplc="04090001">
+      <w:start w:val="1"/>
+      <w:numFmt w:val="bullet"/>
+      <w:lvlText w:val=""/>
+      <w:lvlJc w:val="left"/>
+      <w:pPr>
+        <w:ind w:left="1440" w:hanging="360"/>
+      </w:pPr>
+      <w:rPr>
+        <w:rFonts w:ascii="Symbol" w:hAnsi="Symbol" w:hint="default"/>
+      </w:rPr>
+    </w:lvl>
+    <w:lvl w:ilvl="1" w:tplc="04090003" w:tentative="1">
+      <w:start w:val="1"/>
+      <w:numFmt w:val="bullet"/>
+      <w:lvlText w:val="o"/>
+      <w:lvlJc w:val="left"/>
+      <w:pPr>
+        <w:ind w:left="2160" w:hanging="360"/>
+      </w:pPr>
+      <w:rPr>
+        <w:rFonts w:ascii="Courier New" w:hAnsi="Courier New" w:cs="Courier New" w:hint="default"/>
+      </w:rPr>
+    </w:lvl>
+    <w:lvl w:ilvl="2" w:tplc="04090005" w:tentative="1">
+      <w:start w:val="1"/>
+      <w:numFmt w:val="bullet"/>
+      <w:lvlText w:val=""/>
+      <w:lvlJc w:val="left"/>
+      <w:pPr>
+        <w:ind w:left="2880" w:hanging="360"/>
+      </w:pPr>
+      <w:rPr>
+        <w:rFonts w:ascii="Wingdings" w:hAnsi="Wingdings" w:hint="default"/>
+      </w:rPr>
+    </w:lvl>
+    <w:lvl w:ilvl="3" w:tplc="04090001" w:tentative="1">
+      <w:start w:val="1"/>
+      <w:numFmt w:val="bullet"/>
+      <w:lvlText w:val=""/>
+      <w:lvlJc w:val="left"/>
+      <w:pPr>
+        <w:ind w:left="3600" w:hanging="360"/>
+      </w:pPr>
+      <w:rPr>
+        <w:rFonts w:ascii="Symbol" w:hAnsi="Symbol" w:hint="default"/>
+      </w:rPr>
+    </w:lvl>
+    <w:lvl w:ilvl="4" w:tplc="04090003" w:tentative="1">
+      <w:start w:val="1"/>
+      <w:numFmt w:val="bullet"/>
+      <w:lvlText w:val="o"/>
+      <w:lvlJc w:val="left"/>
+      <w:pPr>
+        <w:ind w:left="4320" w:hanging="360"/>
+      </w:pPr>
+      <w:rPr>
+        <w:rFonts w:ascii="Courier New" w:hAnsi="Courier New" w:cs="Courier New" w:hint="default"/>
+      </w:rPr>
+    </w:lvl>
+    <w:lvl w:ilvl="5" w:tplc="04090005" w:tentative="1">
+      <w:start w:val="1"/>
+      <w:numFmt w:val="bullet"/>
+      <w:lvlText w:val=""/>
+      <w:lvlJc w:val="left"/>
+      <w:pPr>
+        <w:ind w:left="5040" w:hanging="360"/>
+      </w:pPr>
+      <w:rPr>
+        <w:rFonts w:ascii="Wingdings" w:hAnsi="Wingdings" w:hint="default"/>
+      </w:rPr>
+    </w:lvl>
+    <w:lvl w:ilvl="6" w:tplc="04090001" w:tentative="1">
+      <w:start w:val="1"/>
+      <w:numFmt w:val="bullet"/>
+      <w:lvlText w:val=""/>
+      <w:lvlJc w:val="left"/>
+      <w:pPr>
+        <w:ind w:left="5760" w:hanging="360"/>
+      </w:pPr>
+      <w:rPr>
+        <w:rFonts w:ascii="Symbol" w:hAnsi="Symbol" w:hint="default"/>
+      </w:rPr>
+    </w:lvl>
+    <w:lvl w:ilvl="7" w:tplc="04090003" w:tentative="1">
+      <w:start w:val="1"/>
+      <w:numFmt w:val="bullet"/>
+      <w:lvlText w:val="o"/>
+      <w:lvlJc w:val="left"/>
+      <w:pPr>
+        <w:ind w:left="6480" w:hanging="360"/>
+      </w:pPr>
+      <w:rPr>
+        <w:rFonts w:ascii="Courier New" w:hAnsi="Courier New" w:cs="Courier New" w:hint="default"/>
+      </w:rPr>
+    </w:lvl>
+    <w:lvl w:ilvl="8" w:tplc="04090005" w:tentative="1">
+      <w:start w:val="1"/>
+      <w:numFmt w:val="bullet"/>
+      <w:lvlText w:val=""/>
+      <w:lvlJc w:val="left"/>
+      <w:pPr>
+        <w:ind w:left="7200" w:hanging="360"/>
+      </w:pPr>
+      <w:rPr>
+        <w:rFonts w:ascii="Wingdings" w:hAnsi="Wingdings" w:hint="default"/>
+      </w:rPr>
+    </w:lvl>
+  </w:abstractNum>
+  <w:abstractNum w:abstractNumId="33" w15:restartNumberingAfterBreak="0">
     <w:nsid w:val="65E72064"/>
     <w:multiLevelType w:val="hybridMultilevel"/>
     <w:tmpl w:val="A39039AA"/>
@@ -6613,7 +5845,233 @@
       </w:rPr>
     </w:lvl>
   </w:abstractNum>
-  <w:abstractNum w:abstractNumId="28" w15:restartNumberingAfterBreak="0">
+  <w:abstractNum w:abstractNumId="34" w15:restartNumberingAfterBreak="0">
+    <w:nsid w:val="65FD5E98"/>
+    <w:multiLevelType w:val="multilevel"/>
+    <w:tmpl w:val="5CE89D5A"/>
+    <w:lvl w:ilvl="0">
+      <w:start w:val="1"/>
+      <w:numFmt w:val="decimal"/>
+      <w:lvlText w:val="%1."/>
+      <w:lvlJc w:val="left"/>
+      <w:pPr>
+        <w:tabs>
+          <w:tab w:val="num" w:pos="720"/>
+        </w:tabs>
+        <w:ind w:left="720" w:hanging="360"/>
+      </w:pPr>
+    </w:lvl>
+    <w:lvl w:ilvl="1" w:tentative="1">
+      <w:start w:val="1"/>
+      <w:numFmt w:val="decimal"/>
+      <w:lvlText w:val="%2."/>
+      <w:lvlJc w:val="left"/>
+      <w:pPr>
+        <w:tabs>
+          <w:tab w:val="num" w:pos="1440"/>
+        </w:tabs>
+        <w:ind w:left="1440" w:hanging="360"/>
+      </w:pPr>
+    </w:lvl>
+    <w:lvl w:ilvl="2" w:tentative="1">
+      <w:start w:val="1"/>
+      <w:numFmt w:val="decimal"/>
+      <w:lvlText w:val="%3."/>
+      <w:lvlJc w:val="left"/>
+      <w:pPr>
+        <w:tabs>
+          <w:tab w:val="num" w:pos="2160"/>
+        </w:tabs>
+        <w:ind w:left="2160" w:hanging="360"/>
+      </w:pPr>
+    </w:lvl>
+    <w:lvl w:ilvl="3" w:tentative="1">
+      <w:start w:val="1"/>
+      <w:numFmt w:val="decimal"/>
+      <w:lvlText w:val="%4."/>
+      <w:lvlJc w:val="left"/>
+      <w:pPr>
+        <w:tabs>
+          <w:tab w:val="num" w:pos="2880"/>
+        </w:tabs>
+        <w:ind w:left="2880" w:hanging="360"/>
+      </w:pPr>
+    </w:lvl>
+    <w:lvl w:ilvl="4" w:tentative="1">
+      <w:start w:val="1"/>
+      <w:numFmt w:val="decimal"/>
+      <w:lvlText w:val="%5."/>
+      <w:lvlJc w:val="left"/>
+      <w:pPr>
+        <w:tabs>
+          <w:tab w:val="num" w:pos="3600"/>
+        </w:tabs>
+        <w:ind w:left="3600" w:hanging="360"/>
+      </w:pPr>
+    </w:lvl>
+    <w:lvl w:ilvl="5" w:tentative="1">
+      <w:start w:val="1"/>
+      <w:numFmt w:val="decimal"/>
+      <w:lvlText w:val="%6."/>
+      <w:lvlJc w:val="left"/>
+      <w:pPr>
+        <w:tabs>
+          <w:tab w:val="num" w:pos="4320"/>
+        </w:tabs>
+        <w:ind w:left="4320" w:hanging="360"/>
+      </w:pPr>
+    </w:lvl>
+    <w:lvl w:ilvl="6" w:tentative="1">
+      <w:start w:val="1"/>
+      <w:numFmt w:val="decimal"/>
+      <w:lvlText w:val="%7."/>
+      <w:lvlJc w:val="left"/>
+      <w:pPr>
+        <w:tabs>
+          <w:tab w:val="num" w:pos="5040"/>
+        </w:tabs>
+        <w:ind w:left="5040" w:hanging="360"/>
+      </w:pPr>
+    </w:lvl>
+    <w:lvl w:ilvl="7" w:tentative="1">
+      <w:start w:val="1"/>
+      <w:numFmt w:val="decimal"/>
+      <w:lvlText w:val="%8."/>
+      <w:lvlJc w:val="left"/>
+      <w:pPr>
+        <w:tabs>
+          <w:tab w:val="num" w:pos="5760"/>
+        </w:tabs>
+        <w:ind w:left="5760" w:hanging="360"/>
+      </w:pPr>
+    </w:lvl>
+    <w:lvl w:ilvl="8" w:tentative="1">
+      <w:start w:val="1"/>
+      <w:numFmt w:val="decimal"/>
+      <w:lvlText w:val="%9."/>
+      <w:lvlJc w:val="left"/>
+      <w:pPr>
+        <w:tabs>
+          <w:tab w:val="num" w:pos="6480"/>
+        </w:tabs>
+        <w:ind w:left="6480" w:hanging="360"/>
+      </w:pPr>
+    </w:lvl>
+  </w:abstractNum>
+  <w:abstractNum w:abstractNumId="35" w15:restartNumberingAfterBreak="0">
+    <w:nsid w:val="66D83C9A"/>
+    <w:multiLevelType w:val="hybridMultilevel"/>
+    <w:tmpl w:val="233ADB26"/>
+    <w:lvl w:ilvl="0" w:tplc="04090005">
+      <w:start w:val="1"/>
+      <w:numFmt w:val="bullet"/>
+      <w:lvlText w:val=""/>
+      <w:lvlJc w:val="left"/>
+      <w:pPr>
+        <w:ind w:left="720" w:hanging="360"/>
+      </w:pPr>
+      <w:rPr>
+        <w:rFonts w:ascii="Wingdings" w:hAnsi="Wingdings" w:hint="default"/>
+      </w:rPr>
+    </w:lvl>
+    <w:lvl w:ilvl="1" w:tplc="04090003" w:tentative="1">
+      <w:start w:val="1"/>
+      <w:numFmt w:val="bullet"/>
+      <w:lvlText w:val="o"/>
+      <w:lvlJc w:val="left"/>
+      <w:pPr>
+        <w:ind w:left="1440" w:hanging="360"/>
+      </w:pPr>
+      <w:rPr>
+        <w:rFonts w:ascii="Courier New" w:hAnsi="Courier New" w:cs="Courier New" w:hint="default"/>
+      </w:rPr>
+    </w:lvl>
+    <w:lvl w:ilvl="2" w:tplc="04090005" w:tentative="1">
+      <w:start w:val="1"/>
+      <w:numFmt w:val="bullet"/>
+      <w:lvlText w:val=""/>
+      <w:lvlJc w:val="left"/>
+      <w:pPr>
+        <w:ind w:left="2160" w:hanging="360"/>
+      </w:pPr>
+      <w:rPr>
+        <w:rFonts w:ascii="Wingdings" w:hAnsi="Wingdings" w:hint="default"/>
+      </w:rPr>
+    </w:lvl>
+    <w:lvl w:ilvl="3" w:tplc="04090001" w:tentative="1">
+      <w:start w:val="1"/>
+      <w:numFmt w:val="bullet"/>
+      <w:lvlText w:val=""/>
+      <w:lvlJc w:val="left"/>
+      <w:pPr>
+        <w:ind w:left="2880" w:hanging="360"/>
+      </w:pPr>
+      <w:rPr>
+        <w:rFonts w:ascii="Symbol" w:hAnsi="Symbol" w:hint="default"/>
+      </w:rPr>
+    </w:lvl>
+    <w:lvl w:ilvl="4" w:tplc="04090003" w:tentative="1">
+      <w:start w:val="1"/>
+      <w:numFmt w:val="bullet"/>
+      <w:lvlText w:val="o"/>
+      <w:lvlJc w:val="left"/>
+      <w:pPr>
+        <w:ind w:left="3600" w:hanging="360"/>
+      </w:pPr>
+      <w:rPr>
+        <w:rFonts w:ascii="Courier New" w:hAnsi="Courier New" w:cs="Courier New" w:hint="default"/>
+      </w:rPr>
+    </w:lvl>
+    <w:lvl w:ilvl="5" w:tplc="04090005" w:tentative="1">
+      <w:start w:val="1"/>
+      <w:numFmt w:val="bullet"/>
+      <w:lvlText w:val=""/>
+      <w:lvlJc w:val="left"/>
+      <w:pPr>
+        <w:ind w:left="4320" w:hanging="360"/>
+      </w:pPr>
+      <w:rPr>
+        <w:rFonts w:ascii="Wingdings" w:hAnsi="Wingdings" w:hint="default"/>
+      </w:rPr>
+    </w:lvl>
+    <w:lvl w:ilvl="6" w:tplc="04090001" w:tentative="1">
+      <w:start w:val="1"/>
+      <w:numFmt w:val="bullet"/>
+      <w:lvlText w:val=""/>
+      <w:lvlJc w:val="left"/>
+      <w:pPr>
+        <w:ind w:left="5040" w:hanging="360"/>
+      </w:pPr>
+      <w:rPr>
+        <w:rFonts w:ascii="Symbol" w:hAnsi="Symbol" w:hint="default"/>
+      </w:rPr>
+    </w:lvl>
+    <w:lvl w:ilvl="7" w:tplc="04090003" w:tentative="1">
+      <w:start w:val="1"/>
+      <w:numFmt w:val="bullet"/>
+      <w:lvlText w:val="o"/>
+      <w:lvlJc w:val="left"/>
+      <w:pPr>
+        <w:ind w:left="5760" w:hanging="360"/>
+      </w:pPr>
+      <w:rPr>
+        <w:rFonts w:ascii="Courier New" w:hAnsi="Courier New" w:cs="Courier New" w:hint="default"/>
+      </w:rPr>
+    </w:lvl>
+    <w:lvl w:ilvl="8" w:tplc="04090005" w:tentative="1">
+      <w:start w:val="1"/>
+      <w:numFmt w:val="bullet"/>
+      <w:lvlText w:val=""/>
+      <w:lvlJc w:val="left"/>
+      <w:pPr>
+        <w:ind w:left="6480" w:hanging="360"/>
+      </w:pPr>
+      <w:rPr>
+        <w:rFonts w:ascii="Wingdings" w:hAnsi="Wingdings" w:hint="default"/>
+      </w:rPr>
+    </w:lvl>
+  </w:abstractNum>
+  <w:abstractNum w:abstractNumId="36" w15:restartNumberingAfterBreak="0">
     <w:nsid w:val="70B11321"/>
     <w:multiLevelType w:val="hybridMultilevel"/>
     <w:tmpl w:val="A3F6BD84"/>
@@ -6726,7 +6184,7 @@
       </w:rPr>
     </w:lvl>
   </w:abstractNum>
-  <w:abstractNum w:abstractNumId="29" w15:restartNumberingAfterBreak="0">
+  <w:abstractNum w:abstractNumId="37" w15:restartNumberingAfterBreak="0">
     <w:nsid w:val="719077C4"/>
     <w:multiLevelType w:val="hybridMultilevel"/>
     <w:tmpl w:val="AED46EA8"/>
@@ -6815,7 +6273,7 @@
       </w:pPr>
     </w:lvl>
   </w:abstractNum>
-  <w:abstractNum w:abstractNumId="30" w15:restartNumberingAfterBreak="0">
+  <w:abstractNum w:abstractNumId="38" w15:restartNumberingAfterBreak="0">
     <w:nsid w:val="7412217A"/>
     <w:multiLevelType w:val="hybridMultilevel"/>
     <w:tmpl w:val="E5B28182"/>
@@ -6928,7 +6386,7 @@
       </w:rPr>
     </w:lvl>
   </w:abstractNum>
-  <w:abstractNum w:abstractNumId="31" w15:restartNumberingAfterBreak="0">
+  <w:abstractNum w:abstractNumId="39" w15:restartNumberingAfterBreak="0">
     <w:nsid w:val="76B2694D"/>
     <w:multiLevelType w:val="hybridMultilevel"/>
     <w:tmpl w:val="D9648E36"/>
@@ -7041,7 +6499,7 @@
       </w:rPr>
     </w:lvl>
   </w:abstractNum>
-  <w:abstractNum w:abstractNumId="32" w15:restartNumberingAfterBreak="0">
+  <w:abstractNum w:abstractNumId="40" w15:restartNumberingAfterBreak="0">
     <w:nsid w:val="78576F08"/>
     <w:multiLevelType w:val="multilevel"/>
     <w:tmpl w:val="C8C0FBA2"/>
@@ -7190,7 +6648,7 @@
       </w:rPr>
     </w:lvl>
   </w:abstractNum>
-  <w:abstractNum w:abstractNumId="33" w15:restartNumberingAfterBreak="0">
+  <w:abstractNum w:abstractNumId="41" w15:restartNumberingAfterBreak="0">
     <w:nsid w:val="797719B6"/>
     <w:multiLevelType w:val="hybridMultilevel"/>
     <w:tmpl w:val="37F069C0"/>
@@ -7276,7 +6734,7 @@
       </w:pPr>
     </w:lvl>
   </w:abstractNum>
-  <w:abstractNum w:abstractNumId="34" w15:restartNumberingAfterBreak="0">
+  <w:abstractNum w:abstractNumId="42" w15:restartNumberingAfterBreak="0">
     <w:nsid w:val="7D83514C"/>
     <w:multiLevelType w:val="multilevel"/>
     <w:tmpl w:val="4A3C2D40"/>
@@ -7425,7 +6883,7 @@
       </w:rPr>
     </w:lvl>
   </w:abstractNum>
-  <w:abstractNum w:abstractNumId="35" w15:restartNumberingAfterBreak="0">
+  <w:abstractNum w:abstractNumId="43" w15:restartNumberingAfterBreak="0">
     <w:nsid w:val="7E57326A"/>
     <w:multiLevelType w:val="hybridMultilevel"/>
     <w:tmpl w:val="826E3CA0"/>
@@ -7539,112 +6997,136 @@
     </w:lvl>
   </w:abstractNum>
   <w:num w:numId="1" w16cid:durableId="868614379">
-    <w:abstractNumId w:val="21"/>
+    <w:abstractNumId w:val="25"/>
   </w:num>
   <w:num w:numId="2" w16cid:durableId="512231736">
-    <w:abstractNumId w:val="23"/>
+    <w:abstractNumId w:val="27"/>
   </w:num>
   <w:num w:numId="3" w16cid:durableId="1456560383">
-    <w:abstractNumId w:val="31"/>
+    <w:abstractNumId w:val="39"/>
   </w:num>
   <w:num w:numId="4" w16cid:durableId="2044624275">
+    <w:abstractNumId w:val="36"/>
+  </w:num>
+  <w:num w:numId="5" w16cid:durableId="1888563207">
+    <w:abstractNumId w:val="14"/>
+  </w:num>
+  <w:num w:numId="6" w16cid:durableId="1175535735">
     <w:abstractNumId w:val="28"/>
   </w:num>
-  <w:num w:numId="5" w16cid:durableId="1888563207">
-    <w:abstractNumId w:val="12"/>
-  </w:num>
-  <w:num w:numId="6" w16cid:durableId="1175535735">
+  <w:num w:numId="7" w16cid:durableId="1148396771">
     <w:abstractNumId w:val="24"/>
   </w:num>
-  <w:num w:numId="7" w16cid:durableId="1148396771">
+  <w:num w:numId="8" w16cid:durableId="1838156590">
+    <w:abstractNumId w:val="2"/>
+  </w:num>
+  <w:num w:numId="9" w16cid:durableId="2081753618">
+    <w:abstractNumId w:val="4"/>
+  </w:num>
+  <w:num w:numId="10" w16cid:durableId="580066096">
+    <w:abstractNumId w:val="16"/>
+  </w:num>
+  <w:num w:numId="11" w16cid:durableId="1926457760">
+    <w:abstractNumId w:val="38"/>
+  </w:num>
+  <w:num w:numId="12" w16cid:durableId="967662867">
+    <w:abstractNumId w:val="41"/>
+  </w:num>
+  <w:num w:numId="13" w16cid:durableId="619339346">
+    <w:abstractNumId w:val="18"/>
+  </w:num>
+  <w:num w:numId="14" w16cid:durableId="487286263">
+    <w:abstractNumId w:val="26"/>
+  </w:num>
+  <w:num w:numId="15" w16cid:durableId="518205719">
+    <w:abstractNumId w:val="10"/>
+  </w:num>
+  <w:num w:numId="16" w16cid:durableId="57748478">
+    <w:abstractNumId w:val="40"/>
+  </w:num>
+  <w:num w:numId="17" w16cid:durableId="861286849">
+    <w:abstractNumId w:val="8"/>
+  </w:num>
+  <w:num w:numId="18" w16cid:durableId="1966887138">
+    <w:abstractNumId w:val="15"/>
+  </w:num>
+  <w:num w:numId="19" w16cid:durableId="327949630">
+    <w:abstractNumId w:val="5"/>
+  </w:num>
+  <w:num w:numId="20" w16cid:durableId="869952247">
     <w:abstractNumId w:val="20"/>
   </w:num>
-  <w:num w:numId="8" w16cid:durableId="1838156590">
-    <w:abstractNumId w:val="1"/>
+  <w:num w:numId="21" w16cid:durableId="1586182778">
+    <w:abstractNumId w:val="9"/>
   </w:num>
-  <w:num w:numId="9" w16cid:durableId="2081753618">
-    <w:abstractNumId w:val="3"/>
-  </w:num>
-  <w:num w:numId="10" w16cid:durableId="580066096">
-    <w:abstractNumId w:val="14"/>
-  </w:num>
-  <w:num w:numId="11" w16cid:durableId="1926457760">
-    <w:abstractNumId w:val="30"/>
-  </w:num>
-  <w:num w:numId="12" w16cid:durableId="967662867">
+  <w:num w:numId="22" w16cid:durableId="492457911">
     <w:abstractNumId w:val="33"/>
   </w:num>
-  <w:num w:numId="13" w16cid:durableId="619339346">
-    <w:abstractNumId w:val="16"/>
-  </w:num>
-  <w:num w:numId="14" w16cid:durableId="487286263">
-    <w:abstractNumId w:val="22"/>
-  </w:num>
-  <w:num w:numId="15" w16cid:durableId="518205719">
-    <w:abstractNumId w:val="9"/>
-  </w:num>
-  <w:num w:numId="16" w16cid:durableId="57748478">
-    <w:abstractNumId w:val="32"/>
-  </w:num>
-  <w:num w:numId="17" w16cid:durableId="861286849">
-    <w:abstractNumId w:val="7"/>
-  </w:num>
-  <w:num w:numId="18" w16cid:durableId="1966887138">
-    <w:abstractNumId w:val="13"/>
-  </w:num>
-  <w:num w:numId="19" w16cid:durableId="327949630">
-    <w:abstractNumId w:val="4"/>
-  </w:num>
-  <w:num w:numId="20" w16cid:durableId="869952247">
-    <w:abstractNumId w:val="17"/>
-  </w:num>
-  <w:num w:numId="21" w16cid:durableId="1586182778">
-    <w:abstractNumId w:val="8"/>
-  </w:num>
-  <w:num w:numId="22" w16cid:durableId="492457911">
-    <w:abstractNumId w:val="27"/>
-  </w:num>
   <w:num w:numId="23" w16cid:durableId="1845167844">
-    <w:abstractNumId w:val="35"/>
+    <w:abstractNumId w:val="43"/>
   </w:num>
   <w:num w:numId="24" w16cid:durableId="1011564928">
     <w:abstractNumId w:val="0"/>
   </w:num>
   <w:num w:numId="25" w16cid:durableId="1253276581">
+    <w:abstractNumId w:val="12"/>
+  </w:num>
+  <w:num w:numId="26" w16cid:durableId="651640449">
+    <w:abstractNumId w:val="3"/>
+  </w:num>
+  <w:num w:numId="27" w16cid:durableId="277378833">
+    <w:abstractNumId w:val="6"/>
+  </w:num>
+  <w:num w:numId="28" w16cid:durableId="70738469">
+    <w:abstractNumId w:val="30"/>
+  </w:num>
+  <w:num w:numId="29" w16cid:durableId="491023212">
+    <w:abstractNumId w:val="23"/>
+  </w:num>
+  <w:num w:numId="30" w16cid:durableId="848518197">
     <w:abstractNumId w:val="11"/>
   </w:num>
-  <w:num w:numId="26" w16cid:durableId="651640449">
-    <w:abstractNumId w:val="2"/>
+  <w:num w:numId="31" w16cid:durableId="190801632">
+    <w:abstractNumId w:val="31"/>
   </w:num>
-  <w:num w:numId="27" w16cid:durableId="277378833">
-    <w:abstractNumId w:val="5"/>
+  <w:num w:numId="32" w16cid:durableId="649289971">
+    <w:abstractNumId w:val="17"/>
   </w:num>
-  <w:num w:numId="28" w16cid:durableId="70738469">
-    <w:abstractNumId w:val="25"/>
+  <w:num w:numId="33" w16cid:durableId="1711689784">
+    <w:abstractNumId w:val="21"/>
   </w:num>
-  <w:num w:numId="29" w16cid:durableId="491023212">
+  <w:num w:numId="34" w16cid:durableId="915287193">
+    <w:abstractNumId w:val="42"/>
+  </w:num>
+  <w:num w:numId="35" w16cid:durableId="1325471383">
+    <w:abstractNumId w:val="37"/>
+  </w:num>
+  <w:num w:numId="36" w16cid:durableId="1245916193">
+    <w:abstractNumId w:val="7"/>
+  </w:num>
+  <w:num w:numId="37" w16cid:durableId="39549746">
+    <w:abstractNumId w:val="13"/>
+  </w:num>
+  <w:num w:numId="38" w16cid:durableId="231500736">
+    <w:abstractNumId w:val="1"/>
+  </w:num>
+  <w:num w:numId="39" w16cid:durableId="617225024">
     <w:abstractNumId w:val="19"/>
   </w:num>
-  <w:num w:numId="30" w16cid:durableId="848518197">
-    <w:abstractNumId w:val="10"/>
+  <w:num w:numId="40" w16cid:durableId="1698700468">
+    <w:abstractNumId w:val="35"/>
   </w:num>
-  <w:num w:numId="31" w16cid:durableId="190801632">
-    <w:abstractNumId w:val="26"/>
-  </w:num>
-  <w:num w:numId="32" w16cid:durableId="649289971">
-    <w:abstractNumId w:val="15"/>
-  </w:num>
-  <w:num w:numId="33" w16cid:durableId="1711689784">
-    <w:abstractNumId w:val="18"/>
-  </w:num>
-  <w:num w:numId="34" w16cid:durableId="915287193">
-    <w:abstractNumId w:val="34"/>
-  </w:num>
-  <w:num w:numId="35" w16cid:durableId="1325471383">
+  <w:num w:numId="41" w16cid:durableId="443496547">
     <w:abstractNumId w:val="29"/>
   </w:num>
-  <w:num w:numId="36" w16cid:durableId="1245916193">
-    <w:abstractNumId w:val="6"/>
+  <w:num w:numId="42" w16cid:durableId="506822440">
+    <w:abstractNumId w:val="32"/>
+  </w:num>
+  <w:num w:numId="43" w16cid:durableId="178980172">
+    <w:abstractNumId w:val="22"/>
+  </w:num>
+  <w:num w:numId="44" w16cid:durableId="407381787">
+    <w:abstractNumId w:val="34"/>
   </w:num>
 </w:numbering>
 </file>
@@ -8116,9 +7598,33 @@
       <w:szCs w:val="24"/>
     </w:rPr>
   </w:style>
+  <w:style w:type="paragraph" w:styleId="Heading4">
+    <w:name w:val="heading 4"/>
+    <w:basedOn w:val="Normal"/>
+    <w:next w:val="Normal"/>
+    <w:link w:val="Heading4Char"/>
+    <w:uiPriority w:val="9"/>
+    <w:semiHidden/>
+    <w:unhideWhenUsed/>
+    <w:qFormat/>
+    <w:rsid w:val="00301E09"/>
+    <w:pPr>
+      <w:keepNext/>
+      <w:keepLines/>
+      <w:spacing w:before="40" w:after="0"/>
+      <w:outlineLvl w:val="3"/>
+    </w:pPr>
+    <w:rPr>
+      <w:rFonts w:asciiTheme="majorHAnsi" w:eastAsiaTheme="majorEastAsia" w:hAnsiTheme="majorHAnsi" w:cstheme="majorBidi"/>
+      <w:i/>
+      <w:iCs/>
+      <w:color w:val="2F5496" w:themeColor="accent1" w:themeShade="BF"/>
+    </w:rPr>
+  </w:style>
   <w:style w:type="character" w:default="1" w:styleId="DefaultParagraphFont">
     <w:name w:val="Default Paragraph Font"/>
     <w:uiPriority w:val="1"/>
+    <w:semiHidden/>
     <w:unhideWhenUsed/>
   </w:style>
   <w:style w:type="table" w:default="1" w:styleId="TableNormal">
@@ -8770,6 +8276,37 @@
         <w:shd w:val="clear" w:color="auto" w:fill="D9E2F3" w:themeFill="accent1" w:themeFillTint="33"/>
       </w:tcPr>
     </w:tblStylePr>
+  </w:style>
+  <w:style w:type="paragraph" w:styleId="NormalWeb">
+    <w:name w:val="Normal (Web)"/>
+    <w:basedOn w:val="Normal"/>
+    <w:uiPriority w:val="99"/>
+    <w:unhideWhenUsed/>
+    <w:rsid w:val="00301E09"/>
+    <w:pPr>
+      <w:spacing w:before="100" w:beforeAutospacing="1" w:after="100" w:afterAutospacing="1" w:line="240" w:lineRule="auto"/>
+    </w:pPr>
+    <w:rPr>
+      <w:rFonts w:ascii="Times New Roman" w:eastAsia="Times New Roman" w:hAnsi="Times New Roman" w:cs="Times New Roman"/>
+      <w:kern w:val="0"/>
+      <w:sz w:val="24"/>
+      <w:szCs w:val="24"/>
+      <w14:ligatures w14:val="none"/>
+    </w:rPr>
+  </w:style>
+  <w:style w:type="character" w:customStyle="1" w:styleId="Heading4Char">
+    <w:name w:val="Heading 4 Char"/>
+    <w:basedOn w:val="DefaultParagraphFont"/>
+    <w:link w:val="Heading4"/>
+    <w:uiPriority w:val="9"/>
+    <w:semiHidden/>
+    <w:rsid w:val="00301E09"/>
+    <w:rPr>
+      <w:rFonts w:asciiTheme="majorHAnsi" w:eastAsiaTheme="majorEastAsia" w:hAnsiTheme="majorHAnsi" w:cstheme="majorBidi"/>
+      <w:i/>
+      <w:iCs/>
+      <w:color w:val="2F5496" w:themeColor="accent1" w:themeShade="BF"/>
+    </w:rPr>
   </w:style>
 </w:styles>
 </file>

</xml_diff>